<commit_message>
Add missing member to report
</commit_message>
<xml_diff>
--- a/docs/Report/00 - Master.docx
+++ b/docs/Report/00 - Master.docx
@@ -226,18 +226,14 @@
           <w:p>
             <w:pPr>
               <w:rPr>
-                <w:b w:val="0"/>
-                <w:bCs w:val="0"/>
-                <w:sz w:val="40"/>
-                <w:szCs w:val="40"/>
+                <w:sz w:val="36"/>
+                <w:szCs w:val="36"/>
               </w:rPr>
             </w:pPr>
             <w:r>
               <w:rPr>
-                <w:b w:val="0"/>
-                <w:bCs w:val="0"/>
-                <w:sz w:val="40"/>
-                <w:szCs w:val="40"/>
+                <w:sz w:val="36"/>
+                <w:szCs w:val="36"/>
               </w:rPr>
               <w:t>Arsany Hany Anwar</w:t>
             </w:r>
@@ -249,17 +245,16 @@
           </w:tcPr>
           <w:p>
             <w:pPr>
-              <w:jc w:val="center"/>
               <w:cnfStyle w:val="000000100000" w:firstRow="0" w:lastRow="0" w:firstColumn="0" w:lastColumn="0" w:oddVBand="0" w:evenVBand="0" w:oddHBand="1" w:evenHBand="0" w:firstRowFirstColumn="0" w:firstRowLastColumn="0" w:lastRowFirstColumn="0" w:lastRowLastColumn="0"/>
               <w:rPr>
-                <w:sz w:val="40"/>
-                <w:szCs w:val="40"/>
+                <w:sz w:val="36"/>
+                <w:szCs w:val="36"/>
               </w:rPr>
             </w:pPr>
             <w:r>
               <w:rPr>
-                <w:sz w:val="40"/>
-                <w:szCs w:val="40"/>
+                <w:sz w:val="36"/>
+                <w:szCs w:val="36"/>
               </w:rPr>
               <w:t>2200655</w:t>
             </w:r>
@@ -275,28 +270,22 @@
           <w:p>
             <w:pPr>
               <w:rPr>
-                <w:b w:val="0"/>
-                <w:bCs w:val="0"/>
-                <w:sz w:val="40"/>
-                <w:szCs w:val="40"/>
+                <w:sz w:val="36"/>
+                <w:szCs w:val="36"/>
               </w:rPr>
             </w:pPr>
             <w:r>
               <w:rPr>
-                <w:b w:val="0"/>
-                <w:bCs w:val="0"/>
-                <w:sz w:val="40"/>
-                <w:szCs w:val="40"/>
+                <w:sz w:val="36"/>
+                <w:szCs w:val="36"/>
               </w:rPr>
               <w:t xml:space="preserve">Andrew Ehab </w:t>
             </w:r>
             <w:proofErr w:type="spellStart"/>
             <w:r>
               <w:rPr>
-                <w:b w:val="0"/>
-                <w:bCs w:val="0"/>
-                <w:sz w:val="40"/>
-                <w:szCs w:val="40"/>
+                <w:sz w:val="36"/>
+                <w:szCs w:val="36"/>
               </w:rPr>
               <w:t>Tharwat</w:t>
             </w:r>
@@ -309,17 +298,16 @@
           </w:tcPr>
           <w:p>
             <w:pPr>
-              <w:jc w:val="center"/>
               <w:cnfStyle w:val="000000000000" w:firstRow="0" w:lastRow="0" w:firstColumn="0" w:lastColumn="0" w:oddVBand="0" w:evenVBand="0" w:oddHBand="0" w:evenHBand="0" w:firstRowFirstColumn="0" w:firstRowLastColumn="0" w:lastRowFirstColumn="0" w:lastRowLastColumn="0"/>
               <w:rPr>
-                <w:sz w:val="40"/>
-                <w:szCs w:val="40"/>
+                <w:sz w:val="36"/>
+                <w:szCs w:val="36"/>
               </w:rPr>
             </w:pPr>
             <w:r>
               <w:rPr>
-                <w:sz w:val="40"/>
-                <w:szCs w:val="40"/>
+                <w:sz w:val="36"/>
+                <w:szCs w:val="36"/>
               </w:rPr>
               <w:t>2200249</w:t>
             </w:r>
@@ -338,28 +326,22 @@
           <w:p>
             <w:pPr>
               <w:rPr>
-                <w:b w:val="0"/>
-                <w:bCs w:val="0"/>
-                <w:sz w:val="40"/>
-                <w:szCs w:val="40"/>
+                <w:sz w:val="36"/>
+                <w:szCs w:val="36"/>
               </w:rPr>
             </w:pPr>
             <w:r>
               <w:rPr>
-                <w:b w:val="0"/>
-                <w:bCs w:val="0"/>
-                <w:sz w:val="40"/>
-                <w:szCs w:val="40"/>
+                <w:sz w:val="36"/>
+                <w:szCs w:val="36"/>
               </w:rPr>
               <w:t xml:space="preserve">Hazem Mohamed Salah </w:t>
             </w:r>
             <w:proofErr w:type="spellStart"/>
             <w:r>
               <w:rPr>
-                <w:b w:val="0"/>
-                <w:bCs w:val="0"/>
-                <w:sz w:val="40"/>
-                <w:szCs w:val="40"/>
+                <w:sz w:val="36"/>
+                <w:szCs w:val="36"/>
               </w:rPr>
               <w:t>ElDin</w:t>
             </w:r>
@@ -372,17 +354,16 @@
           </w:tcPr>
           <w:p>
             <w:pPr>
-              <w:jc w:val="center"/>
               <w:cnfStyle w:val="000000100000" w:firstRow="0" w:lastRow="0" w:firstColumn="0" w:lastColumn="0" w:oddVBand="0" w:evenVBand="0" w:oddHBand="1" w:evenHBand="0" w:firstRowFirstColumn="0" w:firstRowLastColumn="0" w:lastRowFirstColumn="0" w:lastRowLastColumn="0"/>
               <w:rPr>
-                <w:sz w:val="40"/>
-                <w:szCs w:val="40"/>
+                <w:sz w:val="36"/>
+                <w:szCs w:val="36"/>
               </w:rPr>
             </w:pPr>
             <w:r>
               <w:rPr>
-                <w:sz w:val="40"/>
-                <w:szCs w:val="40"/>
+                <w:sz w:val="36"/>
+                <w:szCs w:val="36"/>
               </w:rPr>
               <w:t>2300774</w:t>
             </w:r>
@@ -398,18 +379,14 @@
           <w:p>
             <w:pPr>
               <w:rPr>
-                <w:b w:val="0"/>
-                <w:bCs w:val="0"/>
-                <w:sz w:val="40"/>
-                <w:szCs w:val="40"/>
+                <w:sz w:val="36"/>
+                <w:szCs w:val="36"/>
               </w:rPr>
             </w:pPr>
             <w:r>
               <w:rPr>
-                <w:b w:val="0"/>
-                <w:bCs w:val="0"/>
-                <w:sz w:val="40"/>
-                <w:szCs w:val="40"/>
+                <w:sz w:val="36"/>
+                <w:szCs w:val="36"/>
               </w:rPr>
               <w:t>Maria Karam Albert</w:t>
             </w:r>
@@ -421,17 +398,16 @@
           </w:tcPr>
           <w:p>
             <w:pPr>
-              <w:jc w:val="center"/>
               <w:cnfStyle w:val="000000000000" w:firstRow="0" w:lastRow="0" w:firstColumn="0" w:lastColumn="0" w:oddVBand="0" w:evenVBand="0" w:oddHBand="0" w:evenHBand="0" w:firstRowFirstColumn="0" w:firstRowLastColumn="0" w:lastRowFirstColumn="0" w:lastRowLastColumn="0"/>
               <w:rPr>
-                <w:sz w:val="40"/>
-                <w:szCs w:val="40"/>
+                <w:sz w:val="36"/>
+                <w:szCs w:val="36"/>
               </w:rPr>
             </w:pPr>
             <w:r>
               <w:rPr>
-                <w:sz w:val="40"/>
-                <w:szCs w:val="40"/>
+                <w:sz w:val="36"/>
+                <w:szCs w:val="36"/>
               </w:rPr>
               <w:t>2200593</w:t>
             </w:r>
@@ -450,28 +426,22 @@
           <w:p>
             <w:pPr>
               <w:rPr>
-                <w:b w:val="0"/>
-                <w:bCs w:val="0"/>
-                <w:sz w:val="40"/>
-                <w:szCs w:val="40"/>
+                <w:sz w:val="36"/>
+                <w:szCs w:val="36"/>
               </w:rPr>
             </w:pPr>
             <w:r>
               <w:rPr>
-                <w:b w:val="0"/>
-                <w:bCs w:val="0"/>
-                <w:sz w:val="40"/>
-                <w:szCs w:val="40"/>
+                <w:sz w:val="36"/>
+                <w:szCs w:val="36"/>
               </w:rPr>
               <w:t xml:space="preserve">Ziad Ahmed </w:t>
             </w:r>
             <w:proofErr w:type="spellStart"/>
             <w:r>
               <w:rPr>
-                <w:b w:val="0"/>
-                <w:bCs w:val="0"/>
-                <w:sz w:val="40"/>
-                <w:szCs w:val="40"/>
+                <w:sz w:val="36"/>
+                <w:szCs w:val="36"/>
               </w:rPr>
               <w:t>Orabi</w:t>
             </w:r>
@@ -484,17 +454,16 @@
           </w:tcPr>
           <w:p>
             <w:pPr>
-              <w:jc w:val="center"/>
               <w:cnfStyle w:val="000000100000" w:firstRow="0" w:lastRow="0" w:firstColumn="0" w:lastColumn="0" w:oddVBand="0" w:evenVBand="0" w:oddHBand="1" w:evenHBand="0" w:firstRowFirstColumn="0" w:firstRowLastColumn="0" w:lastRowFirstColumn="0" w:lastRowLastColumn="0"/>
               <w:rPr>
-                <w:sz w:val="40"/>
-                <w:szCs w:val="40"/>
+                <w:sz w:val="36"/>
+                <w:szCs w:val="36"/>
               </w:rPr>
             </w:pPr>
             <w:r>
               <w:rPr>
-                <w:sz w:val="40"/>
-                <w:szCs w:val="40"/>
+                <w:sz w:val="36"/>
+                <w:szCs w:val="36"/>
               </w:rPr>
               <w:t>2200399</w:t>
             </w:r>
@@ -510,38 +479,30 @@
           <w:p>
             <w:pPr>
               <w:rPr>
-                <w:b w:val="0"/>
-                <w:bCs w:val="0"/>
-                <w:sz w:val="40"/>
-                <w:szCs w:val="40"/>
+                <w:sz w:val="36"/>
+                <w:szCs w:val="36"/>
               </w:rPr>
             </w:pPr>
             <w:r>
               <w:rPr>
-                <w:b w:val="0"/>
-                <w:bCs w:val="0"/>
-                <w:sz w:val="40"/>
-                <w:szCs w:val="40"/>
+                <w:sz w:val="36"/>
+                <w:szCs w:val="36"/>
               </w:rPr>
               <w:t xml:space="preserve">Marten </w:t>
             </w:r>
             <w:proofErr w:type="spellStart"/>
             <w:r>
               <w:rPr>
-                <w:b w:val="0"/>
-                <w:bCs w:val="0"/>
-                <w:sz w:val="40"/>
-                <w:szCs w:val="40"/>
+                <w:sz w:val="36"/>
+                <w:szCs w:val="36"/>
               </w:rPr>
               <w:t>Amgad</w:t>
             </w:r>
             <w:proofErr w:type="spellEnd"/>
             <w:r>
               <w:rPr>
-                <w:b w:val="0"/>
-                <w:bCs w:val="0"/>
-                <w:sz w:val="40"/>
-                <w:szCs w:val="40"/>
+                <w:sz w:val="36"/>
+                <w:szCs w:val="36"/>
               </w:rPr>
               <w:t xml:space="preserve"> Zakaria</w:t>
             </w:r>
@@ -553,17 +514,16 @@
           </w:tcPr>
           <w:p>
             <w:pPr>
-              <w:jc w:val="center"/>
               <w:cnfStyle w:val="000000000000" w:firstRow="0" w:lastRow="0" w:firstColumn="0" w:lastColumn="0" w:oddVBand="0" w:evenVBand="0" w:oddHBand="0" w:evenHBand="0" w:firstRowFirstColumn="0" w:firstRowLastColumn="0" w:lastRowFirstColumn="0" w:lastRowLastColumn="0"/>
               <w:rPr>
-                <w:sz w:val="40"/>
-                <w:szCs w:val="40"/>
+                <w:sz w:val="36"/>
+                <w:szCs w:val="36"/>
               </w:rPr>
             </w:pPr>
             <w:r>
               <w:rPr>
-                <w:sz w:val="40"/>
-                <w:szCs w:val="40"/>
+                <w:sz w:val="36"/>
+                <w:szCs w:val="36"/>
               </w:rPr>
               <w:t>2200751</w:t>
             </w:r>
@@ -582,18 +542,14 @@
           <w:p>
             <w:pPr>
               <w:rPr>
-                <w:b w:val="0"/>
-                <w:bCs w:val="0"/>
-                <w:sz w:val="40"/>
-                <w:szCs w:val="40"/>
+                <w:sz w:val="36"/>
+                <w:szCs w:val="36"/>
               </w:rPr>
             </w:pPr>
             <w:r>
               <w:rPr>
-                <w:b w:val="0"/>
-                <w:bCs w:val="0"/>
-                <w:sz w:val="40"/>
-                <w:szCs w:val="40"/>
+                <w:sz w:val="36"/>
+                <w:szCs w:val="36"/>
               </w:rPr>
               <w:t>Mathew Mina Youssef Aziz</w:t>
             </w:r>
@@ -605,17 +561,16 @@
           </w:tcPr>
           <w:p>
             <w:pPr>
-              <w:jc w:val="center"/>
               <w:cnfStyle w:val="000000100000" w:firstRow="0" w:lastRow="0" w:firstColumn="0" w:lastColumn="0" w:oddVBand="0" w:evenVBand="0" w:oddHBand="1" w:evenHBand="0" w:firstRowFirstColumn="0" w:firstRowLastColumn="0" w:lastRowFirstColumn="0" w:lastRowLastColumn="0"/>
               <w:rPr>
-                <w:sz w:val="40"/>
-                <w:szCs w:val="40"/>
+                <w:sz w:val="36"/>
+                <w:szCs w:val="36"/>
               </w:rPr>
             </w:pPr>
             <w:r>
               <w:rPr>
-                <w:sz w:val="40"/>
-                <w:szCs w:val="40"/>
+                <w:sz w:val="36"/>
+                <w:szCs w:val="36"/>
               </w:rPr>
               <w:t>2300910</w:t>
             </w:r>
@@ -631,59 +586,47 @@
           <w:p>
             <w:pPr>
               <w:rPr>
-                <w:b w:val="0"/>
-                <w:bCs w:val="0"/>
-                <w:sz w:val="40"/>
-                <w:szCs w:val="40"/>
+                <w:sz w:val="36"/>
+                <w:szCs w:val="36"/>
               </w:rPr>
             </w:pPr>
             <w:proofErr w:type="spellStart"/>
             <w:r>
               <w:rPr>
-                <w:b w:val="0"/>
-                <w:bCs w:val="0"/>
-                <w:sz w:val="40"/>
-                <w:szCs w:val="40"/>
+                <w:sz w:val="36"/>
+                <w:szCs w:val="36"/>
               </w:rPr>
               <w:t>Kerlos</w:t>
             </w:r>
             <w:proofErr w:type="spellEnd"/>
             <w:r>
               <w:rPr>
-                <w:b w:val="0"/>
-                <w:bCs w:val="0"/>
-                <w:sz w:val="40"/>
-                <w:szCs w:val="40"/>
+                <w:sz w:val="36"/>
+                <w:szCs w:val="36"/>
               </w:rPr>
               <w:t xml:space="preserve"> </w:t>
             </w:r>
             <w:proofErr w:type="spellStart"/>
             <w:r>
               <w:rPr>
-                <w:b w:val="0"/>
-                <w:bCs w:val="0"/>
-                <w:sz w:val="40"/>
-                <w:szCs w:val="40"/>
+                <w:sz w:val="36"/>
+                <w:szCs w:val="36"/>
               </w:rPr>
               <w:t>Melad</w:t>
             </w:r>
             <w:proofErr w:type="spellEnd"/>
             <w:r>
               <w:rPr>
-                <w:b w:val="0"/>
-                <w:bCs w:val="0"/>
-                <w:sz w:val="40"/>
-                <w:szCs w:val="40"/>
+                <w:sz w:val="36"/>
+                <w:szCs w:val="36"/>
               </w:rPr>
               <w:t xml:space="preserve"> </w:t>
             </w:r>
             <w:proofErr w:type="spellStart"/>
             <w:r>
               <w:rPr>
-                <w:b w:val="0"/>
-                <w:bCs w:val="0"/>
-                <w:sz w:val="40"/>
-                <w:szCs w:val="40"/>
+                <w:sz w:val="36"/>
+                <w:szCs w:val="36"/>
               </w:rPr>
               <w:t>Fakhry</w:t>
             </w:r>
@@ -696,19 +639,74 @@
           </w:tcPr>
           <w:p>
             <w:pPr>
-              <w:jc w:val="center"/>
               <w:cnfStyle w:val="000000000000" w:firstRow="0" w:lastRow="0" w:firstColumn="0" w:lastColumn="0" w:oddVBand="0" w:evenVBand="0" w:oddHBand="0" w:evenHBand="0" w:firstRowFirstColumn="0" w:firstRowLastColumn="0" w:lastRowFirstColumn="0" w:lastRowLastColumn="0"/>
               <w:rPr>
-                <w:sz w:val="40"/>
-                <w:szCs w:val="40"/>
+                <w:sz w:val="36"/>
+                <w:szCs w:val="36"/>
               </w:rPr>
             </w:pPr>
             <w:r>
               <w:rPr>
-                <w:sz w:val="40"/>
-                <w:szCs w:val="40"/>
+                <w:sz w:val="36"/>
+                <w:szCs w:val="36"/>
               </w:rPr>
               <w:t>2200763</w:t>
+            </w:r>
+          </w:p>
+        </w:tc>
+      </w:tr>
+      <w:tr>
+        <w:trPr>
+          <w:cnfStyle w:val="000000100000" w:firstRow="0" w:lastRow="0" w:firstColumn="0" w:lastColumn="0" w:oddVBand="0" w:evenVBand="0" w:oddHBand="1" w:evenHBand="0" w:firstRowFirstColumn="0" w:firstRowLastColumn="0" w:lastRowFirstColumn="0" w:lastRowLastColumn="0"/>
+        </w:trPr>
+        <w:tc>
+          <w:tcPr>
+            <w:cnfStyle w:val="001000000000" w:firstRow="0" w:lastRow="0" w:firstColumn="1" w:lastColumn="0" w:oddVBand="0" w:evenVBand="0" w:oddHBand="0" w:evenHBand="0" w:firstRowFirstColumn="0" w:firstRowLastColumn="0" w:lastRowFirstColumn="0" w:lastRowLastColumn="0"/>
+            <w:tcW w:w="7105" w:type="dxa"/>
+          </w:tcPr>
+          <w:p>
+            <w:pPr>
+              <w:rPr>
+                <w:sz w:val="36"/>
+                <w:szCs w:val="36"/>
+              </w:rPr>
+            </w:pPr>
+            <w:r>
+              <w:rPr>
+                <w:sz w:val="36"/>
+                <w:szCs w:val="36"/>
+              </w:rPr>
+              <w:t xml:space="preserve">Julia Nasser </w:t>
+            </w:r>
+            <w:proofErr w:type="spellStart"/>
+            <w:r>
+              <w:rPr>
+                <w:sz w:val="36"/>
+                <w:szCs w:val="36"/>
+              </w:rPr>
+              <w:t>Mosaad</w:t>
+            </w:r>
+            <w:proofErr w:type="spellEnd"/>
+          </w:p>
+        </w:tc>
+        <w:tc>
+          <w:tcPr>
+            <w:tcW w:w="2245" w:type="dxa"/>
+          </w:tcPr>
+          <w:p>
+            <w:pPr>
+              <w:cnfStyle w:val="000000100000" w:firstRow="0" w:lastRow="0" w:firstColumn="0" w:lastColumn="0" w:oddVBand="0" w:evenVBand="0" w:oddHBand="1" w:evenHBand="0" w:firstRowFirstColumn="0" w:firstRowLastColumn="0" w:lastRowFirstColumn="0" w:lastRowLastColumn="0"/>
+              <w:rPr>
+                <w:sz w:val="36"/>
+                <w:szCs w:val="36"/>
+              </w:rPr>
+            </w:pPr>
+            <w:r>
+              <w:rPr>
+                <w:sz w:val="36"/>
+                <w:szCs w:val="36"/>
+              </w:rPr>
+              <w:t>2200760</w:t>
             </w:r>
           </w:p>
         </w:tc>
@@ -1932,6 +1930,7 @@
   <w:rsids>
     <w:rsidRoot w:val="00F54C0F"/>
     <w:rsid w:val="007540F5"/>
+    <w:rsid w:val="00B57586"/>
     <w:rsid w:val="00DC2688"/>
     <w:rsid w:val="00F54C0F"/>
   </w:rsids>

</xml_diff>

<commit_message>
phase doc except ALP + DB
</commit_message>
<xml_diff>
--- a/docs/Report/00 - Master.docx
+++ b/docs/Report/00 - Master.docx
@@ -1,6 +1,6 @@
 
 <file path=word/document.xml><?xml version="1.0" encoding="utf-8"?>
-<w:document xmlns:wpc="http://schemas.microsoft.com/office/word/2010/wordprocessingCanvas" xmlns:cx="http://schemas.microsoft.com/office/drawing/2014/chartex" xmlns:cx1="http://schemas.microsoft.com/office/drawing/2015/9/8/chartex" xmlns:cx2="http://schemas.microsoft.com/office/drawing/2015/10/21/chartex" xmlns:cx3="http://schemas.microsoft.com/office/drawing/2016/5/9/chartex" xmlns:cx4="http://schemas.microsoft.com/office/drawing/2016/5/10/chartex" xmlns:cx5="http://schemas.microsoft.com/office/drawing/2016/5/11/chartex" xmlns:cx6="http://schemas.microsoft.com/office/drawing/2016/5/12/chartex" xmlns:cx7="http://schemas.microsoft.com/office/drawing/2016/5/13/chartex" xmlns:cx8="http://schemas.microsoft.com/office/drawing/2016/5/14/chartex" xmlns:mc="http://schemas.openxmlformats.org/markup-compatibility/2006" xmlns:aink="http://schemas.microsoft.com/office/drawing/2016/ink" xmlns:am3d="http://schemas.microsoft.com/office/drawing/2017/model3d" xmlns:o="urn:schemas-microsoft-com:office:office" xmlns:oel="http://schemas.microsoft.com/office/2019/extlst" xmlns:r="http://schemas.openxmlformats.org/officeDocument/2006/relationships" xmlns:m="http://schemas.openxmlformats.org/officeDocument/2006/math" xmlns:v="urn:schemas-microsoft-com:vml" xmlns:wp14="http://schemas.microsoft.com/office/word/2010/wordprocessingDrawing" xmlns:wp="http://schemas.openxmlformats.org/drawingml/2006/wordprocessingDrawing" xmlns:w10="urn:schemas-microsoft-com:office:word" xmlns:w="http://schemas.openxmlformats.org/wordprocessingml/2006/main" xmlns:w14="http://schemas.microsoft.com/office/word/2010/wordml" xmlns:w15="http://schemas.microsoft.com/office/word/2012/wordml" xmlns:w16cex="http://schemas.microsoft.com/office/word/2018/wordml/cex" xmlns:w16cid="http://schemas.microsoft.com/office/word/2016/wordml/cid" xmlns:w16="http://schemas.microsoft.com/office/word/2018/wordml" xmlns:w16du="http://schemas.microsoft.com/office/word/2023/wordml/word16du" xmlns:w16sdtdh="http://schemas.microsoft.com/office/word/2020/wordml/sdtdatahash" xmlns:w16se="http://schemas.microsoft.com/office/word/2015/wordml/symex" xmlns:wpg="http://schemas.microsoft.com/office/word/2010/wordprocessingGroup" xmlns:wpi="http://schemas.microsoft.com/office/word/2010/wordprocessingInk" xmlns:wne="http://schemas.microsoft.com/office/word/2006/wordml" xmlns:wps="http://schemas.microsoft.com/office/word/2010/wordprocessingShape" mc:Ignorable="w14 w15 w16se w16cid w16 w16cex w16sdtdh wp14">
+<w:document xmlns:wpc="http://schemas.microsoft.com/office/word/2010/wordprocessingCanvas" xmlns:cx="http://schemas.microsoft.com/office/drawing/2014/chartex" xmlns:cx1="http://schemas.microsoft.com/office/drawing/2015/9/8/chartex" xmlns:cx2="http://schemas.microsoft.com/office/drawing/2015/10/21/chartex" xmlns:cx3="http://schemas.microsoft.com/office/drawing/2016/5/9/chartex" xmlns:cx4="http://schemas.microsoft.com/office/drawing/2016/5/10/chartex" xmlns:cx5="http://schemas.microsoft.com/office/drawing/2016/5/11/chartex" xmlns:cx6="http://schemas.microsoft.com/office/drawing/2016/5/12/chartex" xmlns:cx7="http://schemas.microsoft.com/office/drawing/2016/5/13/chartex" xmlns:cx8="http://schemas.microsoft.com/office/drawing/2016/5/14/chartex" xmlns:mc="http://schemas.openxmlformats.org/markup-compatibility/2006" xmlns:aink="http://schemas.microsoft.com/office/drawing/2016/ink" xmlns:am3d="http://schemas.microsoft.com/office/drawing/2017/model3d" xmlns:o="urn:schemas-microsoft-com:office:office" xmlns:oel="http://schemas.microsoft.com/office/2019/extlst" xmlns:r="http://schemas.openxmlformats.org/officeDocument/2006/relationships" xmlns:m="http://schemas.openxmlformats.org/officeDocument/2006/math" xmlns:v="urn:schemas-microsoft-com:vml" xmlns:wp14="http://schemas.microsoft.com/office/word/2010/wordprocessingDrawing" xmlns:wp="http://schemas.openxmlformats.org/drawingml/2006/wordprocessingDrawing" xmlns:w10="urn:schemas-microsoft-com:office:word" xmlns:w="http://schemas.openxmlformats.org/wordprocessingml/2006/main" xmlns:w14="http://schemas.microsoft.com/office/word/2010/wordml" xmlns:w15="http://schemas.microsoft.com/office/word/2012/wordml" xmlns:w16cex="http://schemas.microsoft.com/office/word/2018/wordml/cex" xmlns:w16cid="http://schemas.microsoft.com/office/word/2016/wordml/cid" xmlns:w16="http://schemas.microsoft.com/office/word/2018/wordml" xmlns:w16du="http://schemas.microsoft.com/office/word/2023/wordml/word16du" xmlns:w16sdtdh="http://schemas.microsoft.com/office/word/2020/wordml/sdtdatahash" xmlns:w16sdtfl="http://schemas.microsoft.com/office/word/2024/wordml/sdtformatlock" xmlns:w16se="http://schemas.microsoft.com/office/word/2015/wordml/symex" xmlns:wpg="http://schemas.microsoft.com/office/word/2010/wordprocessingGroup" xmlns:wpi="http://schemas.microsoft.com/office/word/2010/wordprocessingInk" xmlns:wne="http://schemas.microsoft.com/office/word/2006/wordml" xmlns:wps="http://schemas.microsoft.com/office/word/2010/wordprocessingShape" mc:Ignorable="w14 w15 w16se w16cid w16 w16cex w16sdtdh w16sdtfl w16du wp14">
   <w:body>
     <w:p>
       <w:pPr>
@@ -16,7 +16,7 @@
           <w:noProof/>
         </w:rPr>
         <w:drawing>
-          <wp:inline distT="0" distB="0" distL="0" distR="0" wp14:anchorId="0408B555" wp14:editId="5D213D32">
+          <wp:inline distT="0" distB="0" distL="0" distR="0" wp14:anchorId="571AA976" wp14:editId="34E3ED1C">
             <wp:extent cx="2564765" cy="2526030"/>
             <wp:effectExtent l="0" t="0" r="6985" b="7620"/>
             <wp:docPr id="1" name="Picture 1"/>
@@ -31,7 +31,7 @@
                     <pic:cNvPicPr/>
                   </pic:nvPicPr>
                   <pic:blipFill>
-                    <a:blip r:embed="rId7">
+                    <a:blip r:embed="rId6">
                       <a:extLst>
                         <a:ext uri="{28A0092B-C50C-407E-A947-70E740481C1C}">
                           <a14:useLocalDpi xmlns:a14="http://schemas.microsoft.com/office/drawing/2010/main" val="0"/>
@@ -84,7 +84,7 @@
         <w:tag w:val=""/>
         <w:id w:val="1313057570"/>
         <w:placeholder>
-          <w:docPart w:val="11E26F5BAAD1418F807CCDE0D3B8ADD8"/>
+          <w:docPart w:val="89AF5FD46BF64C8D914123953E4BB700"/>
         </w:placeholder>
         <w:dataBinding w:prefixMappings="xmlns:ns0='http://purl.org/dc/elements/1.1/' xmlns:ns1='http://schemas.openxmlformats.org/package/2006/metadata/core-properties' " w:xpath="/ns1:coreProperties[1]/ns0:title[1]" w:storeItemID="{6C3C8BC8-F283-45AE-878A-BAB7291924A1}"/>
         <w:text/>
@@ -118,7 +118,7 @@
         <w:tag w:val=""/>
         <w:id w:val="1716236938"/>
         <w:placeholder>
-          <w:docPart w:val="EE86D90381DA4D9182859C0A20A0C8D9"/>
+          <w:docPart w:val="FFE657FF632C4FBDA5E005F14AF54A89"/>
         </w:placeholder>
         <w:dataBinding w:prefixMappings="xmlns:ns0='http://purl.org/dc/elements/1.1/' xmlns:ns1='http://schemas.openxmlformats.org/package/2006/metadata/core-properties' " w:xpath="/ns1:coreProperties[1]/ns0:subject[1]" w:storeItemID="{6C3C8BC8-F283-45AE-878A-BAB7291924A1}"/>
         <w:text/>
@@ -279,17 +279,8 @@
                 <w:sz w:val="36"/>
                 <w:szCs w:val="36"/>
               </w:rPr>
-              <w:t xml:space="preserve">Andrew Ehab </w:t>
+              <w:t>Andrew Ehab Tharwat</w:t>
             </w:r>
-            <w:proofErr w:type="spellStart"/>
-            <w:r>
-              <w:rPr>
-                <w:sz w:val="36"/>
-                <w:szCs w:val="36"/>
-              </w:rPr>
-              <w:t>Tharwat</w:t>
-            </w:r>
-            <w:proofErr w:type="spellEnd"/>
           </w:p>
         </w:tc>
         <w:tc>
@@ -335,17 +326,8 @@
                 <w:sz w:val="36"/>
                 <w:szCs w:val="36"/>
               </w:rPr>
-              <w:t xml:space="preserve">Hazem Mohamed Salah </w:t>
+              <w:t>Hazem Mohamed Salah ElDin</w:t>
             </w:r>
-            <w:proofErr w:type="spellStart"/>
-            <w:r>
-              <w:rPr>
-                <w:sz w:val="36"/>
-                <w:szCs w:val="36"/>
-              </w:rPr>
-              <w:t>ElDin</w:t>
-            </w:r>
-            <w:proofErr w:type="spellEnd"/>
           </w:p>
         </w:tc>
         <w:tc>
@@ -435,17 +417,8 @@
                 <w:sz w:val="36"/>
                 <w:szCs w:val="36"/>
               </w:rPr>
-              <w:t xml:space="preserve">Ziad Ahmed </w:t>
+              <w:t>Ziad Ahmed Orabi</w:t>
             </w:r>
-            <w:proofErr w:type="spellStart"/>
-            <w:r>
-              <w:rPr>
-                <w:sz w:val="36"/>
-                <w:szCs w:val="36"/>
-              </w:rPr>
-              <w:t>Orabi</w:t>
-            </w:r>
-            <w:proofErr w:type="spellEnd"/>
           </w:p>
         </w:tc>
         <w:tc>
@@ -488,23 +461,7 @@
                 <w:sz w:val="36"/>
                 <w:szCs w:val="36"/>
               </w:rPr>
-              <w:t xml:space="preserve">Marten </w:t>
-            </w:r>
-            <w:proofErr w:type="spellStart"/>
-            <w:r>
-              <w:rPr>
-                <w:sz w:val="36"/>
-                <w:szCs w:val="36"/>
-              </w:rPr>
-              <w:t>Amgad</w:t>
-            </w:r>
-            <w:proofErr w:type="spellEnd"/>
-            <w:r>
-              <w:rPr>
-                <w:sz w:val="36"/>
-                <w:szCs w:val="36"/>
-              </w:rPr>
-              <w:t xml:space="preserve"> Zakaria</w:t>
+              <w:t>Marten Amgad Zakaria</w:t>
             </w:r>
           </w:p>
         </w:tc>
@@ -590,47 +547,13 @@
                 <w:szCs w:val="36"/>
               </w:rPr>
             </w:pPr>
-            <w:proofErr w:type="spellStart"/>
             <w:r>
               <w:rPr>
                 <w:sz w:val="36"/>
                 <w:szCs w:val="36"/>
               </w:rPr>
-              <w:t>Kerlos</w:t>
+              <w:t>Kerlos Melad Fakhry</w:t>
             </w:r>
-            <w:proofErr w:type="spellEnd"/>
-            <w:r>
-              <w:rPr>
-                <w:sz w:val="36"/>
-                <w:szCs w:val="36"/>
-              </w:rPr>
-              <w:t xml:space="preserve"> </w:t>
-            </w:r>
-            <w:proofErr w:type="spellStart"/>
-            <w:r>
-              <w:rPr>
-                <w:sz w:val="36"/>
-                <w:szCs w:val="36"/>
-              </w:rPr>
-              <w:t>Melad</w:t>
-            </w:r>
-            <w:proofErr w:type="spellEnd"/>
-            <w:r>
-              <w:rPr>
-                <w:sz w:val="36"/>
-                <w:szCs w:val="36"/>
-              </w:rPr>
-              <w:t xml:space="preserve"> </w:t>
-            </w:r>
-            <w:proofErr w:type="spellStart"/>
-            <w:r>
-              <w:rPr>
-                <w:sz w:val="36"/>
-                <w:szCs w:val="36"/>
-              </w:rPr>
-              <w:t>Fakhry</w:t>
-            </w:r>
-            <w:proofErr w:type="spellEnd"/>
           </w:p>
         </w:tc>
         <w:tc>
@@ -676,17 +599,8 @@
                 <w:sz w:val="36"/>
                 <w:szCs w:val="36"/>
               </w:rPr>
-              <w:t xml:space="preserve">Julia Nasser </w:t>
+              <w:t>Julia Nasser Mosaad</w:t>
             </w:r>
-            <w:proofErr w:type="spellStart"/>
-            <w:r>
-              <w:rPr>
-                <w:sz w:val="36"/>
-                <w:szCs w:val="36"/>
-              </w:rPr>
-              <w:t>Mosaad</w:t>
-            </w:r>
-            <w:proofErr w:type="spellEnd"/>
           </w:p>
         </w:tc>
         <w:tc>
@@ -714,18 +628,8 @@
     </w:tbl>
     <w:p>
       <w:pPr>
-        <w:rPr>
-          <w:b/>
-          <w:bCs/>
-          <w:sz w:val="48"/>
-          <w:szCs w:val="48"/>
-        </w:rPr>
-      </w:pPr>
-    </w:p>
-    <w:p>
-      <w:pPr>
         <w:sectPr>
-          <w:footerReference w:type="default" r:id="rId8"/>
+          <w:footerReference w:type="default" r:id="rId7"/>
           <w:pgSz w:w="12240" w:h="15840"/>
           <w:pgMar w:top="1440" w:right="1440" w:bottom="1440" w:left="1440" w:header="720" w:footer="720" w:gutter="0"/>
           <w:pgBorders w:offsetFrom="page">
@@ -740,170 +644,18 @@
         </w:sectPr>
       </w:pPr>
     </w:p>
-    <w:sdt>
-      <w:sdtPr>
-        <w:rPr>
-          <w:rFonts w:asciiTheme="minorHAnsi" w:eastAsiaTheme="minorEastAsia" w:hAnsiTheme="minorHAnsi" w:cstheme="minorHAnsi"/>
-          <w:color w:val="auto"/>
-          <w:sz w:val="28"/>
-          <w:szCs w:val="28"/>
-        </w:rPr>
-        <w:id w:val="1646930909"/>
-        <w:docPartObj>
-          <w:docPartGallery w:val="Table of Contents"/>
-          <w:docPartUnique/>
-        </w:docPartObj>
-      </w:sdtPr>
-      <w:sdtEndPr>
-        <w:rPr>
-          <w:b/>
-          <w:bCs/>
-          <w:noProof/>
-        </w:rPr>
-      </w:sdtEndPr>
-      <w:sdtContent>
-        <w:p>
-          <w:pPr>
-            <w:pStyle w:val="TOCHeading"/>
-          </w:pPr>
-          <w:r>
-            <w:t>Table of Contents</w:t>
-          </w:r>
-        </w:p>
-        <w:p>
-          <w:pPr>
-            <w:pStyle w:val="TOC1"/>
-            <w:tabs>
-              <w:tab w:val="right" w:leader="dot" w:pos="9350"/>
-            </w:tabs>
-            <w:rPr>
-              <w:rFonts w:cstheme="minorBidi"/>
-              <w:noProof/>
-              <w:sz w:val="22"/>
-              <w:szCs w:val="22"/>
-            </w:rPr>
-          </w:pPr>
-          <w:r>
-            <w:fldChar w:fldCharType="begin"/>
-          </w:r>
-          <w:r>
-            <w:instrText xml:space="preserve"> TOC \o "1-3" \h \z \u </w:instrText>
-          </w:r>
-          <w:r>
-            <w:fldChar w:fldCharType="separate"/>
-          </w:r>
-          <w:hyperlink w:anchor="_Toc227601860" w:history="1">
-            <w:r>
-              <w:rPr>
-                <w:rStyle w:val="Hyperlink"/>
-                <w:noProof/>
-              </w:rPr>
-              <w:t>Introduction</w:t>
-            </w:r>
-            <w:r>
-              <w:rPr>
-                <w:noProof/>
-                <w:webHidden/>
-              </w:rPr>
-              <w:tab/>
-            </w:r>
-            <w:r>
-              <w:rPr>
-                <w:noProof/>
-                <w:webHidden/>
-              </w:rPr>
-              <w:fldChar w:fldCharType="begin"/>
-            </w:r>
-            <w:r>
-              <w:rPr>
-                <w:noProof/>
-                <w:webHidden/>
-              </w:rPr>
-              <w:instrText xml:space="preserve"> PAGEREF _Toc227601860 \h </w:instrText>
-            </w:r>
-            <w:r>
-              <w:rPr>
-                <w:noProof/>
-                <w:webHidden/>
-              </w:rPr>
-            </w:r>
-            <w:r>
-              <w:rPr>
-                <w:noProof/>
-                <w:webHidden/>
-              </w:rPr>
-              <w:fldChar w:fldCharType="separate"/>
-            </w:r>
-            <w:r>
-              <w:rPr>
-                <w:noProof/>
-                <w:webHidden/>
-              </w:rPr>
-              <w:t>1</w:t>
-            </w:r>
-            <w:r>
-              <w:rPr>
-                <w:noProof/>
-                <w:webHidden/>
-              </w:rPr>
-              <w:fldChar w:fldCharType="end"/>
-            </w:r>
-          </w:hyperlink>
-        </w:p>
-        <w:p>
-          <w:r>
-            <w:rPr>
-              <w:b/>
-              <w:bCs/>
-              <w:noProof/>
-            </w:rPr>
-            <w:fldChar w:fldCharType="end"/>
-          </w:r>
-        </w:p>
-      </w:sdtContent>
-    </w:sdt>
-    <w:p/>
     <w:p>
-      <w:pPr>
-        <w:sectPr>
-          <w:pgSz w:w="12240" w:h="15840"/>
-          <w:pgMar w:top="1440" w:right="1440" w:bottom="1440" w:left="1440" w:header="720" w:footer="720" w:gutter="0"/>
-          <w:pgBorders w:offsetFrom="page">
-            <w:top w:val="thinThickSmallGap" w:sz="24" w:space="24" w:color="auto"/>
-            <w:left w:val="thinThickSmallGap" w:sz="24" w:space="24" w:color="auto"/>
-            <w:bottom w:val="thickThinSmallGap" w:sz="24" w:space="24" w:color="auto"/>
-            <w:right w:val="thickThinSmallGap" w:sz="24" w:space="24" w:color="auto"/>
-          </w:pgBorders>
-          <w:pgNumType w:fmt="lowerRoman"/>
-          <w:cols w:space="720"/>
-          <w:docGrid w:linePitch="360"/>
-        </w:sectPr>
-      </w:pPr>
-      <w:r>
-        <w:br w:type="page"/>
-      </w:r>
+      <w:subDoc r:id="rId8"/>
+      <w:subDoc r:id="rId9"/>
+      <w:subDoc r:id="rId10"/>
+      <w:subDoc r:id="rId11"/>
+      <w:subDoc r:id="rId12"/>
+      <w:subDoc r:id="rId13"/>
+      <w:subDoc r:id="rId14"/>
     </w:p>
-    <w:p>
-      <w:pPr>
-        <w:pStyle w:val="Heading1"/>
-      </w:pPr>
-      <w:bookmarkStart w:id="0" w:name="_Toc227601860"/>
-      <w:r>
-        <w:lastRenderedPageBreak/>
-        <w:t>Introduction</w:t>
-      </w:r>
-      <w:bookmarkEnd w:id="0"/>
-    </w:p>
-    <w:p>
-      <w:pPr>
-        <w:rPr>
-          <w:lang w:bidi="ar-EG"/>
-        </w:rPr>
-      </w:pPr>
-    </w:p>
-    <w:p/>
     <w:sectPr>
-      <w:footerReference w:type="default" r:id="rId9"/>
+      <w:footerReference w:type="default" r:id="rId15"/>
+      <w:type w:val="continuous"/>
       <w:pgSz w:w="12240" w:h="15840"/>
       <w:pgMar w:top="1440" w:right="1440" w:bottom="1440" w:left="1440" w:header="720" w:footer="720" w:gutter="0"/>
       <w:pgBorders w:offsetFrom="page">
@@ -920,33 +672,8 @@
 </w:document>
 </file>
 
-<file path=word/endnotes.xml><?xml version="1.0" encoding="utf-8"?>
-<w:endnotes xmlns:wpc="http://schemas.microsoft.com/office/word/2010/wordprocessingCanvas" xmlns:cx="http://schemas.microsoft.com/office/drawing/2014/chartex" xmlns:cx1="http://schemas.microsoft.com/office/drawing/2015/9/8/chartex" xmlns:cx2="http://schemas.microsoft.com/office/drawing/2015/10/21/chartex" xmlns:cx3="http://schemas.microsoft.com/office/drawing/2016/5/9/chartex" xmlns:cx4="http://schemas.microsoft.com/office/drawing/2016/5/10/chartex" xmlns:cx5="http://schemas.microsoft.com/office/drawing/2016/5/11/chartex" xmlns:cx6="http://schemas.microsoft.com/office/drawing/2016/5/12/chartex" xmlns:cx7="http://schemas.microsoft.com/office/drawing/2016/5/13/chartex" xmlns:cx8="http://schemas.microsoft.com/office/drawing/2016/5/14/chartex" xmlns:mc="http://schemas.openxmlformats.org/markup-compatibility/2006" xmlns:aink="http://schemas.microsoft.com/office/drawing/2016/ink" xmlns:am3d="http://schemas.microsoft.com/office/drawing/2017/model3d" xmlns:o="urn:schemas-microsoft-com:office:office" xmlns:oel="http://schemas.microsoft.com/office/2019/extlst" xmlns:r="http://schemas.openxmlformats.org/officeDocument/2006/relationships" xmlns:m="http://schemas.openxmlformats.org/officeDocument/2006/math" xmlns:v="urn:schemas-microsoft-com:vml" xmlns:wp14="http://schemas.microsoft.com/office/word/2010/wordprocessingDrawing" xmlns:wp="http://schemas.openxmlformats.org/drawingml/2006/wordprocessingDrawing" xmlns:w10="urn:schemas-microsoft-com:office:word" xmlns:w="http://schemas.openxmlformats.org/wordprocessingml/2006/main" xmlns:w14="http://schemas.microsoft.com/office/word/2010/wordml" xmlns:w15="http://schemas.microsoft.com/office/word/2012/wordml" xmlns:w16cex="http://schemas.microsoft.com/office/word/2018/wordml/cex" xmlns:w16cid="http://schemas.microsoft.com/office/word/2016/wordml/cid" xmlns:w16="http://schemas.microsoft.com/office/word/2018/wordml" xmlns:w16du="http://schemas.microsoft.com/office/word/2023/wordml/word16du" xmlns:w16sdtdh="http://schemas.microsoft.com/office/word/2020/wordml/sdtdatahash" xmlns:w16se="http://schemas.microsoft.com/office/word/2015/wordml/symex" xmlns:wpg="http://schemas.microsoft.com/office/word/2010/wordprocessingGroup" xmlns:wpi="http://schemas.microsoft.com/office/word/2010/wordprocessingInk" xmlns:wne="http://schemas.microsoft.com/office/word/2006/wordml" xmlns:wps="http://schemas.microsoft.com/office/word/2010/wordprocessingShape" mc:Ignorable="w14 w15 w16se w16cid w16 w16cex w16sdtdh wp14">
-  <w:endnote w:type="separator" w:id="-1">
-    <w:p>
-      <w:pPr>
-        <w:spacing w:after="0" w:line="240" w:lineRule="auto"/>
-      </w:pPr>
-      <w:r>
-        <w:separator/>
-      </w:r>
-    </w:p>
-  </w:endnote>
-  <w:endnote w:type="continuationSeparator" w:id="0">
-    <w:p>
-      <w:pPr>
-        <w:spacing w:after="0" w:line="240" w:lineRule="auto"/>
-      </w:pPr>
-      <w:r>
-        <w:continuationSeparator/>
-      </w:r>
-    </w:p>
-  </w:endnote>
-</w:endnotes>
-</file>
-
 <file path=word/footer1.xml><?xml version="1.0" encoding="utf-8"?>
-<w:ftr xmlns:wpc="http://schemas.microsoft.com/office/word/2010/wordprocessingCanvas" xmlns:cx="http://schemas.microsoft.com/office/drawing/2014/chartex" xmlns:cx1="http://schemas.microsoft.com/office/drawing/2015/9/8/chartex" xmlns:cx2="http://schemas.microsoft.com/office/drawing/2015/10/21/chartex" xmlns:cx3="http://schemas.microsoft.com/office/drawing/2016/5/9/chartex" xmlns:cx4="http://schemas.microsoft.com/office/drawing/2016/5/10/chartex" xmlns:cx5="http://schemas.microsoft.com/office/drawing/2016/5/11/chartex" xmlns:cx6="http://schemas.microsoft.com/office/drawing/2016/5/12/chartex" xmlns:cx7="http://schemas.microsoft.com/office/drawing/2016/5/13/chartex" xmlns:cx8="http://schemas.microsoft.com/office/drawing/2016/5/14/chartex" xmlns:mc="http://schemas.openxmlformats.org/markup-compatibility/2006" xmlns:aink="http://schemas.microsoft.com/office/drawing/2016/ink" xmlns:am3d="http://schemas.microsoft.com/office/drawing/2017/model3d" xmlns:o="urn:schemas-microsoft-com:office:office" xmlns:oel="http://schemas.microsoft.com/office/2019/extlst" xmlns:r="http://schemas.openxmlformats.org/officeDocument/2006/relationships" xmlns:m="http://schemas.openxmlformats.org/officeDocument/2006/math" xmlns:v="urn:schemas-microsoft-com:vml" xmlns:wp14="http://schemas.microsoft.com/office/word/2010/wordprocessingDrawing" xmlns:wp="http://schemas.openxmlformats.org/drawingml/2006/wordprocessingDrawing" xmlns:w10="urn:schemas-microsoft-com:office:word" xmlns:w="http://schemas.openxmlformats.org/wordprocessingml/2006/main" xmlns:w14="http://schemas.microsoft.com/office/word/2010/wordml" xmlns:w15="http://schemas.microsoft.com/office/word/2012/wordml" xmlns:w16cex="http://schemas.microsoft.com/office/word/2018/wordml/cex" xmlns:w16cid="http://schemas.microsoft.com/office/word/2016/wordml/cid" xmlns:w16="http://schemas.microsoft.com/office/word/2018/wordml" xmlns:w16du="http://schemas.microsoft.com/office/word/2023/wordml/word16du" xmlns:w16sdtdh="http://schemas.microsoft.com/office/word/2020/wordml/sdtdatahash" xmlns:w16se="http://schemas.microsoft.com/office/word/2015/wordml/symex" xmlns:wpg="http://schemas.microsoft.com/office/word/2010/wordprocessingGroup" xmlns:wpi="http://schemas.microsoft.com/office/word/2010/wordprocessingInk" xmlns:wne="http://schemas.microsoft.com/office/word/2006/wordml" xmlns:wps="http://schemas.microsoft.com/office/word/2010/wordprocessingShape" mc:Ignorable="w14 w15 w16se w16cid w16 w16cex w16sdtdh wp14">
+<w:ftr xmlns:wpc="http://schemas.microsoft.com/office/word/2010/wordprocessingCanvas" xmlns:cx="http://schemas.microsoft.com/office/drawing/2014/chartex" xmlns:cx1="http://schemas.microsoft.com/office/drawing/2015/9/8/chartex" xmlns:cx2="http://schemas.microsoft.com/office/drawing/2015/10/21/chartex" xmlns:cx3="http://schemas.microsoft.com/office/drawing/2016/5/9/chartex" xmlns:cx4="http://schemas.microsoft.com/office/drawing/2016/5/10/chartex" xmlns:cx5="http://schemas.microsoft.com/office/drawing/2016/5/11/chartex" xmlns:cx6="http://schemas.microsoft.com/office/drawing/2016/5/12/chartex" xmlns:cx7="http://schemas.microsoft.com/office/drawing/2016/5/13/chartex" xmlns:cx8="http://schemas.microsoft.com/office/drawing/2016/5/14/chartex" xmlns:mc="http://schemas.openxmlformats.org/markup-compatibility/2006" xmlns:aink="http://schemas.microsoft.com/office/drawing/2016/ink" xmlns:am3d="http://schemas.microsoft.com/office/drawing/2017/model3d" xmlns:o="urn:schemas-microsoft-com:office:office" xmlns:oel="http://schemas.microsoft.com/office/2019/extlst" xmlns:r="http://schemas.openxmlformats.org/officeDocument/2006/relationships" xmlns:m="http://schemas.openxmlformats.org/officeDocument/2006/math" xmlns:v="urn:schemas-microsoft-com:vml" xmlns:wp14="http://schemas.microsoft.com/office/word/2010/wordprocessingDrawing" xmlns:wp="http://schemas.openxmlformats.org/drawingml/2006/wordprocessingDrawing" xmlns:w10="urn:schemas-microsoft-com:office:word" xmlns:w="http://schemas.openxmlformats.org/wordprocessingml/2006/main" xmlns:w14="http://schemas.microsoft.com/office/word/2010/wordml" xmlns:w15="http://schemas.microsoft.com/office/word/2012/wordml" xmlns:w16cex="http://schemas.microsoft.com/office/word/2018/wordml/cex" xmlns:w16cid="http://schemas.microsoft.com/office/word/2016/wordml/cid" xmlns:w16="http://schemas.microsoft.com/office/word/2018/wordml" xmlns:w16du="http://schemas.microsoft.com/office/word/2023/wordml/word16du" xmlns:w16sdtdh="http://schemas.microsoft.com/office/word/2020/wordml/sdtdatahash" xmlns:w16sdtfl="http://schemas.microsoft.com/office/word/2024/wordml/sdtformatlock" xmlns:w16se="http://schemas.microsoft.com/office/word/2015/wordml/symex" xmlns:wpg="http://schemas.microsoft.com/office/word/2010/wordprocessingGroup" xmlns:wpi="http://schemas.microsoft.com/office/word/2010/wordprocessingInk" xmlns:wne="http://schemas.microsoft.com/office/word/2006/wordml" xmlns:wps="http://schemas.microsoft.com/office/word/2010/wordprocessingShape" mc:Ignorable="w14 w15 w16se w16cid w16 w16cex w16sdtdh w16sdtfl w16du wp14">
   <w:sdt>
     <w:sdtPr>
       <w:id w:val="-1356101"/>
@@ -999,10 +726,10 @@
 </file>
 
 <file path=word/footer2.xml><?xml version="1.0" encoding="utf-8"?>
-<w:ftr xmlns:wpc="http://schemas.microsoft.com/office/word/2010/wordprocessingCanvas" xmlns:cx="http://schemas.microsoft.com/office/drawing/2014/chartex" xmlns:cx1="http://schemas.microsoft.com/office/drawing/2015/9/8/chartex" xmlns:cx2="http://schemas.microsoft.com/office/drawing/2015/10/21/chartex" xmlns:cx3="http://schemas.microsoft.com/office/drawing/2016/5/9/chartex" xmlns:cx4="http://schemas.microsoft.com/office/drawing/2016/5/10/chartex" xmlns:cx5="http://schemas.microsoft.com/office/drawing/2016/5/11/chartex" xmlns:cx6="http://schemas.microsoft.com/office/drawing/2016/5/12/chartex" xmlns:cx7="http://schemas.microsoft.com/office/drawing/2016/5/13/chartex" xmlns:cx8="http://schemas.microsoft.com/office/drawing/2016/5/14/chartex" xmlns:mc="http://schemas.openxmlformats.org/markup-compatibility/2006" xmlns:aink="http://schemas.microsoft.com/office/drawing/2016/ink" xmlns:am3d="http://schemas.microsoft.com/office/drawing/2017/model3d" xmlns:o="urn:schemas-microsoft-com:office:office" xmlns:oel="http://schemas.microsoft.com/office/2019/extlst" xmlns:r="http://schemas.openxmlformats.org/officeDocument/2006/relationships" xmlns:m="http://schemas.openxmlformats.org/officeDocument/2006/math" xmlns:v="urn:schemas-microsoft-com:vml" xmlns:wp14="http://schemas.microsoft.com/office/word/2010/wordprocessingDrawing" xmlns:wp="http://schemas.openxmlformats.org/drawingml/2006/wordprocessingDrawing" xmlns:w10="urn:schemas-microsoft-com:office:word" xmlns:w="http://schemas.openxmlformats.org/wordprocessingml/2006/main" xmlns:w14="http://schemas.microsoft.com/office/word/2010/wordml" xmlns:w15="http://schemas.microsoft.com/office/word/2012/wordml" xmlns:w16cex="http://schemas.microsoft.com/office/word/2018/wordml/cex" xmlns:w16cid="http://schemas.microsoft.com/office/word/2016/wordml/cid" xmlns:w16="http://schemas.microsoft.com/office/word/2018/wordml" xmlns:w16du="http://schemas.microsoft.com/office/word/2023/wordml/word16du" xmlns:w16sdtdh="http://schemas.microsoft.com/office/word/2020/wordml/sdtdatahash" xmlns:w16se="http://schemas.microsoft.com/office/word/2015/wordml/symex" xmlns:wpg="http://schemas.microsoft.com/office/word/2010/wordprocessingGroup" xmlns:wpi="http://schemas.microsoft.com/office/word/2010/wordprocessingInk" xmlns:wne="http://schemas.microsoft.com/office/word/2006/wordml" xmlns:wps="http://schemas.microsoft.com/office/word/2010/wordprocessingShape" mc:Ignorable="w14 w15 w16se w16cid w16 w16cex w16sdtdh wp14">
+<w:ftr xmlns:wpc="http://schemas.microsoft.com/office/word/2010/wordprocessingCanvas" xmlns:cx="http://schemas.microsoft.com/office/drawing/2014/chartex" xmlns:cx1="http://schemas.microsoft.com/office/drawing/2015/9/8/chartex" xmlns:cx2="http://schemas.microsoft.com/office/drawing/2015/10/21/chartex" xmlns:cx3="http://schemas.microsoft.com/office/drawing/2016/5/9/chartex" xmlns:cx4="http://schemas.microsoft.com/office/drawing/2016/5/10/chartex" xmlns:cx5="http://schemas.microsoft.com/office/drawing/2016/5/11/chartex" xmlns:cx6="http://schemas.microsoft.com/office/drawing/2016/5/12/chartex" xmlns:cx7="http://schemas.microsoft.com/office/drawing/2016/5/13/chartex" xmlns:cx8="http://schemas.microsoft.com/office/drawing/2016/5/14/chartex" xmlns:mc="http://schemas.openxmlformats.org/markup-compatibility/2006" xmlns:aink="http://schemas.microsoft.com/office/drawing/2016/ink" xmlns:am3d="http://schemas.microsoft.com/office/drawing/2017/model3d" xmlns:o="urn:schemas-microsoft-com:office:office" xmlns:oel="http://schemas.microsoft.com/office/2019/extlst" xmlns:r="http://schemas.openxmlformats.org/officeDocument/2006/relationships" xmlns:m="http://schemas.openxmlformats.org/officeDocument/2006/math" xmlns:v="urn:schemas-microsoft-com:vml" xmlns:wp14="http://schemas.microsoft.com/office/word/2010/wordprocessingDrawing" xmlns:wp="http://schemas.openxmlformats.org/drawingml/2006/wordprocessingDrawing" xmlns:w10="urn:schemas-microsoft-com:office:word" xmlns:w="http://schemas.openxmlformats.org/wordprocessingml/2006/main" xmlns:w14="http://schemas.microsoft.com/office/word/2010/wordml" xmlns:w15="http://schemas.microsoft.com/office/word/2012/wordml" xmlns:w16cex="http://schemas.microsoft.com/office/word/2018/wordml/cex" xmlns:w16cid="http://schemas.microsoft.com/office/word/2016/wordml/cid" xmlns:w16="http://schemas.microsoft.com/office/word/2018/wordml" xmlns:w16du="http://schemas.microsoft.com/office/word/2023/wordml/word16du" xmlns:w16sdtdh="http://schemas.microsoft.com/office/word/2020/wordml/sdtdatahash" xmlns:w16sdtfl="http://schemas.microsoft.com/office/word/2024/wordml/sdtformatlock" xmlns:w16se="http://schemas.microsoft.com/office/word/2015/wordml/symex" xmlns:wpg="http://schemas.microsoft.com/office/word/2010/wordprocessingGroup" xmlns:wpi="http://schemas.microsoft.com/office/word/2010/wordprocessingInk" xmlns:wne="http://schemas.microsoft.com/office/word/2006/wordml" xmlns:wps="http://schemas.microsoft.com/office/word/2010/wordprocessingShape" mc:Ignorable="w14 w15 w16se w16cid w16 w16cex w16sdtdh w16sdtfl w16du wp14">
   <w:sdt>
     <w:sdtPr>
-      <w:id w:val="1205205134"/>
+      <w:id w:val="-809625296"/>
       <w:docPartObj>
         <w:docPartGallery w:val="Page Numbers (Bottom of Page)"/>
         <w:docPartUnique/>
@@ -1052,33 +779,2479 @@
 </w:ftr>
 </file>
 
-<file path=word/footnotes.xml><?xml version="1.0" encoding="utf-8"?>
-<w:footnotes xmlns:wpc="http://schemas.microsoft.com/office/word/2010/wordprocessingCanvas" xmlns:cx="http://schemas.microsoft.com/office/drawing/2014/chartex" xmlns:cx1="http://schemas.microsoft.com/office/drawing/2015/9/8/chartex" xmlns:cx2="http://schemas.microsoft.com/office/drawing/2015/10/21/chartex" xmlns:cx3="http://schemas.microsoft.com/office/drawing/2016/5/9/chartex" xmlns:cx4="http://schemas.microsoft.com/office/drawing/2016/5/10/chartex" xmlns:cx5="http://schemas.microsoft.com/office/drawing/2016/5/11/chartex" xmlns:cx6="http://schemas.microsoft.com/office/drawing/2016/5/12/chartex" xmlns:cx7="http://schemas.microsoft.com/office/drawing/2016/5/13/chartex" xmlns:cx8="http://schemas.microsoft.com/office/drawing/2016/5/14/chartex" xmlns:mc="http://schemas.openxmlformats.org/markup-compatibility/2006" xmlns:aink="http://schemas.microsoft.com/office/drawing/2016/ink" xmlns:am3d="http://schemas.microsoft.com/office/drawing/2017/model3d" xmlns:o="urn:schemas-microsoft-com:office:office" xmlns:oel="http://schemas.microsoft.com/office/2019/extlst" xmlns:r="http://schemas.openxmlformats.org/officeDocument/2006/relationships" xmlns:m="http://schemas.openxmlformats.org/officeDocument/2006/math" xmlns:v="urn:schemas-microsoft-com:vml" xmlns:wp14="http://schemas.microsoft.com/office/word/2010/wordprocessingDrawing" xmlns:wp="http://schemas.openxmlformats.org/drawingml/2006/wordprocessingDrawing" xmlns:w10="urn:schemas-microsoft-com:office:word" xmlns:w="http://schemas.openxmlformats.org/wordprocessingml/2006/main" xmlns:w14="http://schemas.microsoft.com/office/word/2010/wordml" xmlns:w15="http://schemas.microsoft.com/office/word/2012/wordml" xmlns:w16cex="http://schemas.microsoft.com/office/word/2018/wordml/cex" xmlns:w16cid="http://schemas.microsoft.com/office/word/2016/wordml/cid" xmlns:w16="http://schemas.microsoft.com/office/word/2018/wordml" xmlns:w16du="http://schemas.microsoft.com/office/word/2023/wordml/word16du" xmlns:w16sdtdh="http://schemas.microsoft.com/office/word/2020/wordml/sdtdatahash" xmlns:w16se="http://schemas.microsoft.com/office/word/2015/wordml/symex" xmlns:wpg="http://schemas.microsoft.com/office/word/2010/wordprocessingGroup" xmlns:wpi="http://schemas.microsoft.com/office/word/2010/wordprocessingInk" xmlns:wne="http://schemas.microsoft.com/office/word/2006/wordml" xmlns:wps="http://schemas.microsoft.com/office/word/2010/wordprocessingShape" mc:Ignorable="w14 w15 w16se w16cid w16 w16cex w16sdtdh wp14">
-  <w:footnote w:type="separator" w:id="-1">
-    <w:p>
-      <w:pPr>
-        <w:spacing w:after="0" w:line="240" w:lineRule="auto"/>
-      </w:pPr>
-      <w:r>
-        <w:separator/>
-      </w:r>
-    </w:p>
-  </w:footnote>
-  <w:footnote w:type="continuationSeparator" w:id="0">
-    <w:p>
-      <w:pPr>
-        <w:spacing w:after="0" w:line="240" w:lineRule="auto"/>
-      </w:pPr>
-      <w:r>
-        <w:continuationSeparator/>
-      </w:r>
-    </w:p>
-  </w:footnote>
-</w:footnotes>
+<file path=word/numbering.xml><?xml version="1.0" encoding="utf-8"?>
+<w:numbering xmlns:wpc="http://schemas.microsoft.com/office/word/2010/wordprocessingCanvas" xmlns:cx="http://schemas.microsoft.com/office/drawing/2014/chartex" xmlns:cx1="http://schemas.microsoft.com/office/drawing/2015/9/8/chartex" xmlns:cx2="http://schemas.microsoft.com/office/drawing/2015/10/21/chartex" xmlns:cx3="http://schemas.microsoft.com/office/drawing/2016/5/9/chartex" xmlns:cx4="http://schemas.microsoft.com/office/drawing/2016/5/10/chartex" xmlns:cx5="http://schemas.microsoft.com/office/drawing/2016/5/11/chartex" xmlns:cx6="http://schemas.microsoft.com/office/drawing/2016/5/12/chartex" xmlns:cx7="http://schemas.microsoft.com/office/drawing/2016/5/13/chartex" xmlns:cx8="http://schemas.microsoft.com/office/drawing/2016/5/14/chartex" xmlns:mc="http://schemas.openxmlformats.org/markup-compatibility/2006" xmlns:aink="http://schemas.microsoft.com/office/drawing/2016/ink" xmlns:am3d="http://schemas.microsoft.com/office/drawing/2017/model3d" xmlns:o="urn:schemas-microsoft-com:office:office" xmlns:oel="http://schemas.microsoft.com/office/2019/extlst" xmlns:r="http://schemas.openxmlformats.org/officeDocument/2006/relationships" xmlns:m="http://schemas.openxmlformats.org/officeDocument/2006/math" xmlns:v="urn:schemas-microsoft-com:vml" xmlns:wp14="http://schemas.microsoft.com/office/word/2010/wordprocessingDrawing" xmlns:wp="http://schemas.openxmlformats.org/drawingml/2006/wordprocessingDrawing" xmlns:w10="urn:schemas-microsoft-com:office:word" xmlns:w="http://schemas.openxmlformats.org/wordprocessingml/2006/main" xmlns:w14="http://schemas.microsoft.com/office/word/2010/wordml" xmlns:w15="http://schemas.microsoft.com/office/word/2012/wordml" xmlns:w16cex="http://schemas.microsoft.com/office/word/2018/wordml/cex" xmlns:w16cid="http://schemas.microsoft.com/office/word/2016/wordml/cid" xmlns:w16="http://schemas.microsoft.com/office/word/2018/wordml" xmlns:w16du="http://schemas.microsoft.com/office/word/2023/wordml/word16du" xmlns:w16sdtdh="http://schemas.microsoft.com/office/word/2020/wordml/sdtdatahash" xmlns:w16sdtfl="http://schemas.microsoft.com/office/word/2024/wordml/sdtformatlock" xmlns:w16se="http://schemas.microsoft.com/office/word/2015/wordml/symex" xmlns:wpg="http://schemas.microsoft.com/office/word/2010/wordprocessingGroup" xmlns:wpi="http://schemas.microsoft.com/office/word/2010/wordprocessingInk" xmlns:wne="http://schemas.microsoft.com/office/word/2006/wordml" xmlns:wps="http://schemas.microsoft.com/office/word/2010/wordprocessingShape" mc:Ignorable="w14 w15 w16se w16cid w16 w16cex w16sdtdh w16sdtfl w16du wp14">
+  <w:abstractNum w:abstractNumId="0" w15:restartNumberingAfterBreak="0">
+    <w:nsid w:val="003F2B3D"/>
+    <w:multiLevelType w:val="multilevel"/>
+    <w:tmpl w:val="FFEA7F3E"/>
+    <w:lvl w:ilvl="0">
+      <w:start w:val="1"/>
+      <w:numFmt w:val="bullet"/>
+      <w:lvlText w:val=""/>
+      <w:lvlJc w:val="left"/>
+      <w:pPr>
+        <w:tabs>
+          <w:tab w:val="num" w:pos="720"/>
+        </w:tabs>
+        <w:ind w:left="720" w:hanging="360"/>
+      </w:pPr>
+      <w:rPr>
+        <w:rFonts w:ascii="Symbol" w:hAnsi="Symbol" w:hint="default"/>
+        <w:sz w:val="20"/>
+      </w:rPr>
+    </w:lvl>
+    <w:lvl w:ilvl="1" w:tentative="1">
+      <w:start w:val="1"/>
+      <w:numFmt w:val="bullet"/>
+      <w:lvlText w:val="o"/>
+      <w:lvlJc w:val="left"/>
+      <w:pPr>
+        <w:tabs>
+          <w:tab w:val="num" w:pos="1440"/>
+        </w:tabs>
+        <w:ind w:left="1440" w:hanging="360"/>
+      </w:pPr>
+      <w:rPr>
+        <w:rFonts w:ascii="Courier New" w:hAnsi="Courier New" w:hint="default"/>
+        <w:sz w:val="20"/>
+      </w:rPr>
+    </w:lvl>
+    <w:lvl w:ilvl="2" w:tentative="1">
+      <w:start w:val="1"/>
+      <w:numFmt w:val="bullet"/>
+      <w:lvlText w:val=""/>
+      <w:lvlJc w:val="left"/>
+      <w:pPr>
+        <w:tabs>
+          <w:tab w:val="num" w:pos="2160"/>
+        </w:tabs>
+        <w:ind w:left="2160" w:hanging="360"/>
+      </w:pPr>
+      <w:rPr>
+        <w:rFonts w:ascii="Wingdings" w:hAnsi="Wingdings" w:hint="default"/>
+        <w:sz w:val="20"/>
+      </w:rPr>
+    </w:lvl>
+    <w:lvl w:ilvl="3" w:tentative="1">
+      <w:start w:val="1"/>
+      <w:numFmt w:val="bullet"/>
+      <w:lvlText w:val=""/>
+      <w:lvlJc w:val="left"/>
+      <w:pPr>
+        <w:tabs>
+          <w:tab w:val="num" w:pos="2880"/>
+        </w:tabs>
+        <w:ind w:left="2880" w:hanging="360"/>
+      </w:pPr>
+      <w:rPr>
+        <w:rFonts w:ascii="Wingdings" w:hAnsi="Wingdings" w:hint="default"/>
+        <w:sz w:val="20"/>
+      </w:rPr>
+    </w:lvl>
+    <w:lvl w:ilvl="4" w:tentative="1">
+      <w:start w:val="1"/>
+      <w:numFmt w:val="bullet"/>
+      <w:lvlText w:val=""/>
+      <w:lvlJc w:val="left"/>
+      <w:pPr>
+        <w:tabs>
+          <w:tab w:val="num" w:pos="3600"/>
+        </w:tabs>
+        <w:ind w:left="3600" w:hanging="360"/>
+      </w:pPr>
+      <w:rPr>
+        <w:rFonts w:ascii="Wingdings" w:hAnsi="Wingdings" w:hint="default"/>
+        <w:sz w:val="20"/>
+      </w:rPr>
+    </w:lvl>
+    <w:lvl w:ilvl="5" w:tentative="1">
+      <w:start w:val="1"/>
+      <w:numFmt w:val="bullet"/>
+      <w:lvlText w:val=""/>
+      <w:lvlJc w:val="left"/>
+      <w:pPr>
+        <w:tabs>
+          <w:tab w:val="num" w:pos="4320"/>
+        </w:tabs>
+        <w:ind w:left="4320" w:hanging="360"/>
+      </w:pPr>
+      <w:rPr>
+        <w:rFonts w:ascii="Wingdings" w:hAnsi="Wingdings" w:hint="default"/>
+        <w:sz w:val="20"/>
+      </w:rPr>
+    </w:lvl>
+    <w:lvl w:ilvl="6" w:tentative="1">
+      <w:start w:val="1"/>
+      <w:numFmt w:val="bullet"/>
+      <w:lvlText w:val=""/>
+      <w:lvlJc w:val="left"/>
+      <w:pPr>
+        <w:tabs>
+          <w:tab w:val="num" w:pos="5040"/>
+        </w:tabs>
+        <w:ind w:left="5040" w:hanging="360"/>
+      </w:pPr>
+      <w:rPr>
+        <w:rFonts w:ascii="Wingdings" w:hAnsi="Wingdings" w:hint="default"/>
+        <w:sz w:val="20"/>
+      </w:rPr>
+    </w:lvl>
+    <w:lvl w:ilvl="7" w:tentative="1">
+      <w:start w:val="1"/>
+      <w:numFmt w:val="bullet"/>
+      <w:lvlText w:val=""/>
+      <w:lvlJc w:val="left"/>
+      <w:pPr>
+        <w:tabs>
+          <w:tab w:val="num" w:pos="5760"/>
+        </w:tabs>
+        <w:ind w:left="5760" w:hanging="360"/>
+      </w:pPr>
+      <w:rPr>
+        <w:rFonts w:ascii="Wingdings" w:hAnsi="Wingdings" w:hint="default"/>
+        <w:sz w:val="20"/>
+      </w:rPr>
+    </w:lvl>
+    <w:lvl w:ilvl="8" w:tentative="1">
+      <w:start w:val="1"/>
+      <w:numFmt w:val="bullet"/>
+      <w:lvlText w:val=""/>
+      <w:lvlJc w:val="left"/>
+      <w:pPr>
+        <w:tabs>
+          <w:tab w:val="num" w:pos="6480"/>
+        </w:tabs>
+        <w:ind w:left="6480" w:hanging="360"/>
+      </w:pPr>
+      <w:rPr>
+        <w:rFonts w:ascii="Wingdings" w:hAnsi="Wingdings" w:hint="default"/>
+        <w:sz w:val="20"/>
+      </w:rPr>
+    </w:lvl>
+  </w:abstractNum>
+  <w:abstractNum w:abstractNumId="1" w15:restartNumberingAfterBreak="0">
+    <w:nsid w:val="01C87830"/>
+    <w:multiLevelType w:val="hybridMultilevel"/>
+    <w:tmpl w:val="38068DE2"/>
+    <w:lvl w:ilvl="0" w:tplc="04090001">
+      <w:start w:val="1"/>
+      <w:numFmt w:val="bullet"/>
+      <w:lvlText w:val=""/>
+      <w:lvlJc w:val="left"/>
+      <w:pPr>
+        <w:ind w:left="720" w:hanging="360"/>
+      </w:pPr>
+      <w:rPr>
+        <w:rFonts w:ascii="Symbol" w:hAnsi="Symbol" w:hint="default"/>
+      </w:rPr>
+    </w:lvl>
+    <w:lvl w:ilvl="1" w:tplc="04090003" w:tentative="1">
+      <w:start w:val="1"/>
+      <w:numFmt w:val="bullet"/>
+      <w:lvlText w:val="o"/>
+      <w:lvlJc w:val="left"/>
+      <w:pPr>
+        <w:ind w:left="1440" w:hanging="360"/>
+      </w:pPr>
+      <w:rPr>
+        <w:rFonts w:ascii="Courier New" w:hAnsi="Courier New" w:cs="Courier New" w:hint="default"/>
+      </w:rPr>
+    </w:lvl>
+    <w:lvl w:ilvl="2" w:tplc="04090005" w:tentative="1">
+      <w:start w:val="1"/>
+      <w:numFmt w:val="bullet"/>
+      <w:lvlText w:val=""/>
+      <w:lvlJc w:val="left"/>
+      <w:pPr>
+        <w:ind w:left="2160" w:hanging="360"/>
+      </w:pPr>
+      <w:rPr>
+        <w:rFonts w:ascii="Wingdings" w:hAnsi="Wingdings" w:hint="default"/>
+      </w:rPr>
+    </w:lvl>
+    <w:lvl w:ilvl="3" w:tplc="04090001" w:tentative="1">
+      <w:start w:val="1"/>
+      <w:numFmt w:val="bullet"/>
+      <w:lvlText w:val=""/>
+      <w:lvlJc w:val="left"/>
+      <w:pPr>
+        <w:ind w:left="2880" w:hanging="360"/>
+      </w:pPr>
+      <w:rPr>
+        <w:rFonts w:ascii="Symbol" w:hAnsi="Symbol" w:hint="default"/>
+      </w:rPr>
+    </w:lvl>
+    <w:lvl w:ilvl="4" w:tplc="04090003" w:tentative="1">
+      <w:start w:val="1"/>
+      <w:numFmt w:val="bullet"/>
+      <w:lvlText w:val="o"/>
+      <w:lvlJc w:val="left"/>
+      <w:pPr>
+        <w:ind w:left="3600" w:hanging="360"/>
+      </w:pPr>
+      <w:rPr>
+        <w:rFonts w:ascii="Courier New" w:hAnsi="Courier New" w:cs="Courier New" w:hint="default"/>
+      </w:rPr>
+    </w:lvl>
+    <w:lvl w:ilvl="5" w:tplc="04090005" w:tentative="1">
+      <w:start w:val="1"/>
+      <w:numFmt w:val="bullet"/>
+      <w:lvlText w:val=""/>
+      <w:lvlJc w:val="left"/>
+      <w:pPr>
+        <w:ind w:left="4320" w:hanging="360"/>
+      </w:pPr>
+      <w:rPr>
+        <w:rFonts w:ascii="Wingdings" w:hAnsi="Wingdings" w:hint="default"/>
+      </w:rPr>
+    </w:lvl>
+    <w:lvl w:ilvl="6" w:tplc="04090001" w:tentative="1">
+      <w:start w:val="1"/>
+      <w:numFmt w:val="bullet"/>
+      <w:lvlText w:val=""/>
+      <w:lvlJc w:val="left"/>
+      <w:pPr>
+        <w:ind w:left="5040" w:hanging="360"/>
+      </w:pPr>
+      <w:rPr>
+        <w:rFonts w:ascii="Symbol" w:hAnsi="Symbol" w:hint="default"/>
+      </w:rPr>
+    </w:lvl>
+    <w:lvl w:ilvl="7" w:tplc="04090003" w:tentative="1">
+      <w:start w:val="1"/>
+      <w:numFmt w:val="bullet"/>
+      <w:lvlText w:val="o"/>
+      <w:lvlJc w:val="left"/>
+      <w:pPr>
+        <w:ind w:left="5760" w:hanging="360"/>
+      </w:pPr>
+      <w:rPr>
+        <w:rFonts w:ascii="Courier New" w:hAnsi="Courier New" w:cs="Courier New" w:hint="default"/>
+      </w:rPr>
+    </w:lvl>
+    <w:lvl w:ilvl="8" w:tplc="04090005" w:tentative="1">
+      <w:start w:val="1"/>
+      <w:numFmt w:val="bullet"/>
+      <w:lvlText w:val=""/>
+      <w:lvlJc w:val="left"/>
+      <w:pPr>
+        <w:ind w:left="6480" w:hanging="360"/>
+      </w:pPr>
+      <w:rPr>
+        <w:rFonts w:ascii="Wingdings" w:hAnsi="Wingdings" w:hint="default"/>
+      </w:rPr>
+    </w:lvl>
+  </w:abstractNum>
+  <w:abstractNum w:abstractNumId="2" w15:restartNumberingAfterBreak="0">
+    <w:nsid w:val="0587473C"/>
+    <w:multiLevelType w:val="multilevel"/>
+    <w:tmpl w:val="368AA8F6"/>
+    <w:lvl w:ilvl="0">
+      <w:start w:val="1"/>
+      <w:numFmt w:val="bullet"/>
+      <w:lvlText w:val=""/>
+      <w:lvlJc w:val="left"/>
+      <w:pPr>
+        <w:tabs>
+          <w:tab w:val="num" w:pos="720"/>
+        </w:tabs>
+        <w:ind w:left="720" w:hanging="360"/>
+      </w:pPr>
+      <w:rPr>
+        <w:rFonts w:ascii="Symbol" w:hAnsi="Symbol" w:hint="default"/>
+        <w:sz w:val="20"/>
+      </w:rPr>
+    </w:lvl>
+    <w:lvl w:ilvl="1" w:tentative="1">
+      <w:start w:val="1"/>
+      <w:numFmt w:val="bullet"/>
+      <w:lvlText w:val="o"/>
+      <w:lvlJc w:val="left"/>
+      <w:pPr>
+        <w:tabs>
+          <w:tab w:val="num" w:pos="1440"/>
+        </w:tabs>
+        <w:ind w:left="1440" w:hanging="360"/>
+      </w:pPr>
+      <w:rPr>
+        <w:rFonts w:ascii="Courier New" w:hAnsi="Courier New" w:hint="default"/>
+        <w:sz w:val="20"/>
+      </w:rPr>
+    </w:lvl>
+    <w:lvl w:ilvl="2" w:tentative="1">
+      <w:start w:val="1"/>
+      <w:numFmt w:val="bullet"/>
+      <w:lvlText w:val=""/>
+      <w:lvlJc w:val="left"/>
+      <w:pPr>
+        <w:tabs>
+          <w:tab w:val="num" w:pos="2160"/>
+        </w:tabs>
+        <w:ind w:left="2160" w:hanging="360"/>
+      </w:pPr>
+      <w:rPr>
+        <w:rFonts w:ascii="Wingdings" w:hAnsi="Wingdings" w:hint="default"/>
+        <w:sz w:val="20"/>
+      </w:rPr>
+    </w:lvl>
+    <w:lvl w:ilvl="3" w:tentative="1">
+      <w:start w:val="1"/>
+      <w:numFmt w:val="bullet"/>
+      <w:lvlText w:val=""/>
+      <w:lvlJc w:val="left"/>
+      <w:pPr>
+        <w:tabs>
+          <w:tab w:val="num" w:pos="2880"/>
+        </w:tabs>
+        <w:ind w:left="2880" w:hanging="360"/>
+      </w:pPr>
+      <w:rPr>
+        <w:rFonts w:ascii="Wingdings" w:hAnsi="Wingdings" w:hint="default"/>
+        <w:sz w:val="20"/>
+      </w:rPr>
+    </w:lvl>
+    <w:lvl w:ilvl="4" w:tentative="1">
+      <w:start w:val="1"/>
+      <w:numFmt w:val="bullet"/>
+      <w:lvlText w:val=""/>
+      <w:lvlJc w:val="left"/>
+      <w:pPr>
+        <w:tabs>
+          <w:tab w:val="num" w:pos="3600"/>
+        </w:tabs>
+        <w:ind w:left="3600" w:hanging="360"/>
+      </w:pPr>
+      <w:rPr>
+        <w:rFonts w:ascii="Wingdings" w:hAnsi="Wingdings" w:hint="default"/>
+        <w:sz w:val="20"/>
+      </w:rPr>
+    </w:lvl>
+    <w:lvl w:ilvl="5" w:tentative="1">
+      <w:start w:val="1"/>
+      <w:numFmt w:val="bullet"/>
+      <w:lvlText w:val=""/>
+      <w:lvlJc w:val="left"/>
+      <w:pPr>
+        <w:tabs>
+          <w:tab w:val="num" w:pos="4320"/>
+        </w:tabs>
+        <w:ind w:left="4320" w:hanging="360"/>
+      </w:pPr>
+      <w:rPr>
+        <w:rFonts w:ascii="Wingdings" w:hAnsi="Wingdings" w:hint="default"/>
+        <w:sz w:val="20"/>
+      </w:rPr>
+    </w:lvl>
+    <w:lvl w:ilvl="6" w:tentative="1">
+      <w:start w:val="1"/>
+      <w:numFmt w:val="bullet"/>
+      <w:lvlText w:val=""/>
+      <w:lvlJc w:val="left"/>
+      <w:pPr>
+        <w:tabs>
+          <w:tab w:val="num" w:pos="5040"/>
+        </w:tabs>
+        <w:ind w:left="5040" w:hanging="360"/>
+      </w:pPr>
+      <w:rPr>
+        <w:rFonts w:ascii="Wingdings" w:hAnsi="Wingdings" w:hint="default"/>
+        <w:sz w:val="20"/>
+      </w:rPr>
+    </w:lvl>
+    <w:lvl w:ilvl="7" w:tentative="1">
+      <w:start w:val="1"/>
+      <w:numFmt w:val="bullet"/>
+      <w:lvlText w:val=""/>
+      <w:lvlJc w:val="left"/>
+      <w:pPr>
+        <w:tabs>
+          <w:tab w:val="num" w:pos="5760"/>
+        </w:tabs>
+        <w:ind w:left="5760" w:hanging="360"/>
+      </w:pPr>
+      <w:rPr>
+        <w:rFonts w:ascii="Wingdings" w:hAnsi="Wingdings" w:hint="default"/>
+        <w:sz w:val="20"/>
+      </w:rPr>
+    </w:lvl>
+    <w:lvl w:ilvl="8" w:tentative="1">
+      <w:start w:val="1"/>
+      <w:numFmt w:val="bullet"/>
+      <w:lvlText w:val=""/>
+      <w:lvlJc w:val="left"/>
+      <w:pPr>
+        <w:tabs>
+          <w:tab w:val="num" w:pos="6480"/>
+        </w:tabs>
+        <w:ind w:left="6480" w:hanging="360"/>
+      </w:pPr>
+      <w:rPr>
+        <w:rFonts w:ascii="Wingdings" w:hAnsi="Wingdings" w:hint="default"/>
+        <w:sz w:val="20"/>
+      </w:rPr>
+    </w:lvl>
+  </w:abstractNum>
+  <w:abstractNum w:abstractNumId="3" w15:restartNumberingAfterBreak="0">
+    <w:nsid w:val="10D316DA"/>
+    <w:multiLevelType w:val="hybridMultilevel"/>
+    <w:tmpl w:val="B9801AE0"/>
+    <w:lvl w:ilvl="0" w:tplc="04090001">
+      <w:start w:val="1"/>
+      <w:numFmt w:val="bullet"/>
+      <w:lvlText w:val=""/>
+      <w:lvlJc w:val="left"/>
+      <w:pPr>
+        <w:ind w:left="720" w:hanging="360"/>
+      </w:pPr>
+      <w:rPr>
+        <w:rFonts w:ascii="Symbol" w:hAnsi="Symbol" w:hint="default"/>
+      </w:rPr>
+    </w:lvl>
+    <w:lvl w:ilvl="1" w:tplc="04090003" w:tentative="1">
+      <w:start w:val="1"/>
+      <w:numFmt w:val="bullet"/>
+      <w:lvlText w:val="o"/>
+      <w:lvlJc w:val="left"/>
+      <w:pPr>
+        <w:ind w:left="1440" w:hanging="360"/>
+      </w:pPr>
+      <w:rPr>
+        <w:rFonts w:ascii="Courier New" w:hAnsi="Courier New" w:cs="Courier New" w:hint="default"/>
+      </w:rPr>
+    </w:lvl>
+    <w:lvl w:ilvl="2" w:tplc="04090005" w:tentative="1">
+      <w:start w:val="1"/>
+      <w:numFmt w:val="bullet"/>
+      <w:lvlText w:val=""/>
+      <w:lvlJc w:val="left"/>
+      <w:pPr>
+        <w:ind w:left="2160" w:hanging="360"/>
+      </w:pPr>
+      <w:rPr>
+        <w:rFonts w:ascii="Wingdings" w:hAnsi="Wingdings" w:hint="default"/>
+      </w:rPr>
+    </w:lvl>
+    <w:lvl w:ilvl="3" w:tplc="04090001" w:tentative="1">
+      <w:start w:val="1"/>
+      <w:numFmt w:val="bullet"/>
+      <w:lvlText w:val=""/>
+      <w:lvlJc w:val="left"/>
+      <w:pPr>
+        <w:ind w:left="2880" w:hanging="360"/>
+      </w:pPr>
+      <w:rPr>
+        <w:rFonts w:ascii="Symbol" w:hAnsi="Symbol" w:hint="default"/>
+      </w:rPr>
+    </w:lvl>
+    <w:lvl w:ilvl="4" w:tplc="04090003" w:tentative="1">
+      <w:start w:val="1"/>
+      <w:numFmt w:val="bullet"/>
+      <w:lvlText w:val="o"/>
+      <w:lvlJc w:val="left"/>
+      <w:pPr>
+        <w:ind w:left="3600" w:hanging="360"/>
+      </w:pPr>
+      <w:rPr>
+        <w:rFonts w:ascii="Courier New" w:hAnsi="Courier New" w:cs="Courier New" w:hint="default"/>
+      </w:rPr>
+    </w:lvl>
+    <w:lvl w:ilvl="5" w:tplc="04090005" w:tentative="1">
+      <w:start w:val="1"/>
+      <w:numFmt w:val="bullet"/>
+      <w:lvlText w:val=""/>
+      <w:lvlJc w:val="left"/>
+      <w:pPr>
+        <w:ind w:left="4320" w:hanging="360"/>
+      </w:pPr>
+      <w:rPr>
+        <w:rFonts w:ascii="Wingdings" w:hAnsi="Wingdings" w:hint="default"/>
+      </w:rPr>
+    </w:lvl>
+    <w:lvl w:ilvl="6" w:tplc="04090001" w:tentative="1">
+      <w:start w:val="1"/>
+      <w:numFmt w:val="bullet"/>
+      <w:lvlText w:val=""/>
+      <w:lvlJc w:val="left"/>
+      <w:pPr>
+        <w:ind w:left="5040" w:hanging="360"/>
+      </w:pPr>
+      <w:rPr>
+        <w:rFonts w:ascii="Symbol" w:hAnsi="Symbol" w:hint="default"/>
+      </w:rPr>
+    </w:lvl>
+    <w:lvl w:ilvl="7" w:tplc="04090003" w:tentative="1">
+      <w:start w:val="1"/>
+      <w:numFmt w:val="bullet"/>
+      <w:lvlText w:val="o"/>
+      <w:lvlJc w:val="left"/>
+      <w:pPr>
+        <w:ind w:left="5760" w:hanging="360"/>
+      </w:pPr>
+      <w:rPr>
+        <w:rFonts w:ascii="Courier New" w:hAnsi="Courier New" w:cs="Courier New" w:hint="default"/>
+      </w:rPr>
+    </w:lvl>
+    <w:lvl w:ilvl="8" w:tplc="04090005" w:tentative="1">
+      <w:start w:val="1"/>
+      <w:numFmt w:val="bullet"/>
+      <w:lvlText w:val=""/>
+      <w:lvlJc w:val="left"/>
+      <w:pPr>
+        <w:ind w:left="6480" w:hanging="360"/>
+      </w:pPr>
+      <w:rPr>
+        <w:rFonts w:ascii="Wingdings" w:hAnsi="Wingdings" w:hint="default"/>
+      </w:rPr>
+    </w:lvl>
+  </w:abstractNum>
+  <w:abstractNum w:abstractNumId="4" w15:restartNumberingAfterBreak="0">
+    <w:nsid w:val="18C612B6"/>
+    <w:multiLevelType w:val="hybridMultilevel"/>
+    <w:tmpl w:val="F66C3774"/>
+    <w:lvl w:ilvl="0" w:tplc="04090001">
+      <w:start w:val="1"/>
+      <w:numFmt w:val="bullet"/>
+      <w:lvlText w:val=""/>
+      <w:lvlJc w:val="left"/>
+      <w:pPr>
+        <w:ind w:left="720" w:hanging="360"/>
+      </w:pPr>
+      <w:rPr>
+        <w:rFonts w:ascii="Symbol" w:hAnsi="Symbol" w:hint="default"/>
+      </w:rPr>
+    </w:lvl>
+    <w:lvl w:ilvl="1" w:tplc="04090003" w:tentative="1">
+      <w:start w:val="1"/>
+      <w:numFmt w:val="bullet"/>
+      <w:lvlText w:val="o"/>
+      <w:lvlJc w:val="left"/>
+      <w:pPr>
+        <w:ind w:left="1440" w:hanging="360"/>
+      </w:pPr>
+      <w:rPr>
+        <w:rFonts w:ascii="Courier New" w:hAnsi="Courier New" w:cs="Courier New" w:hint="default"/>
+      </w:rPr>
+    </w:lvl>
+    <w:lvl w:ilvl="2" w:tplc="04090005" w:tentative="1">
+      <w:start w:val="1"/>
+      <w:numFmt w:val="bullet"/>
+      <w:lvlText w:val=""/>
+      <w:lvlJc w:val="left"/>
+      <w:pPr>
+        <w:ind w:left="2160" w:hanging="360"/>
+      </w:pPr>
+      <w:rPr>
+        <w:rFonts w:ascii="Wingdings" w:hAnsi="Wingdings" w:hint="default"/>
+      </w:rPr>
+    </w:lvl>
+    <w:lvl w:ilvl="3" w:tplc="04090001" w:tentative="1">
+      <w:start w:val="1"/>
+      <w:numFmt w:val="bullet"/>
+      <w:lvlText w:val=""/>
+      <w:lvlJc w:val="left"/>
+      <w:pPr>
+        <w:ind w:left="2880" w:hanging="360"/>
+      </w:pPr>
+      <w:rPr>
+        <w:rFonts w:ascii="Symbol" w:hAnsi="Symbol" w:hint="default"/>
+      </w:rPr>
+    </w:lvl>
+    <w:lvl w:ilvl="4" w:tplc="04090003" w:tentative="1">
+      <w:start w:val="1"/>
+      <w:numFmt w:val="bullet"/>
+      <w:lvlText w:val="o"/>
+      <w:lvlJc w:val="left"/>
+      <w:pPr>
+        <w:ind w:left="3600" w:hanging="360"/>
+      </w:pPr>
+      <w:rPr>
+        <w:rFonts w:ascii="Courier New" w:hAnsi="Courier New" w:cs="Courier New" w:hint="default"/>
+      </w:rPr>
+    </w:lvl>
+    <w:lvl w:ilvl="5" w:tplc="04090005" w:tentative="1">
+      <w:start w:val="1"/>
+      <w:numFmt w:val="bullet"/>
+      <w:lvlText w:val=""/>
+      <w:lvlJc w:val="left"/>
+      <w:pPr>
+        <w:ind w:left="4320" w:hanging="360"/>
+      </w:pPr>
+      <w:rPr>
+        <w:rFonts w:ascii="Wingdings" w:hAnsi="Wingdings" w:hint="default"/>
+      </w:rPr>
+    </w:lvl>
+    <w:lvl w:ilvl="6" w:tplc="04090001" w:tentative="1">
+      <w:start w:val="1"/>
+      <w:numFmt w:val="bullet"/>
+      <w:lvlText w:val=""/>
+      <w:lvlJc w:val="left"/>
+      <w:pPr>
+        <w:ind w:left="5040" w:hanging="360"/>
+      </w:pPr>
+      <w:rPr>
+        <w:rFonts w:ascii="Symbol" w:hAnsi="Symbol" w:hint="default"/>
+      </w:rPr>
+    </w:lvl>
+    <w:lvl w:ilvl="7" w:tplc="04090003" w:tentative="1">
+      <w:start w:val="1"/>
+      <w:numFmt w:val="bullet"/>
+      <w:lvlText w:val="o"/>
+      <w:lvlJc w:val="left"/>
+      <w:pPr>
+        <w:ind w:left="5760" w:hanging="360"/>
+      </w:pPr>
+      <w:rPr>
+        <w:rFonts w:ascii="Courier New" w:hAnsi="Courier New" w:cs="Courier New" w:hint="default"/>
+      </w:rPr>
+    </w:lvl>
+    <w:lvl w:ilvl="8" w:tplc="04090005" w:tentative="1">
+      <w:start w:val="1"/>
+      <w:numFmt w:val="bullet"/>
+      <w:lvlText w:val=""/>
+      <w:lvlJc w:val="left"/>
+      <w:pPr>
+        <w:ind w:left="6480" w:hanging="360"/>
+      </w:pPr>
+      <w:rPr>
+        <w:rFonts w:ascii="Wingdings" w:hAnsi="Wingdings" w:hint="default"/>
+      </w:rPr>
+    </w:lvl>
+  </w:abstractNum>
+  <w:abstractNum w:abstractNumId="5" w15:restartNumberingAfterBreak="0">
+    <w:nsid w:val="25723663"/>
+    <w:multiLevelType w:val="multilevel"/>
+    <w:tmpl w:val="50D43E12"/>
+    <w:lvl w:ilvl="0">
+      <w:start w:val="1"/>
+      <w:numFmt w:val="bullet"/>
+      <w:lvlText w:val=""/>
+      <w:lvlJc w:val="left"/>
+      <w:pPr>
+        <w:tabs>
+          <w:tab w:val="num" w:pos="720"/>
+        </w:tabs>
+        <w:ind w:left="720" w:hanging="360"/>
+      </w:pPr>
+      <w:rPr>
+        <w:rFonts w:ascii="Symbol" w:hAnsi="Symbol" w:hint="default"/>
+        <w:sz w:val="20"/>
+      </w:rPr>
+    </w:lvl>
+    <w:lvl w:ilvl="1" w:tentative="1">
+      <w:start w:val="1"/>
+      <w:numFmt w:val="bullet"/>
+      <w:lvlText w:val="o"/>
+      <w:lvlJc w:val="left"/>
+      <w:pPr>
+        <w:tabs>
+          <w:tab w:val="num" w:pos="1440"/>
+        </w:tabs>
+        <w:ind w:left="1440" w:hanging="360"/>
+      </w:pPr>
+      <w:rPr>
+        <w:rFonts w:ascii="Courier New" w:hAnsi="Courier New" w:hint="default"/>
+        <w:sz w:val="20"/>
+      </w:rPr>
+    </w:lvl>
+    <w:lvl w:ilvl="2" w:tentative="1">
+      <w:start w:val="1"/>
+      <w:numFmt w:val="bullet"/>
+      <w:lvlText w:val=""/>
+      <w:lvlJc w:val="left"/>
+      <w:pPr>
+        <w:tabs>
+          <w:tab w:val="num" w:pos="2160"/>
+        </w:tabs>
+        <w:ind w:left="2160" w:hanging="360"/>
+      </w:pPr>
+      <w:rPr>
+        <w:rFonts w:ascii="Wingdings" w:hAnsi="Wingdings" w:hint="default"/>
+        <w:sz w:val="20"/>
+      </w:rPr>
+    </w:lvl>
+    <w:lvl w:ilvl="3" w:tentative="1">
+      <w:start w:val="1"/>
+      <w:numFmt w:val="bullet"/>
+      <w:lvlText w:val=""/>
+      <w:lvlJc w:val="left"/>
+      <w:pPr>
+        <w:tabs>
+          <w:tab w:val="num" w:pos="2880"/>
+        </w:tabs>
+        <w:ind w:left="2880" w:hanging="360"/>
+      </w:pPr>
+      <w:rPr>
+        <w:rFonts w:ascii="Wingdings" w:hAnsi="Wingdings" w:hint="default"/>
+        <w:sz w:val="20"/>
+      </w:rPr>
+    </w:lvl>
+    <w:lvl w:ilvl="4" w:tentative="1">
+      <w:start w:val="1"/>
+      <w:numFmt w:val="bullet"/>
+      <w:lvlText w:val=""/>
+      <w:lvlJc w:val="left"/>
+      <w:pPr>
+        <w:tabs>
+          <w:tab w:val="num" w:pos="3600"/>
+        </w:tabs>
+        <w:ind w:left="3600" w:hanging="360"/>
+      </w:pPr>
+      <w:rPr>
+        <w:rFonts w:ascii="Wingdings" w:hAnsi="Wingdings" w:hint="default"/>
+        <w:sz w:val="20"/>
+      </w:rPr>
+    </w:lvl>
+    <w:lvl w:ilvl="5" w:tentative="1">
+      <w:start w:val="1"/>
+      <w:numFmt w:val="bullet"/>
+      <w:lvlText w:val=""/>
+      <w:lvlJc w:val="left"/>
+      <w:pPr>
+        <w:tabs>
+          <w:tab w:val="num" w:pos="4320"/>
+        </w:tabs>
+        <w:ind w:left="4320" w:hanging="360"/>
+      </w:pPr>
+      <w:rPr>
+        <w:rFonts w:ascii="Wingdings" w:hAnsi="Wingdings" w:hint="default"/>
+        <w:sz w:val="20"/>
+      </w:rPr>
+    </w:lvl>
+    <w:lvl w:ilvl="6" w:tentative="1">
+      <w:start w:val="1"/>
+      <w:numFmt w:val="bullet"/>
+      <w:lvlText w:val=""/>
+      <w:lvlJc w:val="left"/>
+      <w:pPr>
+        <w:tabs>
+          <w:tab w:val="num" w:pos="5040"/>
+        </w:tabs>
+        <w:ind w:left="5040" w:hanging="360"/>
+      </w:pPr>
+      <w:rPr>
+        <w:rFonts w:ascii="Wingdings" w:hAnsi="Wingdings" w:hint="default"/>
+        <w:sz w:val="20"/>
+      </w:rPr>
+    </w:lvl>
+    <w:lvl w:ilvl="7" w:tentative="1">
+      <w:start w:val="1"/>
+      <w:numFmt w:val="bullet"/>
+      <w:lvlText w:val=""/>
+      <w:lvlJc w:val="left"/>
+      <w:pPr>
+        <w:tabs>
+          <w:tab w:val="num" w:pos="5760"/>
+        </w:tabs>
+        <w:ind w:left="5760" w:hanging="360"/>
+      </w:pPr>
+      <w:rPr>
+        <w:rFonts w:ascii="Wingdings" w:hAnsi="Wingdings" w:hint="default"/>
+        <w:sz w:val="20"/>
+      </w:rPr>
+    </w:lvl>
+    <w:lvl w:ilvl="8" w:tentative="1">
+      <w:start w:val="1"/>
+      <w:numFmt w:val="bullet"/>
+      <w:lvlText w:val=""/>
+      <w:lvlJc w:val="left"/>
+      <w:pPr>
+        <w:tabs>
+          <w:tab w:val="num" w:pos="6480"/>
+        </w:tabs>
+        <w:ind w:left="6480" w:hanging="360"/>
+      </w:pPr>
+      <w:rPr>
+        <w:rFonts w:ascii="Wingdings" w:hAnsi="Wingdings" w:hint="default"/>
+        <w:sz w:val="20"/>
+      </w:rPr>
+    </w:lvl>
+  </w:abstractNum>
+  <w:abstractNum w:abstractNumId="6" w15:restartNumberingAfterBreak="0">
+    <w:nsid w:val="27BD2610"/>
+    <w:multiLevelType w:val="multilevel"/>
+    <w:tmpl w:val="E1202020"/>
+    <w:lvl w:ilvl="0">
+      <w:start w:val="1"/>
+      <w:numFmt w:val="bullet"/>
+      <w:lvlText w:val=""/>
+      <w:lvlJc w:val="left"/>
+      <w:pPr>
+        <w:tabs>
+          <w:tab w:val="num" w:pos="360"/>
+        </w:tabs>
+        <w:ind w:left="360" w:hanging="360"/>
+      </w:pPr>
+      <w:rPr>
+        <w:rFonts w:ascii="Symbol" w:hAnsi="Symbol" w:hint="default"/>
+        <w:sz w:val="20"/>
+      </w:rPr>
+    </w:lvl>
+    <w:lvl w:ilvl="1" w:tentative="1">
+      <w:start w:val="1"/>
+      <w:numFmt w:val="bullet"/>
+      <w:lvlText w:val=""/>
+      <w:lvlJc w:val="left"/>
+      <w:pPr>
+        <w:tabs>
+          <w:tab w:val="num" w:pos="1080"/>
+        </w:tabs>
+        <w:ind w:left="1080" w:hanging="360"/>
+      </w:pPr>
+      <w:rPr>
+        <w:rFonts w:ascii="Symbol" w:hAnsi="Symbol" w:hint="default"/>
+        <w:sz w:val="20"/>
+      </w:rPr>
+    </w:lvl>
+    <w:lvl w:ilvl="2" w:tentative="1">
+      <w:start w:val="1"/>
+      <w:numFmt w:val="bullet"/>
+      <w:lvlText w:val=""/>
+      <w:lvlJc w:val="left"/>
+      <w:pPr>
+        <w:tabs>
+          <w:tab w:val="num" w:pos="1800"/>
+        </w:tabs>
+        <w:ind w:left="1800" w:hanging="360"/>
+      </w:pPr>
+      <w:rPr>
+        <w:rFonts w:ascii="Symbol" w:hAnsi="Symbol" w:hint="default"/>
+        <w:sz w:val="20"/>
+      </w:rPr>
+    </w:lvl>
+    <w:lvl w:ilvl="3" w:tentative="1">
+      <w:start w:val="1"/>
+      <w:numFmt w:val="bullet"/>
+      <w:lvlText w:val=""/>
+      <w:lvlJc w:val="left"/>
+      <w:pPr>
+        <w:tabs>
+          <w:tab w:val="num" w:pos="2520"/>
+        </w:tabs>
+        <w:ind w:left="2520" w:hanging="360"/>
+      </w:pPr>
+      <w:rPr>
+        <w:rFonts w:ascii="Symbol" w:hAnsi="Symbol" w:hint="default"/>
+        <w:sz w:val="20"/>
+      </w:rPr>
+    </w:lvl>
+    <w:lvl w:ilvl="4" w:tentative="1">
+      <w:start w:val="1"/>
+      <w:numFmt w:val="bullet"/>
+      <w:lvlText w:val=""/>
+      <w:lvlJc w:val="left"/>
+      <w:pPr>
+        <w:tabs>
+          <w:tab w:val="num" w:pos="3240"/>
+        </w:tabs>
+        <w:ind w:left="3240" w:hanging="360"/>
+      </w:pPr>
+      <w:rPr>
+        <w:rFonts w:ascii="Symbol" w:hAnsi="Symbol" w:hint="default"/>
+        <w:sz w:val="20"/>
+      </w:rPr>
+    </w:lvl>
+    <w:lvl w:ilvl="5" w:tentative="1">
+      <w:start w:val="1"/>
+      <w:numFmt w:val="bullet"/>
+      <w:lvlText w:val=""/>
+      <w:lvlJc w:val="left"/>
+      <w:pPr>
+        <w:tabs>
+          <w:tab w:val="num" w:pos="3960"/>
+        </w:tabs>
+        <w:ind w:left="3960" w:hanging="360"/>
+      </w:pPr>
+      <w:rPr>
+        <w:rFonts w:ascii="Symbol" w:hAnsi="Symbol" w:hint="default"/>
+        <w:sz w:val="20"/>
+      </w:rPr>
+    </w:lvl>
+    <w:lvl w:ilvl="6" w:tentative="1">
+      <w:start w:val="1"/>
+      <w:numFmt w:val="bullet"/>
+      <w:lvlText w:val=""/>
+      <w:lvlJc w:val="left"/>
+      <w:pPr>
+        <w:tabs>
+          <w:tab w:val="num" w:pos="4680"/>
+        </w:tabs>
+        <w:ind w:left="4680" w:hanging="360"/>
+      </w:pPr>
+      <w:rPr>
+        <w:rFonts w:ascii="Symbol" w:hAnsi="Symbol" w:hint="default"/>
+        <w:sz w:val="20"/>
+      </w:rPr>
+    </w:lvl>
+    <w:lvl w:ilvl="7" w:tentative="1">
+      <w:start w:val="1"/>
+      <w:numFmt w:val="bullet"/>
+      <w:lvlText w:val=""/>
+      <w:lvlJc w:val="left"/>
+      <w:pPr>
+        <w:tabs>
+          <w:tab w:val="num" w:pos="5400"/>
+        </w:tabs>
+        <w:ind w:left="5400" w:hanging="360"/>
+      </w:pPr>
+      <w:rPr>
+        <w:rFonts w:ascii="Symbol" w:hAnsi="Symbol" w:hint="default"/>
+        <w:sz w:val="20"/>
+      </w:rPr>
+    </w:lvl>
+    <w:lvl w:ilvl="8" w:tentative="1">
+      <w:start w:val="1"/>
+      <w:numFmt w:val="bullet"/>
+      <w:lvlText w:val=""/>
+      <w:lvlJc w:val="left"/>
+      <w:pPr>
+        <w:tabs>
+          <w:tab w:val="num" w:pos="6120"/>
+        </w:tabs>
+        <w:ind w:left="6120" w:hanging="360"/>
+      </w:pPr>
+      <w:rPr>
+        <w:rFonts w:ascii="Symbol" w:hAnsi="Symbol" w:hint="default"/>
+        <w:sz w:val="20"/>
+      </w:rPr>
+    </w:lvl>
+  </w:abstractNum>
+  <w:abstractNum w:abstractNumId="7" w15:restartNumberingAfterBreak="0">
+    <w:nsid w:val="31AA012D"/>
+    <w:multiLevelType w:val="multilevel"/>
+    <w:tmpl w:val="97066DD8"/>
+    <w:lvl w:ilvl="0">
+      <w:start w:val="1"/>
+      <w:numFmt w:val="bullet"/>
+      <w:lvlText w:val=""/>
+      <w:lvlJc w:val="left"/>
+      <w:pPr>
+        <w:tabs>
+          <w:tab w:val="num" w:pos="720"/>
+        </w:tabs>
+        <w:ind w:left="720" w:hanging="360"/>
+      </w:pPr>
+      <w:rPr>
+        <w:rFonts w:ascii="Symbol" w:hAnsi="Symbol" w:hint="default"/>
+        <w:sz w:val="20"/>
+      </w:rPr>
+    </w:lvl>
+    <w:lvl w:ilvl="1" w:tentative="1">
+      <w:start w:val="1"/>
+      <w:numFmt w:val="bullet"/>
+      <w:lvlText w:val=""/>
+      <w:lvlJc w:val="left"/>
+      <w:pPr>
+        <w:tabs>
+          <w:tab w:val="num" w:pos="1440"/>
+        </w:tabs>
+        <w:ind w:left="1440" w:hanging="360"/>
+      </w:pPr>
+      <w:rPr>
+        <w:rFonts w:ascii="Symbol" w:hAnsi="Symbol" w:hint="default"/>
+        <w:sz w:val="20"/>
+      </w:rPr>
+    </w:lvl>
+    <w:lvl w:ilvl="2" w:tentative="1">
+      <w:start w:val="1"/>
+      <w:numFmt w:val="bullet"/>
+      <w:lvlText w:val=""/>
+      <w:lvlJc w:val="left"/>
+      <w:pPr>
+        <w:tabs>
+          <w:tab w:val="num" w:pos="2160"/>
+        </w:tabs>
+        <w:ind w:left="2160" w:hanging="360"/>
+      </w:pPr>
+      <w:rPr>
+        <w:rFonts w:ascii="Symbol" w:hAnsi="Symbol" w:hint="default"/>
+        <w:sz w:val="20"/>
+      </w:rPr>
+    </w:lvl>
+    <w:lvl w:ilvl="3" w:tentative="1">
+      <w:start w:val="1"/>
+      <w:numFmt w:val="bullet"/>
+      <w:lvlText w:val=""/>
+      <w:lvlJc w:val="left"/>
+      <w:pPr>
+        <w:tabs>
+          <w:tab w:val="num" w:pos="2880"/>
+        </w:tabs>
+        <w:ind w:left="2880" w:hanging="360"/>
+      </w:pPr>
+      <w:rPr>
+        <w:rFonts w:ascii="Symbol" w:hAnsi="Symbol" w:hint="default"/>
+        <w:sz w:val="20"/>
+      </w:rPr>
+    </w:lvl>
+    <w:lvl w:ilvl="4" w:tentative="1">
+      <w:start w:val="1"/>
+      <w:numFmt w:val="bullet"/>
+      <w:lvlText w:val=""/>
+      <w:lvlJc w:val="left"/>
+      <w:pPr>
+        <w:tabs>
+          <w:tab w:val="num" w:pos="3600"/>
+        </w:tabs>
+        <w:ind w:left="3600" w:hanging="360"/>
+      </w:pPr>
+      <w:rPr>
+        <w:rFonts w:ascii="Symbol" w:hAnsi="Symbol" w:hint="default"/>
+        <w:sz w:val="20"/>
+      </w:rPr>
+    </w:lvl>
+    <w:lvl w:ilvl="5" w:tentative="1">
+      <w:start w:val="1"/>
+      <w:numFmt w:val="bullet"/>
+      <w:lvlText w:val=""/>
+      <w:lvlJc w:val="left"/>
+      <w:pPr>
+        <w:tabs>
+          <w:tab w:val="num" w:pos="4320"/>
+        </w:tabs>
+        <w:ind w:left="4320" w:hanging="360"/>
+      </w:pPr>
+      <w:rPr>
+        <w:rFonts w:ascii="Symbol" w:hAnsi="Symbol" w:hint="default"/>
+        <w:sz w:val="20"/>
+      </w:rPr>
+    </w:lvl>
+    <w:lvl w:ilvl="6" w:tentative="1">
+      <w:start w:val="1"/>
+      <w:numFmt w:val="bullet"/>
+      <w:lvlText w:val=""/>
+      <w:lvlJc w:val="left"/>
+      <w:pPr>
+        <w:tabs>
+          <w:tab w:val="num" w:pos="5040"/>
+        </w:tabs>
+        <w:ind w:left="5040" w:hanging="360"/>
+      </w:pPr>
+      <w:rPr>
+        <w:rFonts w:ascii="Symbol" w:hAnsi="Symbol" w:hint="default"/>
+        <w:sz w:val="20"/>
+      </w:rPr>
+    </w:lvl>
+    <w:lvl w:ilvl="7" w:tentative="1">
+      <w:start w:val="1"/>
+      <w:numFmt w:val="bullet"/>
+      <w:lvlText w:val=""/>
+      <w:lvlJc w:val="left"/>
+      <w:pPr>
+        <w:tabs>
+          <w:tab w:val="num" w:pos="5760"/>
+        </w:tabs>
+        <w:ind w:left="5760" w:hanging="360"/>
+      </w:pPr>
+      <w:rPr>
+        <w:rFonts w:ascii="Symbol" w:hAnsi="Symbol" w:hint="default"/>
+        <w:sz w:val="20"/>
+      </w:rPr>
+    </w:lvl>
+    <w:lvl w:ilvl="8" w:tentative="1">
+      <w:start w:val="1"/>
+      <w:numFmt w:val="bullet"/>
+      <w:lvlText w:val=""/>
+      <w:lvlJc w:val="left"/>
+      <w:pPr>
+        <w:tabs>
+          <w:tab w:val="num" w:pos="6480"/>
+        </w:tabs>
+        <w:ind w:left="6480" w:hanging="360"/>
+      </w:pPr>
+      <w:rPr>
+        <w:rFonts w:ascii="Symbol" w:hAnsi="Symbol" w:hint="default"/>
+        <w:sz w:val="20"/>
+      </w:rPr>
+    </w:lvl>
+  </w:abstractNum>
+  <w:abstractNum w:abstractNumId="8" w15:restartNumberingAfterBreak="0">
+    <w:nsid w:val="32C565A5"/>
+    <w:multiLevelType w:val="multilevel"/>
+    <w:tmpl w:val="6994ACFA"/>
+    <w:lvl w:ilvl="0">
+      <w:start w:val="1"/>
+      <w:numFmt w:val="bullet"/>
+      <w:lvlText w:val=""/>
+      <w:lvlJc w:val="left"/>
+      <w:pPr>
+        <w:tabs>
+          <w:tab w:val="num" w:pos="720"/>
+        </w:tabs>
+        <w:ind w:left="720" w:hanging="360"/>
+      </w:pPr>
+      <w:rPr>
+        <w:rFonts w:ascii="Symbol" w:hAnsi="Symbol" w:hint="default"/>
+        <w:sz w:val="20"/>
+      </w:rPr>
+    </w:lvl>
+    <w:lvl w:ilvl="1" w:tentative="1">
+      <w:start w:val="1"/>
+      <w:numFmt w:val="bullet"/>
+      <w:lvlText w:val="o"/>
+      <w:lvlJc w:val="left"/>
+      <w:pPr>
+        <w:tabs>
+          <w:tab w:val="num" w:pos="1440"/>
+        </w:tabs>
+        <w:ind w:left="1440" w:hanging="360"/>
+      </w:pPr>
+      <w:rPr>
+        <w:rFonts w:ascii="Courier New" w:hAnsi="Courier New" w:hint="default"/>
+        <w:sz w:val="20"/>
+      </w:rPr>
+    </w:lvl>
+    <w:lvl w:ilvl="2" w:tentative="1">
+      <w:start w:val="1"/>
+      <w:numFmt w:val="bullet"/>
+      <w:lvlText w:val=""/>
+      <w:lvlJc w:val="left"/>
+      <w:pPr>
+        <w:tabs>
+          <w:tab w:val="num" w:pos="2160"/>
+        </w:tabs>
+        <w:ind w:left="2160" w:hanging="360"/>
+      </w:pPr>
+      <w:rPr>
+        <w:rFonts w:ascii="Wingdings" w:hAnsi="Wingdings" w:hint="default"/>
+        <w:sz w:val="20"/>
+      </w:rPr>
+    </w:lvl>
+    <w:lvl w:ilvl="3" w:tentative="1">
+      <w:start w:val="1"/>
+      <w:numFmt w:val="bullet"/>
+      <w:lvlText w:val=""/>
+      <w:lvlJc w:val="left"/>
+      <w:pPr>
+        <w:tabs>
+          <w:tab w:val="num" w:pos="2880"/>
+        </w:tabs>
+        <w:ind w:left="2880" w:hanging="360"/>
+      </w:pPr>
+      <w:rPr>
+        <w:rFonts w:ascii="Wingdings" w:hAnsi="Wingdings" w:hint="default"/>
+        <w:sz w:val="20"/>
+      </w:rPr>
+    </w:lvl>
+    <w:lvl w:ilvl="4" w:tentative="1">
+      <w:start w:val="1"/>
+      <w:numFmt w:val="bullet"/>
+      <w:lvlText w:val=""/>
+      <w:lvlJc w:val="left"/>
+      <w:pPr>
+        <w:tabs>
+          <w:tab w:val="num" w:pos="3600"/>
+        </w:tabs>
+        <w:ind w:left="3600" w:hanging="360"/>
+      </w:pPr>
+      <w:rPr>
+        <w:rFonts w:ascii="Wingdings" w:hAnsi="Wingdings" w:hint="default"/>
+        <w:sz w:val="20"/>
+      </w:rPr>
+    </w:lvl>
+    <w:lvl w:ilvl="5" w:tentative="1">
+      <w:start w:val="1"/>
+      <w:numFmt w:val="bullet"/>
+      <w:lvlText w:val=""/>
+      <w:lvlJc w:val="left"/>
+      <w:pPr>
+        <w:tabs>
+          <w:tab w:val="num" w:pos="4320"/>
+        </w:tabs>
+        <w:ind w:left="4320" w:hanging="360"/>
+      </w:pPr>
+      <w:rPr>
+        <w:rFonts w:ascii="Wingdings" w:hAnsi="Wingdings" w:hint="default"/>
+        <w:sz w:val="20"/>
+      </w:rPr>
+    </w:lvl>
+    <w:lvl w:ilvl="6" w:tentative="1">
+      <w:start w:val="1"/>
+      <w:numFmt w:val="bullet"/>
+      <w:lvlText w:val=""/>
+      <w:lvlJc w:val="left"/>
+      <w:pPr>
+        <w:tabs>
+          <w:tab w:val="num" w:pos="5040"/>
+        </w:tabs>
+        <w:ind w:left="5040" w:hanging="360"/>
+      </w:pPr>
+      <w:rPr>
+        <w:rFonts w:ascii="Wingdings" w:hAnsi="Wingdings" w:hint="default"/>
+        <w:sz w:val="20"/>
+      </w:rPr>
+    </w:lvl>
+    <w:lvl w:ilvl="7" w:tentative="1">
+      <w:start w:val="1"/>
+      <w:numFmt w:val="bullet"/>
+      <w:lvlText w:val=""/>
+      <w:lvlJc w:val="left"/>
+      <w:pPr>
+        <w:tabs>
+          <w:tab w:val="num" w:pos="5760"/>
+        </w:tabs>
+        <w:ind w:left="5760" w:hanging="360"/>
+      </w:pPr>
+      <w:rPr>
+        <w:rFonts w:ascii="Wingdings" w:hAnsi="Wingdings" w:hint="default"/>
+        <w:sz w:val="20"/>
+      </w:rPr>
+    </w:lvl>
+    <w:lvl w:ilvl="8" w:tentative="1">
+      <w:start w:val="1"/>
+      <w:numFmt w:val="bullet"/>
+      <w:lvlText w:val=""/>
+      <w:lvlJc w:val="left"/>
+      <w:pPr>
+        <w:tabs>
+          <w:tab w:val="num" w:pos="6480"/>
+        </w:tabs>
+        <w:ind w:left="6480" w:hanging="360"/>
+      </w:pPr>
+      <w:rPr>
+        <w:rFonts w:ascii="Wingdings" w:hAnsi="Wingdings" w:hint="default"/>
+        <w:sz w:val="20"/>
+      </w:rPr>
+    </w:lvl>
+  </w:abstractNum>
+  <w:abstractNum w:abstractNumId="9" w15:restartNumberingAfterBreak="0">
+    <w:nsid w:val="36F92FB9"/>
+    <w:multiLevelType w:val="hybridMultilevel"/>
+    <w:tmpl w:val="F176C1B6"/>
+    <w:lvl w:ilvl="0" w:tplc="04090001">
+      <w:start w:val="1"/>
+      <w:numFmt w:val="bullet"/>
+      <w:lvlText w:val=""/>
+      <w:lvlJc w:val="left"/>
+      <w:pPr>
+        <w:ind w:left="720" w:hanging="360"/>
+      </w:pPr>
+      <w:rPr>
+        <w:rFonts w:ascii="Symbol" w:hAnsi="Symbol" w:hint="default"/>
+      </w:rPr>
+    </w:lvl>
+    <w:lvl w:ilvl="1" w:tplc="04090003" w:tentative="1">
+      <w:start w:val="1"/>
+      <w:numFmt w:val="bullet"/>
+      <w:lvlText w:val="o"/>
+      <w:lvlJc w:val="left"/>
+      <w:pPr>
+        <w:ind w:left="1440" w:hanging="360"/>
+      </w:pPr>
+      <w:rPr>
+        <w:rFonts w:ascii="Courier New" w:hAnsi="Courier New" w:cs="Courier New" w:hint="default"/>
+      </w:rPr>
+    </w:lvl>
+    <w:lvl w:ilvl="2" w:tplc="04090005" w:tentative="1">
+      <w:start w:val="1"/>
+      <w:numFmt w:val="bullet"/>
+      <w:lvlText w:val=""/>
+      <w:lvlJc w:val="left"/>
+      <w:pPr>
+        <w:ind w:left="2160" w:hanging="360"/>
+      </w:pPr>
+      <w:rPr>
+        <w:rFonts w:ascii="Wingdings" w:hAnsi="Wingdings" w:hint="default"/>
+      </w:rPr>
+    </w:lvl>
+    <w:lvl w:ilvl="3" w:tplc="04090001" w:tentative="1">
+      <w:start w:val="1"/>
+      <w:numFmt w:val="bullet"/>
+      <w:lvlText w:val=""/>
+      <w:lvlJc w:val="left"/>
+      <w:pPr>
+        <w:ind w:left="2880" w:hanging="360"/>
+      </w:pPr>
+      <w:rPr>
+        <w:rFonts w:ascii="Symbol" w:hAnsi="Symbol" w:hint="default"/>
+      </w:rPr>
+    </w:lvl>
+    <w:lvl w:ilvl="4" w:tplc="04090003" w:tentative="1">
+      <w:start w:val="1"/>
+      <w:numFmt w:val="bullet"/>
+      <w:lvlText w:val="o"/>
+      <w:lvlJc w:val="left"/>
+      <w:pPr>
+        <w:ind w:left="3600" w:hanging="360"/>
+      </w:pPr>
+      <w:rPr>
+        <w:rFonts w:ascii="Courier New" w:hAnsi="Courier New" w:cs="Courier New" w:hint="default"/>
+      </w:rPr>
+    </w:lvl>
+    <w:lvl w:ilvl="5" w:tplc="04090005" w:tentative="1">
+      <w:start w:val="1"/>
+      <w:numFmt w:val="bullet"/>
+      <w:lvlText w:val=""/>
+      <w:lvlJc w:val="left"/>
+      <w:pPr>
+        <w:ind w:left="4320" w:hanging="360"/>
+      </w:pPr>
+      <w:rPr>
+        <w:rFonts w:ascii="Wingdings" w:hAnsi="Wingdings" w:hint="default"/>
+      </w:rPr>
+    </w:lvl>
+    <w:lvl w:ilvl="6" w:tplc="04090001" w:tentative="1">
+      <w:start w:val="1"/>
+      <w:numFmt w:val="bullet"/>
+      <w:lvlText w:val=""/>
+      <w:lvlJc w:val="left"/>
+      <w:pPr>
+        <w:ind w:left="5040" w:hanging="360"/>
+      </w:pPr>
+      <w:rPr>
+        <w:rFonts w:ascii="Symbol" w:hAnsi="Symbol" w:hint="default"/>
+      </w:rPr>
+    </w:lvl>
+    <w:lvl w:ilvl="7" w:tplc="04090003" w:tentative="1">
+      <w:start w:val="1"/>
+      <w:numFmt w:val="bullet"/>
+      <w:lvlText w:val="o"/>
+      <w:lvlJc w:val="left"/>
+      <w:pPr>
+        <w:ind w:left="5760" w:hanging="360"/>
+      </w:pPr>
+      <w:rPr>
+        <w:rFonts w:ascii="Courier New" w:hAnsi="Courier New" w:cs="Courier New" w:hint="default"/>
+      </w:rPr>
+    </w:lvl>
+    <w:lvl w:ilvl="8" w:tplc="04090005" w:tentative="1">
+      <w:start w:val="1"/>
+      <w:numFmt w:val="bullet"/>
+      <w:lvlText w:val=""/>
+      <w:lvlJc w:val="left"/>
+      <w:pPr>
+        <w:ind w:left="6480" w:hanging="360"/>
+      </w:pPr>
+      <w:rPr>
+        <w:rFonts w:ascii="Wingdings" w:hAnsi="Wingdings" w:hint="default"/>
+      </w:rPr>
+    </w:lvl>
+  </w:abstractNum>
+  <w:abstractNum w:abstractNumId="10" w15:restartNumberingAfterBreak="0">
+    <w:nsid w:val="478334E9"/>
+    <w:multiLevelType w:val="multilevel"/>
+    <w:tmpl w:val="12CA2266"/>
+    <w:lvl w:ilvl="0">
+      <w:start w:val="1"/>
+      <w:numFmt w:val="bullet"/>
+      <w:lvlText w:val=""/>
+      <w:lvlJc w:val="left"/>
+      <w:pPr>
+        <w:tabs>
+          <w:tab w:val="num" w:pos="720"/>
+        </w:tabs>
+        <w:ind w:left="720" w:hanging="360"/>
+      </w:pPr>
+      <w:rPr>
+        <w:rFonts w:ascii="Symbol" w:hAnsi="Symbol" w:hint="default"/>
+        <w:sz w:val="20"/>
+      </w:rPr>
+    </w:lvl>
+    <w:lvl w:ilvl="1" w:tentative="1">
+      <w:start w:val="1"/>
+      <w:numFmt w:val="bullet"/>
+      <w:lvlText w:val=""/>
+      <w:lvlJc w:val="left"/>
+      <w:pPr>
+        <w:tabs>
+          <w:tab w:val="num" w:pos="1440"/>
+        </w:tabs>
+        <w:ind w:left="1440" w:hanging="360"/>
+      </w:pPr>
+      <w:rPr>
+        <w:rFonts w:ascii="Symbol" w:hAnsi="Symbol" w:hint="default"/>
+        <w:sz w:val="20"/>
+      </w:rPr>
+    </w:lvl>
+    <w:lvl w:ilvl="2" w:tentative="1">
+      <w:start w:val="1"/>
+      <w:numFmt w:val="bullet"/>
+      <w:lvlText w:val=""/>
+      <w:lvlJc w:val="left"/>
+      <w:pPr>
+        <w:tabs>
+          <w:tab w:val="num" w:pos="2160"/>
+        </w:tabs>
+        <w:ind w:left="2160" w:hanging="360"/>
+      </w:pPr>
+      <w:rPr>
+        <w:rFonts w:ascii="Symbol" w:hAnsi="Symbol" w:hint="default"/>
+        <w:sz w:val="20"/>
+      </w:rPr>
+    </w:lvl>
+    <w:lvl w:ilvl="3" w:tentative="1">
+      <w:start w:val="1"/>
+      <w:numFmt w:val="bullet"/>
+      <w:lvlText w:val=""/>
+      <w:lvlJc w:val="left"/>
+      <w:pPr>
+        <w:tabs>
+          <w:tab w:val="num" w:pos="2880"/>
+        </w:tabs>
+        <w:ind w:left="2880" w:hanging="360"/>
+      </w:pPr>
+      <w:rPr>
+        <w:rFonts w:ascii="Symbol" w:hAnsi="Symbol" w:hint="default"/>
+        <w:sz w:val="20"/>
+      </w:rPr>
+    </w:lvl>
+    <w:lvl w:ilvl="4" w:tentative="1">
+      <w:start w:val="1"/>
+      <w:numFmt w:val="bullet"/>
+      <w:lvlText w:val=""/>
+      <w:lvlJc w:val="left"/>
+      <w:pPr>
+        <w:tabs>
+          <w:tab w:val="num" w:pos="3600"/>
+        </w:tabs>
+        <w:ind w:left="3600" w:hanging="360"/>
+      </w:pPr>
+      <w:rPr>
+        <w:rFonts w:ascii="Symbol" w:hAnsi="Symbol" w:hint="default"/>
+        <w:sz w:val="20"/>
+      </w:rPr>
+    </w:lvl>
+    <w:lvl w:ilvl="5" w:tentative="1">
+      <w:start w:val="1"/>
+      <w:numFmt w:val="bullet"/>
+      <w:lvlText w:val=""/>
+      <w:lvlJc w:val="left"/>
+      <w:pPr>
+        <w:tabs>
+          <w:tab w:val="num" w:pos="4320"/>
+        </w:tabs>
+        <w:ind w:left="4320" w:hanging="360"/>
+      </w:pPr>
+      <w:rPr>
+        <w:rFonts w:ascii="Symbol" w:hAnsi="Symbol" w:hint="default"/>
+        <w:sz w:val="20"/>
+      </w:rPr>
+    </w:lvl>
+    <w:lvl w:ilvl="6" w:tentative="1">
+      <w:start w:val="1"/>
+      <w:numFmt w:val="bullet"/>
+      <w:lvlText w:val=""/>
+      <w:lvlJc w:val="left"/>
+      <w:pPr>
+        <w:tabs>
+          <w:tab w:val="num" w:pos="5040"/>
+        </w:tabs>
+        <w:ind w:left="5040" w:hanging="360"/>
+      </w:pPr>
+      <w:rPr>
+        <w:rFonts w:ascii="Symbol" w:hAnsi="Symbol" w:hint="default"/>
+        <w:sz w:val="20"/>
+      </w:rPr>
+    </w:lvl>
+    <w:lvl w:ilvl="7" w:tentative="1">
+      <w:start w:val="1"/>
+      <w:numFmt w:val="bullet"/>
+      <w:lvlText w:val=""/>
+      <w:lvlJc w:val="left"/>
+      <w:pPr>
+        <w:tabs>
+          <w:tab w:val="num" w:pos="5760"/>
+        </w:tabs>
+        <w:ind w:left="5760" w:hanging="360"/>
+      </w:pPr>
+      <w:rPr>
+        <w:rFonts w:ascii="Symbol" w:hAnsi="Symbol" w:hint="default"/>
+        <w:sz w:val="20"/>
+      </w:rPr>
+    </w:lvl>
+    <w:lvl w:ilvl="8" w:tentative="1">
+      <w:start w:val="1"/>
+      <w:numFmt w:val="bullet"/>
+      <w:lvlText w:val=""/>
+      <w:lvlJc w:val="left"/>
+      <w:pPr>
+        <w:tabs>
+          <w:tab w:val="num" w:pos="6480"/>
+        </w:tabs>
+        <w:ind w:left="6480" w:hanging="360"/>
+      </w:pPr>
+      <w:rPr>
+        <w:rFonts w:ascii="Symbol" w:hAnsi="Symbol" w:hint="default"/>
+        <w:sz w:val="20"/>
+      </w:rPr>
+    </w:lvl>
+  </w:abstractNum>
+  <w:abstractNum w:abstractNumId="11" w15:restartNumberingAfterBreak="0">
+    <w:nsid w:val="51806E75"/>
+    <w:multiLevelType w:val="multilevel"/>
+    <w:tmpl w:val="B1F23F0C"/>
+    <w:lvl w:ilvl="0">
+      <w:start w:val="1"/>
+      <w:numFmt w:val="bullet"/>
+      <w:lvlText w:val=""/>
+      <w:lvlJc w:val="left"/>
+      <w:pPr>
+        <w:tabs>
+          <w:tab w:val="num" w:pos="720"/>
+        </w:tabs>
+        <w:ind w:left="720" w:hanging="360"/>
+      </w:pPr>
+      <w:rPr>
+        <w:rFonts w:ascii="Symbol" w:hAnsi="Symbol" w:hint="default"/>
+        <w:sz w:val="20"/>
+      </w:rPr>
+    </w:lvl>
+    <w:lvl w:ilvl="1" w:tentative="1">
+      <w:start w:val="1"/>
+      <w:numFmt w:val="bullet"/>
+      <w:lvlText w:val=""/>
+      <w:lvlJc w:val="left"/>
+      <w:pPr>
+        <w:tabs>
+          <w:tab w:val="num" w:pos="1440"/>
+        </w:tabs>
+        <w:ind w:left="1440" w:hanging="360"/>
+      </w:pPr>
+      <w:rPr>
+        <w:rFonts w:ascii="Symbol" w:hAnsi="Symbol" w:hint="default"/>
+        <w:sz w:val="20"/>
+      </w:rPr>
+    </w:lvl>
+    <w:lvl w:ilvl="2" w:tentative="1">
+      <w:start w:val="1"/>
+      <w:numFmt w:val="bullet"/>
+      <w:lvlText w:val=""/>
+      <w:lvlJc w:val="left"/>
+      <w:pPr>
+        <w:tabs>
+          <w:tab w:val="num" w:pos="2160"/>
+        </w:tabs>
+        <w:ind w:left="2160" w:hanging="360"/>
+      </w:pPr>
+      <w:rPr>
+        <w:rFonts w:ascii="Symbol" w:hAnsi="Symbol" w:hint="default"/>
+        <w:sz w:val="20"/>
+      </w:rPr>
+    </w:lvl>
+    <w:lvl w:ilvl="3" w:tentative="1">
+      <w:start w:val="1"/>
+      <w:numFmt w:val="bullet"/>
+      <w:lvlText w:val=""/>
+      <w:lvlJc w:val="left"/>
+      <w:pPr>
+        <w:tabs>
+          <w:tab w:val="num" w:pos="2880"/>
+        </w:tabs>
+        <w:ind w:left="2880" w:hanging="360"/>
+      </w:pPr>
+      <w:rPr>
+        <w:rFonts w:ascii="Symbol" w:hAnsi="Symbol" w:hint="default"/>
+        <w:sz w:val="20"/>
+      </w:rPr>
+    </w:lvl>
+    <w:lvl w:ilvl="4" w:tentative="1">
+      <w:start w:val="1"/>
+      <w:numFmt w:val="bullet"/>
+      <w:lvlText w:val=""/>
+      <w:lvlJc w:val="left"/>
+      <w:pPr>
+        <w:tabs>
+          <w:tab w:val="num" w:pos="3600"/>
+        </w:tabs>
+        <w:ind w:left="3600" w:hanging="360"/>
+      </w:pPr>
+      <w:rPr>
+        <w:rFonts w:ascii="Symbol" w:hAnsi="Symbol" w:hint="default"/>
+        <w:sz w:val="20"/>
+      </w:rPr>
+    </w:lvl>
+    <w:lvl w:ilvl="5" w:tentative="1">
+      <w:start w:val="1"/>
+      <w:numFmt w:val="bullet"/>
+      <w:lvlText w:val=""/>
+      <w:lvlJc w:val="left"/>
+      <w:pPr>
+        <w:tabs>
+          <w:tab w:val="num" w:pos="4320"/>
+        </w:tabs>
+        <w:ind w:left="4320" w:hanging="360"/>
+      </w:pPr>
+      <w:rPr>
+        <w:rFonts w:ascii="Symbol" w:hAnsi="Symbol" w:hint="default"/>
+        <w:sz w:val="20"/>
+      </w:rPr>
+    </w:lvl>
+    <w:lvl w:ilvl="6" w:tentative="1">
+      <w:start w:val="1"/>
+      <w:numFmt w:val="bullet"/>
+      <w:lvlText w:val=""/>
+      <w:lvlJc w:val="left"/>
+      <w:pPr>
+        <w:tabs>
+          <w:tab w:val="num" w:pos="5040"/>
+        </w:tabs>
+        <w:ind w:left="5040" w:hanging="360"/>
+      </w:pPr>
+      <w:rPr>
+        <w:rFonts w:ascii="Symbol" w:hAnsi="Symbol" w:hint="default"/>
+        <w:sz w:val="20"/>
+      </w:rPr>
+    </w:lvl>
+    <w:lvl w:ilvl="7" w:tentative="1">
+      <w:start w:val="1"/>
+      <w:numFmt w:val="bullet"/>
+      <w:lvlText w:val=""/>
+      <w:lvlJc w:val="left"/>
+      <w:pPr>
+        <w:tabs>
+          <w:tab w:val="num" w:pos="5760"/>
+        </w:tabs>
+        <w:ind w:left="5760" w:hanging="360"/>
+      </w:pPr>
+      <w:rPr>
+        <w:rFonts w:ascii="Symbol" w:hAnsi="Symbol" w:hint="default"/>
+        <w:sz w:val="20"/>
+      </w:rPr>
+    </w:lvl>
+    <w:lvl w:ilvl="8" w:tentative="1">
+      <w:start w:val="1"/>
+      <w:numFmt w:val="bullet"/>
+      <w:lvlText w:val=""/>
+      <w:lvlJc w:val="left"/>
+      <w:pPr>
+        <w:tabs>
+          <w:tab w:val="num" w:pos="6480"/>
+        </w:tabs>
+        <w:ind w:left="6480" w:hanging="360"/>
+      </w:pPr>
+      <w:rPr>
+        <w:rFonts w:ascii="Symbol" w:hAnsi="Symbol" w:hint="default"/>
+        <w:sz w:val="20"/>
+      </w:rPr>
+    </w:lvl>
+  </w:abstractNum>
+  <w:abstractNum w:abstractNumId="12" w15:restartNumberingAfterBreak="0">
+    <w:nsid w:val="5205426F"/>
+    <w:multiLevelType w:val="multilevel"/>
+    <w:tmpl w:val="A7B44F56"/>
+    <w:lvl w:ilvl="0">
+      <w:start w:val="1"/>
+      <w:numFmt w:val="bullet"/>
+      <w:lvlText w:val=""/>
+      <w:lvlJc w:val="left"/>
+      <w:pPr>
+        <w:tabs>
+          <w:tab w:val="num" w:pos="720"/>
+        </w:tabs>
+        <w:ind w:left="720" w:hanging="360"/>
+      </w:pPr>
+      <w:rPr>
+        <w:rFonts w:ascii="Symbol" w:hAnsi="Symbol" w:hint="default"/>
+        <w:sz w:val="20"/>
+      </w:rPr>
+    </w:lvl>
+    <w:lvl w:ilvl="1" w:tentative="1">
+      <w:start w:val="1"/>
+      <w:numFmt w:val="bullet"/>
+      <w:lvlText w:val=""/>
+      <w:lvlJc w:val="left"/>
+      <w:pPr>
+        <w:tabs>
+          <w:tab w:val="num" w:pos="1440"/>
+        </w:tabs>
+        <w:ind w:left="1440" w:hanging="360"/>
+      </w:pPr>
+      <w:rPr>
+        <w:rFonts w:ascii="Symbol" w:hAnsi="Symbol" w:hint="default"/>
+        <w:sz w:val="20"/>
+      </w:rPr>
+    </w:lvl>
+    <w:lvl w:ilvl="2" w:tentative="1">
+      <w:start w:val="1"/>
+      <w:numFmt w:val="bullet"/>
+      <w:lvlText w:val=""/>
+      <w:lvlJc w:val="left"/>
+      <w:pPr>
+        <w:tabs>
+          <w:tab w:val="num" w:pos="2160"/>
+        </w:tabs>
+        <w:ind w:left="2160" w:hanging="360"/>
+      </w:pPr>
+      <w:rPr>
+        <w:rFonts w:ascii="Symbol" w:hAnsi="Symbol" w:hint="default"/>
+        <w:sz w:val="20"/>
+      </w:rPr>
+    </w:lvl>
+    <w:lvl w:ilvl="3" w:tentative="1">
+      <w:start w:val="1"/>
+      <w:numFmt w:val="bullet"/>
+      <w:lvlText w:val=""/>
+      <w:lvlJc w:val="left"/>
+      <w:pPr>
+        <w:tabs>
+          <w:tab w:val="num" w:pos="2880"/>
+        </w:tabs>
+        <w:ind w:left="2880" w:hanging="360"/>
+      </w:pPr>
+      <w:rPr>
+        <w:rFonts w:ascii="Symbol" w:hAnsi="Symbol" w:hint="default"/>
+        <w:sz w:val="20"/>
+      </w:rPr>
+    </w:lvl>
+    <w:lvl w:ilvl="4" w:tentative="1">
+      <w:start w:val="1"/>
+      <w:numFmt w:val="bullet"/>
+      <w:lvlText w:val=""/>
+      <w:lvlJc w:val="left"/>
+      <w:pPr>
+        <w:tabs>
+          <w:tab w:val="num" w:pos="3600"/>
+        </w:tabs>
+        <w:ind w:left="3600" w:hanging="360"/>
+      </w:pPr>
+      <w:rPr>
+        <w:rFonts w:ascii="Symbol" w:hAnsi="Symbol" w:hint="default"/>
+        <w:sz w:val="20"/>
+      </w:rPr>
+    </w:lvl>
+    <w:lvl w:ilvl="5" w:tentative="1">
+      <w:start w:val="1"/>
+      <w:numFmt w:val="bullet"/>
+      <w:lvlText w:val=""/>
+      <w:lvlJc w:val="left"/>
+      <w:pPr>
+        <w:tabs>
+          <w:tab w:val="num" w:pos="4320"/>
+        </w:tabs>
+        <w:ind w:left="4320" w:hanging="360"/>
+      </w:pPr>
+      <w:rPr>
+        <w:rFonts w:ascii="Symbol" w:hAnsi="Symbol" w:hint="default"/>
+        <w:sz w:val="20"/>
+      </w:rPr>
+    </w:lvl>
+    <w:lvl w:ilvl="6" w:tentative="1">
+      <w:start w:val="1"/>
+      <w:numFmt w:val="bullet"/>
+      <w:lvlText w:val=""/>
+      <w:lvlJc w:val="left"/>
+      <w:pPr>
+        <w:tabs>
+          <w:tab w:val="num" w:pos="5040"/>
+        </w:tabs>
+        <w:ind w:left="5040" w:hanging="360"/>
+      </w:pPr>
+      <w:rPr>
+        <w:rFonts w:ascii="Symbol" w:hAnsi="Symbol" w:hint="default"/>
+        <w:sz w:val="20"/>
+      </w:rPr>
+    </w:lvl>
+    <w:lvl w:ilvl="7" w:tentative="1">
+      <w:start w:val="1"/>
+      <w:numFmt w:val="bullet"/>
+      <w:lvlText w:val=""/>
+      <w:lvlJc w:val="left"/>
+      <w:pPr>
+        <w:tabs>
+          <w:tab w:val="num" w:pos="5760"/>
+        </w:tabs>
+        <w:ind w:left="5760" w:hanging="360"/>
+      </w:pPr>
+      <w:rPr>
+        <w:rFonts w:ascii="Symbol" w:hAnsi="Symbol" w:hint="default"/>
+        <w:sz w:val="20"/>
+      </w:rPr>
+    </w:lvl>
+    <w:lvl w:ilvl="8" w:tentative="1">
+      <w:start w:val="1"/>
+      <w:numFmt w:val="bullet"/>
+      <w:lvlText w:val=""/>
+      <w:lvlJc w:val="left"/>
+      <w:pPr>
+        <w:tabs>
+          <w:tab w:val="num" w:pos="6480"/>
+        </w:tabs>
+        <w:ind w:left="6480" w:hanging="360"/>
+      </w:pPr>
+      <w:rPr>
+        <w:rFonts w:ascii="Symbol" w:hAnsi="Symbol" w:hint="default"/>
+        <w:sz w:val="20"/>
+      </w:rPr>
+    </w:lvl>
+  </w:abstractNum>
+  <w:abstractNum w:abstractNumId="13" w15:restartNumberingAfterBreak="0">
+    <w:nsid w:val="52C174CF"/>
+    <w:multiLevelType w:val="multilevel"/>
+    <w:tmpl w:val="D99E0B6A"/>
+    <w:lvl w:ilvl="0">
+      <w:start w:val="1"/>
+      <w:numFmt w:val="bullet"/>
+      <w:lvlText w:val=""/>
+      <w:lvlJc w:val="left"/>
+      <w:pPr>
+        <w:tabs>
+          <w:tab w:val="num" w:pos="720"/>
+        </w:tabs>
+        <w:ind w:left="720" w:hanging="360"/>
+      </w:pPr>
+      <w:rPr>
+        <w:rFonts w:ascii="Symbol" w:hAnsi="Symbol" w:hint="default"/>
+        <w:sz w:val="20"/>
+      </w:rPr>
+    </w:lvl>
+    <w:lvl w:ilvl="1" w:tentative="1">
+      <w:start w:val="1"/>
+      <w:numFmt w:val="bullet"/>
+      <w:lvlText w:val=""/>
+      <w:lvlJc w:val="left"/>
+      <w:pPr>
+        <w:tabs>
+          <w:tab w:val="num" w:pos="1440"/>
+        </w:tabs>
+        <w:ind w:left="1440" w:hanging="360"/>
+      </w:pPr>
+      <w:rPr>
+        <w:rFonts w:ascii="Symbol" w:hAnsi="Symbol" w:hint="default"/>
+        <w:sz w:val="20"/>
+      </w:rPr>
+    </w:lvl>
+    <w:lvl w:ilvl="2" w:tentative="1">
+      <w:start w:val="1"/>
+      <w:numFmt w:val="bullet"/>
+      <w:lvlText w:val=""/>
+      <w:lvlJc w:val="left"/>
+      <w:pPr>
+        <w:tabs>
+          <w:tab w:val="num" w:pos="2160"/>
+        </w:tabs>
+        <w:ind w:left="2160" w:hanging="360"/>
+      </w:pPr>
+      <w:rPr>
+        <w:rFonts w:ascii="Symbol" w:hAnsi="Symbol" w:hint="default"/>
+        <w:sz w:val="20"/>
+      </w:rPr>
+    </w:lvl>
+    <w:lvl w:ilvl="3" w:tentative="1">
+      <w:start w:val="1"/>
+      <w:numFmt w:val="bullet"/>
+      <w:lvlText w:val=""/>
+      <w:lvlJc w:val="left"/>
+      <w:pPr>
+        <w:tabs>
+          <w:tab w:val="num" w:pos="2880"/>
+        </w:tabs>
+        <w:ind w:left="2880" w:hanging="360"/>
+      </w:pPr>
+      <w:rPr>
+        <w:rFonts w:ascii="Symbol" w:hAnsi="Symbol" w:hint="default"/>
+        <w:sz w:val="20"/>
+      </w:rPr>
+    </w:lvl>
+    <w:lvl w:ilvl="4" w:tentative="1">
+      <w:start w:val="1"/>
+      <w:numFmt w:val="bullet"/>
+      <w:lvlText w:val=""/>
+      <w:lvlJc w:val="left"/>
+      <w:pPr>
+        <w:tabs>
+          <w:tab w:val="num" w:pos="3600"/>
+        </w:tabs>
+        <w:ind w:left="3600" w:hanging="360"/>
+      </w:pPr>
+      <w:rPr>
+        <w:rFonts w:ascii="Symbol" w:hAnsi="Symbol" w:hint="default"/>
+        <w:sz w:val="20"/>
+      </w:rPr>
+    </w:lvl>
+    <w:lvl w:ilvl="5" w:tentative="1">
+      <w:start w:val="1"/>
+      <w:numFmt w:val="bullet"/>
+      <w:lvlText w:val=""/>
+      <w:lvlJc w:val="left"/>
+      <w:pPr>
+        <w:tabs>
+          <w:tab w:val="num" w:pos="4320"/>
+        </w:tabs>
+        <w:ind w:left="4320" w:hanging="360"/>
+      </w:pPr>
+      <w:rPr>
+        <w:rFonts w:ascii="Symbol" w:hAnsi="Symbol" w:hint="default"/>
+        <w:sz w:val="20"/>
+      </w:rPr>
+    </w:lvl>
+    <w:lvl w:ilvl="6" w:tentative="1">
+      <w:start w:val="1"/>
+      <w:numFmt w:val="bullet"/>
+      <w:lvlText w:val=""/>
+      <w:lvlJc w:val="left"/>
+      <w:pPr>
+        <w:tabs>
+          <w:tab w:val="num" w:pos="5040"/>
+        </w:tabs>
+        <w:ind w:left="5040" w:hanging="360"/>
+      </w:pPr>
+      <w:rPr>
+        <w:rFonts w:ascii="Symbol" w:hAnsi="Symbol" w:hint="default"/>
+        <w:sz w:val="20"/>
+      </w:rPr>
+    </w:lvl>
+    <w:lvl w:ilvl="7" w:tentative="1">
+      <w:start w:val="1"/>
+      <w:numFmt w:val="bullet"/>
+      <w:lvlText w:val=""/>
+      <w:lvlJc w:val="left"/>
+      <w:pPr>
+        <w:tabs>
+          <w:tab w:val="num" w:pos="5760"/>
+        </w:tabs>
+        <w:ind w:left="5760" w:hanging="360"/>
+      </w:pPr>
+      <w:rPr>
+        <w:rFonts w:ascii="Symbol" w:hAnsi="Symbol" w:hint="default"/>
+        <w:sz w:val="20"/>
+      </w:rPr>
+    </w:lvl>
+    <w:lvl w:ilvl="8" w:tentative="1">
+      <w:start w:val="1"/>
+      <w:numFmt w:val="bullet"/>
+      <w:lvlText w:val=""/>
+      <w:lvlJc w:val="left"/>
+      <w:pPr>
+        <w:tabs>
+          <w:tab w:val="num" w:pos="6480"/>
+        </w:tabs>
+        <w:ind w:left="6480" w:hanging="360"/>
+      </w:pPr>
+      <w:rPr>
+        <w:rFonts w:ascii="Symbol" w:hAnsi="Symbol" w:hint="default"/>
+        <w:sz w:val="20"/>
+      </w:rPr>
+    </w:lvl>
+  </w:abstractNum>
+  <w:abstractNum w:abstractNumId="14" w15:restartNumberingAfterBreak="0">
+    <w:nsid w:val="5B2612E1"/>
+    <w:multiLevelType w:val="multilevel"/>
+    <w:tmpl w:val="F748365E"/>
+    <w:lvl w:ilvl="0">
+      <w:start w:val="1"/>
+      <w:numFmt w:val="bullet"/>
+      <w:lvlText w:val=""/>
+      <w:lvlJc w:val="left"/>
+      <w:pPr>
+        <w:tabs>
+          <w:tab w:val="num" w:pos="360"/>
+        </w:tabs>
+        <w:ind w:left="360" w:hanging="360"/>
+      </w:pPr>
+      <w:rPr>
+        <w:rFonts w:ascii="Symbol" w:hAnsi="Symbol" w:hint="default"/>
+        <w:sz w:val="20"/>
+      </w:rPr>
+    </w:lvl>
+    <w:lvl w:ilvl="1" w:tentative="1">
+      <w:start w:val="1"/>
+      <w:numFmt w:val="bullet"/>
+      <w:lvlText w:val=""/>
+      <w:lvlJc w:val="left"/>
+      <w:pPr>
+        <w:tabs>
+          <w:tab w:val="num" w:pos="1080"/>
+        </w:tabs>
+        <w:ind w:left="1080" w:hanging="360"/>
+      </w:pPr>
+      <w:rPr>
+        <w:rFonts w:ascii="Symbol" w:hAnsi="Symbol" w:hint="default"/>
+        <w:sz w:val="20"/>
+      </w:rPr>
+    </w:lvl>
+    <w:lvl w:ilvl="2" w:tentative="1">
+      <w:start w:val="1"/>
+      <w:numFmt w:val="bullet"/>
+      <w:lvlText w:val=""/>
+      <w:lvlJc w:val="left"/>
+      <w:pPr>
+        <w:tabs>
+          <w:tab w:val="num" w:pos="1800"/>
+        </w:tabs>
+        <w:ind w:left="1800" w:hanging="360"/>
+      </w:pPr>
+      <w:rPr>
+        <w:rFonts w:ascii="Symbol" w:hAnsi="Symbol" w:hint="default"/>
+        <w:sz w:val="20"/>
+      </w:rPr>
+    </w:lvl>
+    <w:lvl w:ilvl="3" w:tentative="1">
+      <w:start w:val="1"/>
+      <w:numFmt w:val="bullet"/>
+      <w:lvlText w:val=""/>
+      <w:lvlJc w:val="left"/>
+      <w:pPr>
+        <w:tabs>
+          <w:tab w:val="num" w:pos="2520"/>
+        </w:tabs>
+        <w:ind w:left="2520" w:hanging="360"/>
+      </w:pPr>
+      <w:rPr>
+        <w:rFonts w:ascii="Symbol" w:hAnsi="Symbol" w:hint="default"/>
+        <w:sz w:val="20"/>
+      </w:rPr>
+    </w:lvl>
+    <w:lvl w:ilvl="4" w:tentative="1">
+      <w:start w:val="1"/>
+      <w:numFmt w:val="bullet"/>
+      <w:lvlText w:val=""/>
+      <w:lvlJc w:val="left"/>
+      <w:pPr>
+        <w:tabs>
+          <w:tab w:val="num" w:pos="3240"/>
+        </w:tabs>
+        <w:ind w:left="3240" w:hanging="360"/>
+      </w:pPr>
+      <w:rPr>
+        <w:rFonts w:ascii="Symbol" w:hAnsi="Symbol" w:hint="default"/>
+        <w:sz w:val="20"/>
+      </w:rPr>
+    </w:lvl>
+    <w:lvl w:ilvl="5" w:tentative="1">
+      <w:start w:val="1"/>
+      <w:numFmt w:val="bullet"/>
+      <w:lvlText w:val=""/>
+      <w:lvlJc w:val="left"/>
+      <w:pPr>
+        <w:tabs>
+          <w:tab w:val="num" w:pos="3960"/>
+        </w:tabs>
+        <w:ind w:left="3960" w:hanging="360"/>
+      </w:pPr>
+      <w:rPr>
+        <w:rFonts w:ascii="Symbol" w:hAnsi="Symbol" w:hint="default"/>
+        <w:sz w:val="20"/>
+      </w:rPr>
+    </w:lvl>
+    <w:lvl w:ilvl="6" w:tentative="1">
+      <w:start w:val="1"/>
+      <w:numFmt w:val="bullet"/>
+      <w:lvlText w:val=""/>
+      <w:lvlJc w:val="left"/>
+      <w:pPr>
+        <w:tabs>
+          <w:tab w:val="num" w:pos="4680"/>
+        </w:tabs>
+        <w:ind w:left="4680" w:hanging="360"/>
+      </w:pPr>
+      <w:rPr>
+        <w:rFonts w:ascii="Symbol" w:hAnsi="Symbol" w:hint="default"/>
+        <w:sz w:val="20"/>
+      </w:rPr>
+    </w:lvl>
+    <w:lvl w:ilvl="7" w:tentative="1">
+      <w:start w:val="1"/>
+      <w:numFmt w:val="bullet"/>
+      <w:lvlText w:val=""/>
+      <w:lvlJc w:val="left"/>
+      <w:pPr>
+        <w:tabs>
+          <w:tab w:val="num" w:pos="5400"/>
+        </w:tabs>
+        <w:ind w:left="5400" w:hanging="360"/>
+      </w:pPr>
+      <w:rPr>
+        <w:rFonts w:ascii="Symbol" w:hAnsi="Symbol" w:hint="default"/>
+        <w:sz w:val="20"/>
+      </w:rPr>
+    </w:lvl>
+    <w:lvl w:ilvl="8" w:tentative="1">
+      <w:start w:val="1"/>
+      <w:numFmt w:val="bullet"/>
+      <w:lvlText w:val=""/>
+      <w:lvlJc w:val="left"/>
+      <w:pPr>
+        <w:tabs>
+          <w:tab w:val="num" w:pos="6120"/>
+        </w:tabs>
+        <w:ind w:left="6120" w:hanging="360"/>
+      </w:pPr>
+      <w:rPr>
+        <w:rFonts w:ascii="Symbol" w:hAnsi="Symbol" w:hint="default"/>
+        <w:sz w:val="20"/>
+      </w:rPr>
+    </w:lvl>
+  </w:abstractNum>
+  <w:abstractNum w:abstractNumId="15" w15:restartNumberingAfterBreak="0">
+    <w:nsid w:val="6C48557D"/>
+    <w:multiLevelType w:val="hybridMultilevel"/>
+    <w:tmpl w:val="C330815A"/>
+    <w:lvl w:ilvl="0" w:tplc="0409000F">
+      <w:start w:val="1"/>
+      <w:numFmt w:val="decimal"/>
+      <w:lvlText w:val="%1."/>
+      <w:lvlJc w:val="left"/>
+      <w:pPr>
+        <w:ind w:left="720" w:hanging="360"/>
+      </w:pPr>
+    </w:lvl>
+    <w:lvl w:ilvl="1" w:tplc="04090019" w:tentative="1">
+      <w:start w:val="1"/>
+      <w:numFmt w:val="lowerLetter"/>
+      <w:lvlText w:val="%2."/>
+      <w:lvlJc w:val="left"/>
+      <w:pPr>
+        <w:ind w:left="1440" w:hanging="360"/>
+      </w:pPr>
+    </w:lvl>
+    <w:lvl w:ilvl="2" w:tplc="0409001B" w:tentative="1">
+      <w:start w:val="1"/>
+      <w:numFmt w:val="lowerRoman"/>
+      <w:lvlText w:val="%3."/>
+      <w:lvlJc w:val="right"/>
+      <w:pPr>
+        <w:ind w:left="2160" w:hanging="180"/>
+      </w:pPr>
+    </w:lvl>
+    <w:lvl w:ilvl="3" w:tplc="0409000F" w:tentative="1">
+      <w:start w:val="1"/>
+      <w:numFmt w:val="decimal"/>
+      <w:lvlText w:val="%4."/>
+      <w:lvlJc w:val="left"/>
+      <w:pPr>
+        <w:ind w:left="2880" w:hanging="360"/>
+      </w:pPr>
+    </w:lvl>
+    <w:lvl w:ilvl="4" w:tplc="04090019" w:tentative="1">
+      <w:start w:val="1"/>
+      <w:numFmt w:val="lowerLetter"/>
+      <w:lvlText w:val="%5."/>
+      <w:lvlJc w:val="left"/>
+      <w:pPr>
+        <w:ind w:left="3600" w:hanging="360"/>
+      </w:pPr>
+    </w:lvl>
+    <w:lvl w:ilvl="5" w:tplc="0409001B" w:tentative="1">
+      <w:start w:val="1"/>
+      <w:numFmt w:val="lowerRoman"/>
+      <w:lvlText w:val="%6."/>
+      <w:lvlJc w:val="right"/>
+      <w:pPr>
+        <w:ind w:left="4320" w:hanging="180"/>
+      </w:pPr>
+    </w:lvl>
+    <w:lvl w:ilvl="6" w:tplc="0409000F" w:tentative="1">
+      <w:start w:val="1"/>
+      <w:numFmt w:val="decimal"/>
+      <w:lvlText w:val="%7."/>
+      <w:lvlJc w:val="left"/>
+      <w:pPr>
+        <w:ind w:left="5040" w:hanging="360"/>
+      </w:pPr>
+    </w:lvl>
+    <w:lvl w:ilvl="7" w:tplc="04090019" w:tentative="1">
+      <w:start w:val="1"/>
+      <w:numFmt w:val="lowerLetter"/>
+      <w:lvlText w:val="%8."/>
+      <w:lvlJc w:val="left"/>
+      <w:pPr>
+        <w:ind w:left="5760" w:hanging="360"/>
+      </w:pPr>
+    </w:lvl>
+    <w:lvl w:ilvl="8" w:tplc="0409001B" w:tentative="1">
+      <w:start w:val="1"/>
+      <w:numFmt w:val="lowerRoman"/>
+      <w:lvlText w:val="%9."/>
+      <w:lvlJc w:val="right"/>
+      <w:pPr>
+        <w:ind w:left="6480" w:hanging="180"/>
+      </w:pPr>
+    </w:lvl>
+  </w:abstractNum>
+  <w:abstractNum w:abstractNumId="16" w15:restartNumberingAfterBreak="0">
+    <w:nsid w:val="6D331FA1"/>
+    <w:multiLevelType w:val="multilevel"/>
+    <w:tmpl w:val="40FC5312"/>
+    <w:lvl w:ilvl="0">
+      <w:start w:val="1"/>
+      <w:numFmt w:val="bullet"/>
+      <w:lvlText w:val=""/>
+      <w:lvlJc w:val="left"/>
+      <w:pPr>
+        <w:tabs>
+          <w:tab w:val="num" w:pos="720"/>
+        </w:tabs>
+        <w:ind w:left="720" w:hanging="360"/>
+      </w:pPr>
+      <w:rPr>
+        <w:rFonts w:ascii="Symbol" w:hAnsi="Symbol" w:hint="default"/>
+        <w:sz w:val="20"/>
+      </w:rPr>
+    </w:lvl>
+    <w:lvl w:ilvl="1" w:tentative="1">
+      <w:start w:val="1"/>
+      <w:numFmt w:val="bullet"/>
+      <w:lvlText w:val="o"/>
+      <w:lvlJc w:val="left"/>
+      <w:pPr>
+        <w:tabs>
+          <w:tab w:val="num" w:pos="1440"/>
+        </w:tabs>
+        <w:ind w:left="1440" w:hanging="360"/>
+      </w:pPr>
+      <w:rPr>
+        <w:rFonts w:ascii="Courier New" w:hAnsi="Courier New" w:hint="default"/>
+        <w:sz w:val="20"/>
+      </w:rPr>
+    </w:lvl>
+    <w:lvl w:ilvl="2" w:tentative="1">
+      <w:start w:val="1"/>
+      <w:numFmt w:val="bullet"/>
+      <w:lvlText w:val=""/>
+      <w:lvlJc w:val="left"/>
+      <w:pPr>
+        <w:tabs>
+          <w:tab w:val="num" w:pos="2160"/>
+        </w:tabs>
+        <w:ind w:left="2160" w:hanging="360"/>
+      </w:pPr>
+      <w:rPr>
+        <w:rFonts w:ascii="Wingdings" w:hAnsi="Wingdings" w:hint="default"/>
+        <w:sz w:val="20"/>
+      </w:rPr>
+    </w:lvl>
+    <w:lvl w:ilvl="3" w:tentative="1">
+      <w:start w:val="1"/>
+      <w:numFmt w:val="bullet"/>
+      <w:lvlText w:val=""/>
+      <w:lvlJc w:val="left"/>
+      <w:pPr>
+        <w:tabs>
+          <w:tab w:val="num" w:pos="2880"/>
+        </w:tabs>
+        <w:ind w:left="2880" w:hanging="360"/>
+      </w:pPr>
+      <w:rPr>
+        <w:rFonts w:ascii="Wingdings" w:hAnsi="Wingdings" w:hint="default"/>
+        <w:sz w:val="20"/>
+      </w:rPr>
+    </w:lvl>
+    <w:lvl w:ilvl="4" w:tentative="1">
+      <w:start w:val="1"/>
+      <w:numFmt w:val="bullet"/>
+      <w:lvlText w:val=""/>
+      <w:lvlJc w:val="left"/>
+      <w:pPr>
+        <w:tabs>
+          <w:tab w:val="num" w:pos="3600"/>
+        </w:tabs>
+        <w:ind w:left="3600" w:hanging="360"/>
+      </w:pPr>
+      <w:rPr>
+        <w:rFonts w:ascii="Wingdings" w:hAnsi="Wingdings" w:hint="default"/>
+        <w:sz w:val="20"/>
+      </w:rPr>
+    </w:lvl>
+    <w:lvl w:ilvl="5" w:tentative="1">
+      <w:start w:val="1"/>
+      <w:numFmt w:val="bullet"/>
+      <w:lvlText w:val=""/>
+      <w:lvlJc w:val="left"/>
+      <w:pPr>
+        <w:tabs>
+          <w:tab w:val="num" w:pos="4320"/>
+        </w:tabs>
+        <w:ind w:left="4320" w:hanging="360"/>
+      </w:pPr>
+      <w:rPr>
+        <w:rFonts w:ascii="Wingdings" w:hAnsi="Wingdings" w:hint="default"/>
+        <w:sz w:val="20"/>
+      </w:rPr>
+    </w:lvl>
+    <w:lvl w:ilvl="6" w:tentative="1">
+      <w:start w:val="1"/>
+      <w:numFmt w:val="bullet"/>
+      <w:lvlText w:val=""/>
+      <w:lvlJc w:val="left"/>
+      <w:pPr>
+        <w:tabs>
+          <w:tab w:val="num" w:pos="5040"/>
+        </w:tabs>
+        <w:ind w:left="5040" w:hanging="360"/>
+      </w:pPr>
+      <w:rPr>
+        <w:rFonts w:ascii="Wingdings" w:hAnsi="Wingdings" w:hint="default"/>
+        <w:sz w:val="20"/>
+      </w:rPr>
+    </w:lvl>
+    <w:lvl w:ilvl="7" w:tentative="1">
+      <w:start w:val="1"/>
+      <w:numFmt w:val="bullet"/>
+      <w:lvlText w:val=""/>
+      <w:lvlJc w:val="left"/>
+      <w:pPr>
+        <w:tabs>
+          <w:tab w:val="num" w:pos="5760"/>
+        </w:tabs>
+        <w:ind w:left="5760" w:hanging="360"/>
+      </w:pPr>
+      <w:rPr>
+        <w:rFonts w:ascii="Wingdings" w:hAnsi="Wingdings" w:hint="default"/>
+        <w:sz w:val="20"/>
+      </w:rPr>
+    </w:lvl>
+    <w:lvl w:ilvl="8" w:tentative="1">
+      <w:start w:val="1"/>
+      <w:numFmt w:val="bullet"/>
+      <w:lvlText w:val=""/>
+      <w:lvlJc w:val="left"/>
+      <w:pPr>
+        <w:tabs>
+          <w:tab w:val="num" w:pos="6480"/>
+        </w:tabs>
+        <w:ind w:left="6480" w:hanging="360"/>
+      </w:pPr>
+      <w:rPr>
+        <w:rFonts w:ascii="Wingdings" w:hAnsi="Wingdings" w:hint="default"/>
+        <w:sz w:val="20"/>
+      </w:rPr>
+    </w:lvl>
+  </w:abstractNum>
+  <w:abstractNum w:abstractNumId="17" w15:restartNumberingAfterBreak="0">
+    <w:nsid w:val="7A99222E"/>
+    <w:multiLevelType w:val="hybridMultilevel"/>
+    <w:tmpl w:val="FD146B4E"/>
+    <w:lvl w:ilvl="0" w:tplc="0409000F">
+      <w:start w:val="1"/>
+      <w:numFmt w:val="decimal"/>
+      <w:lvlText w:val="%1."/>
+      <w:lvlJc w:val="left"/>
+      <w:pPr>
+        <w:ind w:left="360" w:hanging="360"/>
+      </w:pPr>
+    </w:lvl>
+    <w:lvl w:ilvl="1" w:tplc="04090019" w:tentative="1">
+      <w:start w:val="1"/>
+      <w:numFmt w:val="lowerLetter"/>
+      <w:lvlText w:val="%2."/>
+      <w:lvlJc w:val="left"/>
+      <w:pPr>
+        <w:ind w:left="1080" w:hanging="360"/>
+      </w:pPr>
+    </w:lvl>
+    <w:lvl w:ilvl="2" w:tplc="0409001B" w:tentative="1">
+      <w:start w:val="1"/>
+      <w:numFmt w:val="lowerRoman"/>
+      <w:lvlText w:val="%3."/>
+      <w:lvlJc w:val="right"/>
+      <w:pPr>
+        <w:ind w:left="1800" w:hanging="180"/>
+      </w:pPr>
+    </w:lvl>
+    <w:lvl w:ilvl="3" w:tplc="0409000F" w:tentative="1">
+      <w:start w:val="1"/>
+      <w:numFmt w:val="decimal"/>
+      <w:lvlText w:val="%4."/>
+      <w:lvlJc w:val="left"/>
+      <w:pPr>
+        <w:ind w:left="2520" w:hanging="360"/>
+      </w:pPr>
+    </w:lvl>
+    <w:lvl w:ilvl="4" w:tplc="04090019" w:tentative="1">
+      <w:start w:val="1"/>
+      <w:numFmt w:val="lowerLetter"/>
+      <w:lvlText w:val="%5."/>
+      <w:lvlJc w:val="left"/>
+      <w:pPr>
+        <w:ind w:left="3240" w:hanging="360"/>
+      </w:pPr>
+    </w:lvl>
+    <w:lvl w:ilvl="5" w:tplc="0409001B" w:tentative="1">
+      <w:start w:val="1"/>
+      <w:numFmt w:val="lowerRoman"/>
+      <w:lvlText w:val="%6."/>
+      <w:lvlJc w:val="right"/>
+      <w:pPr>
+        <w:ind w:left="3960" w:hanging="180"/>
+      </w:pPr>
+    </w:lvl>
+    <w:lvl w:ilvl="6" w:tplc="0409000F" w:tentative="1">
+      <w:start w:val="1"/>
+      <w:numFmt w:val="decimal"/>
+      <w:lvlText w:val="%7."/>
+      <w:lvlJc w:val="left"/>
+      <w:pPr>
+        <w:ind w:left="4680" w:hanging="360"/>
+      </w:pPr>
+    </w:lvl>
+    <w:lvl w:ilvl="7" w:tplc="04090019" w:tentative="1">
+      <w:start w:val="1"/>
+      <w:numFmt w:val="lowerLetter"/>
+      <w:lvlText w:val="%8."/>
+      <w:lvlJc w:val="left"/>
+      <w:pPr>
+        <w:ind w:left="5400" w:hanging="360"/>
+      </w:pPr>
+    </w:lvl>
+    <w:lvl w:ilvl="8" w:tplc="0409001B" w:tentative="1">
+      <w:start w:val="1"/>
+      <w:numFmt w:val="lowerRoman"/>
+      <w:lvlText w:val="%9."/>
+      <w:lvlJc w:val="right"/>
+      <w:pPr>
+        <w:ind w:left="6120" w:hanging="180"/>
+      </w:pPr>
+    </w:lvl>
+  </w:abstractNum>
+  <w:num w:numId="1" w16cid:durableId="963845816">
+    <w:abstractNumId w:val="9"/>
+  </w:num>
+  <w:num w:numId="2" w16cid:durableId="1028337620">
+    <w:abstractNumId w:val="3"/>
+  </w:num>
+  <w:num w:numId="3" w16cid:durableId="152378062">
+    <w:abstractNumId w:val="1"/>
+  </w:num>
+  <w:num w:numId="4" w16cid:durableId="272516553">
+    <w:abstractNumId w:val="15"/>
+  </w:num>
+  <w:num w:numId="5" w16cid:durableId="15425480">
+    <w:abstractNumId w:val="14"/>
+  </w:num>
+  <w:num w:numId="6" w16cid:durableId="1905676433">
+    <w:abstractNumId w:val="4"/>
+  </w:num>
+  <w:num w:numId="7" w16cid:durableId="856114633">
+    <w:abstractNumId w:val="17"/>
+  </w:num>
+  <w:num w:numId="8" w16cid:durableId="2006738710">
+    <w:abstractNumId w:val="6"/>
+  </w:num>
+  <w:num w:numId="9" w16cid:durableId="826944122">
+    <w:abstractNumId w:val="7"/>
+  </w:num>
+  <w:num w:numId="10" w16cid:durableId="2088139679">
+    <w:abstractNumId w:val="11"/>
+  </w:num>
+  <w:num w:numId="11" w16cid:durableId="243955998">
+    <w:abstractNumId w:val="10"/>
+  </w:num>
+  <w:num w:numId="12" w16cid:durableId="432241650">
+    <w:abstractNumId w:val="13"/>
+  </w:num>
+  <w:num w:numId="13" w16cid:durableId="1941638909">
+    <w:abstractNumId w:val="12"/>
+  </w:num>
+  <w:num w:numId="14" w16cid:durableId="71782968">
+    <w:abstractNumId w:val="0"/>
+  </w:num>
+  <w:num w:numId="15" w16cid:durableId="1079910212">
+    <w:abstractNumId w:val="2"/>
+  </w:num>
+  <w:num w:numId="16" w16cid:durableId="1390033819">
+    <w:abstractNumId w:val="8"/>
+  </w:num>
+  <w:num w:numId="17" w16cid:durableId="896747915">
+    <w:abstractNumId w:val="16"/>
+  </w:num>
+  <w:num w:numId="18" w16cid:durableId="1439786967">
+    <w:abstractNumId w:val="5"/>
+  </w:num>
+</w:numbering>
 </file>
 
 <file path=word/styles.xml><?xml version="1.0" encoding="utf-8"?>
-<w:styles xmlns:mc="http://schemas.openxmlformats.org/markup-compatibility/2006" xmlns:r="http://schemas.openxmlformats.org/officeDocument/2006/relationships" xmlns:w="http://schemas.openxmlformats.org/wordprocessingml/2006/main" xmlns:w14="http://schemas.microsoft.com/office/word/2010/wordml" xmlns:w15="http://schemas.microsoft.com/office/word/2012/wordml" xmlns:w16cex="http://schemas.microsoft.com/office/word/2018/wordml/cex" xmlns:w16cid="http://schemas.microsoft.com/office/word/2016/wordml/cid" xmlns:w16="http://schemas.microsoft.com/office/word/2018/wordml" xmlns:w16sdtdh="http://schemas.microsoft.com/office/word/2020/wordml/sdtdatahash" xmlns:w16se="http://schemas.microsoft.com/office/word/2015/wordml/symex" mc:Ignorable="w14 w15 w16se w16cid w16 w16cex w16sdtdh">
+<w:styles xmlns:mc="http://schemas.openxmlformats.org/markup-compatibility/2006" xmlns:r="http://schemas.openxmlformats.org/officeDocument/2006/relationships" xmlns:w="http://schemas.openxmlformats.org/wordprocessingml/2006/main" xmlns:w14="http://schemas.microsoft.com/office/word/2010/wordml" xmlns:w15="http://schemas.microsoft.com/office/word/2012/wordml" xmlns:w16cex="http://schemas.microsoft.com/office/word/2018/wordml/cex" xmlns:w16cid="http://schemas.microsoft.com/office/word/2016/wordml/cid" xmlns:w16="http://schemas.microsoft.com/office/word/2018/wordml" xmlns:w16du="http://schemas.microsoft.com/office/word/2023/wordml/word16du" xmlns:w16sdtdh="http://schemas.microsoft.com/office/word/2020/wordml/sdtdatahash" xmlns:w16sdtfl="http://schemas.microsoft.com/office/word/2024/wordml/sdtformatlock" xmlns:w16se="http://schemas.microsoft.com/office/word/2015/wordml/symex" mc:Ignorable="w14 w15 w16se w16cid w16 w16cex w16sdtdh w16sdtfl w16du">
   <w:docDefaults>
     <w:rPrDefault>
       <w:rPr>
@@ -1531,7 +3704,6 @@
     <w:next w:val="Normal"/>
     <w:link w:val="Heading3Char"/>
     <w:uiPriority w:val="9"/>
-    <w:semiHidden/>
     <w:unhideWhenUsed/>
     <w:qFormat/>
     <w:rsid w:val="005823A6"/>
@@ -1604,7 +3776,6 @@
     <w:basedOn w:val="DefaultParagraphFont"/>
     <w:link w:val="Heading3"/>
     <w:uiPriority w:val="9"/>
-    <w:semiHidden/>
     <w:rsid w:val="005823A6"/>
     <w:rPr>
       <w:rFonts w:asciiTheme="majorHAnsi" w:eastAsiaTheme="majorEastAsia" w:hAnsiTheme="majorHAnsi" w:cstheme="majorHAnsi"/>
@@ -1647,8 +3818,11 @@
     <w:autoRedefine/>
     <w:uiPriority w:val="39"/>
     <w:unhideWhenUsed/>
-    <w:rsid w:val="00144069"/>
+    <w:rsid w:val="008F6C9F"/>
     <w:pPr>
+      <w:tabs>
+        <w:tab w:val="right" w:leader="dot" w:pos="8296"/>
+      </w:tabs>
       <w:spacing w:after="100"/>
     </w:pPr>
   </w:style>
@@ -1812,15 +3986,560 @@
       </w:tcPr>
     </w:tblStylePr>
   </w:style>
+  <w:style w:type="character" w:customStyle="1" w:styleId="Heading1Char1">
+    <w:name w:val="Heading 1 Char1"/>
+    <w:basedOn w:val="DefaultParagraphFont"/>
+    <w:uiPriority w:val="9"/>
+    <w:rsid w:val="0008788C"/>
+    <w:rPr>
+      <w:rFonts w:asciiTheme="majorHAnsi" w:eastAsiaTheme="majorEastAsia" w:hAnsiTheme="majorHAnsi" w:cstheme="majorHAnsi"/>
+      <w:bCs/>
+      <w:color w:val="4472C4" w:themeColor="accent1"/>
+      <w:sz w:val="32"/>
+      <w:szCs w:val="36"/>
+    </w:rPr>
+  </w:style>
+  <w:style w:type="character" w:customStyle="1" w:styleId="Heading1Char2">
+    <w:name w:val="Heading 1 Char2"/>
+    <w:basedOn w:val="DefaultParagraphFont"/>
+    <w:uiPriority w:val="9"/>
+    <w:rsid w:val="0008788C"/>
+    <w:rPr>
+      <w:rFonts w:asciiTheme="majorHAnsi" w:eastAsiaTheme="majorEastAsia" w:hAnsiTheme="majorHAnsi" w:cstheme="majorHAnsi"/>
+      <w:bCs/>
+      <w:color w:val="4472C4" w:themeColor="accent1"/>
+      <w:sz w:val="32"/>
+      <w:szCs w:val="36"/>
+    </w:rPr>
+  </w:style>
+  <w:style w:type="character" w:customStyle="1" w:styleId="Heading1Char3">
+    <w:name w:val="Heading 1 Char3"/>
+    <w:basedOn w:val="DefaultParagraphFont"/>
+    <w:uiPriority w:val="9"/>
+    <w:rsid w:val="0008788C"/>
+    <w:rPr>
+      <w:rFonts w:asciiTheme="majorHAnsi" w:eastAsiaTheme="majorEastAsia" w:hAnsiTheme="majorHAnsi" w:cstheme="majorHAnsi"/>
+      <w:bCs/>
+      <w:color w:val="4472C4" w:themeColor="accent1"/>
+      <w:sz w:val="32"/>
+      <w:szCs w:val="36"/>
+    </w:rPr>
+  </w:style>
+  <w:style w:type="character" w:customStyle="1" w:styleId="Heading1Char4">
+    <w:name w:val="Heading 1 Char4"/>
+    <w:basedOn w:val="DefaultParagraphFont"/>
+    <w:uiPriority w:val="9"/>
+    <w:rsid w:val="0008788C"/>
+    <w:rPr>
+      <w:rFonts w:asciiTheme="majorHAnsi" w:eastAsiaTheme="majorEastAsia" w:hAnsiTheme="majorHAnsi" w:cstheme="majorHAnsi"/>
+      <w:bCs/>
+      <w:color w:val="4472C4" w:themeColor="accent1"/>
+      <w:sz w:val="32"/>
+      <w:szCs w:val="36"/>
+    </w:rPr>
+  </w:style>
+  <w:style w:type="character" w:customStyle="1" w:styleId="Heading1Char5">
+    <w:name w:val="Heading 1 Char5"/>
+    <w:basedOn w:val="DefaultParagraphFont"/>
+    <w:uiPriority w:val="9"/>
+    <w:rsid w:val="0008788C"/>
+    <w:rPr>
+      <w:rFonts w:asciiTheme="majorHAnsi" w:eastAsiaTheme="majorEastAsia" w:hAnsiTheme="majorHAnsi" w:cstheme="majorHAnsi"/>
+      <w:bCs/>
+      <w:color w:val="4472C4" w:themeColor="accent1"/>
+      <w:sz w:val="32"/>
+      <w:szCs w:val="36"/>
+    </w:rPr>
+  </w:style>
+  <w:style w:type="character" w:customStyle="1" w:styleId="Heading2Char1">
+    <w:name w:val="Heading 2 Char1"/>
+    <w:basedOn w:val="DefaultParagraphFont"/>
+    <w:uiPriority w:val="9"/>
+    <w:rsid w:val="0008788C"/>
+    <w:rPr>
+      <w:rFonts w:asciiTheme="majorHAnsi" w:eastAsiaTheme="majorEastAsia" w:hAnsiTheme="majorHAnsi" w:cstheme="majorBidi"/>
+      <w:color w:val="2F5496" w:themeColor="accent1" w:themeShade="BF"/>
+      <w:sz w:val="28"/>
+      <w:szCs w:val="26"/>
+    </w:rPr>
+  </w:style>
+  <w:style w:type="paragraph" w:styleId="ListParagraph">
+    <w:name w:val="List Paragraph"/>
+    <w:basedOn w:val="Normal"/>
+    <w:uiPriority w:val="34"/>
+    <w:qFormat/>
+    <w:rsid w:val="0008788C"/>
+    <w:pPr>
+      <w:ind w:left="720"/>
+      <w:contextualSpacing/>
+    </w:pPr>
+    <w:rPr>
+      <w:rFonts w:eastAsiaTheme="minorHAnsi" w:cs="Calibri"/>
+      <w:sz w:val="24"/>
+    </w:rPr>
+  </w:style>
+  <w:style w:type="character" w:customStyle="1" w:styleId="Heading3Char1">
+    <w:name w:val="Heading 3 Char1"/>
+    <w:basedOn w:val="DefaultParagraphFont"/>
+    <w:uiPriority w:val="9"/>
+    <w:rsid w:val="0008788C"/>
+    <w:rPr>
+      <w:rFonts w:asciiTheme="majorHAnsi" w:eastAsiaTheme="majorEastAsia" w:hAnsiTheme="majorHAnsi" w:cstheme="majorBidi"/>
+      <w:color w:val="1F3763" w:themeColor="accent1" w:themeShade="7F"/>
+      <w:sz w:val="24"/>
+      <w:szCs w:val="24"/>
+    </w:rPr>
+  </w:style>
+  <w:style w:type="character" w:customStyle="1" w:styleId="Heading1Char6">
+    <w:name w:val="Heading 1 Char6"/>
+    <w:basedOn w:val="DefaultParagraphFont"/>
+    <w:uiPriority w:val="9"/>
+    <w:rsid w:val="0008788C"/>
+    <w:rPr>
+      <w:rFonts w:asciiTheme="majorHAnsi" w:eastAsiaTheme="majorEastAsia" w:hAnsiTheme="majorHAnsi" w:cstheme="majorHAnsi"/>
+      <w:bCs/>
+      <w:color w:val="4472C4" w:themeColor="accent1"/>
+      <w:sz w:val="32"/>
+      <w:szCs w:val="36"/>
+    </w:rPr>
+  </w:style>
+  <w:style w:type="character" w:customStyle="1" w:styleId="Heading1Char7">
+    <w:name w:val="Heading 1 Char7"/>
+    <w:basedOn w:val="DefaultParagraphFont"/>
+    <w:uiPriority w:val="9"/>
+    <w:rsid w:val="0008788C"/>
+    <w:rPr>
+      <w:rFonts w:asciiTheme="majorHAnsi" w:eastAsiaTheme="majorEastAsia" w:hAnsiTheme="majorHAnsi" w:cstheme="majorHAnsi"/>
+      <w:bCs/>
+      <w:color w:val="4472C4" w:themeColor="accent1"/>
+      <w:sz w:val="32"/>
+      <w:szCs w:val="36"/>
+    </w:rPr>
+  </w:style>
+  <w:style w:type="character" w:customStyle="1" w:styleId="Heading1Char8">
+    <w:name w:val="Heading 1 Char8"/>
+    <w:basedOn w:val="DefaultParagraphFont"/>
+    <w:uiPriority w:val="9"/>
+    <w:rsid w:val="0008788C"/>
+    <w:rPr>
+      <w:rFonts w:asciiTheme="majorHAnsi" w:eastAsiaTheme="majorEastAsia" w:hAnsiTheme="majorHAnsi" w:cstheme="majorHAnsi"/>
+      <w:bCs/>
+      <w:color w:val="4472C4" w:themeColor="accent1"/>
+      <w:sz w:val="32"/>
+      <w:szCs w:val="36"/>
+    </w:rPr>
+  </w:style>
+  <w:style w:type="character" w:customStyle="1" w:styleId="Heading2Char2">
+    <w:name w:val="Heading 2 Char2"/>
+    <w:basedOn w:val="DefaultParagraphFont"/>
+    <w:uiPriority w:val="9"/>
+    <w:rsid w:val="0008788C"/>
+    <w:rPr>
+      <w:rFonts w:asciiTheme="majorHAnsi" w:eastAsiaTheme="majorEastAsia" w:hAnsiTheme="majorHAnsi" w:cstheme="majorBidi"/>
+      <w:color w:val="2F5496" w:themeColor="accent1" w:themeShade="BF"/>
+      <w:sz w:val="28"/>
+      <w:szCs w:val="26"/>
+    </w:rPr>
+  </w:style>
+  <w:style w:type="character" w:customStyle="1" w:styleId="Heading1Char9">
+    <w:name w:val="Heading 1 Char9"/>
+    <w:basedOn w:val="DefaultParagraphFont"/>
+    <w:uiPriority w:val="9"/>
+    <w:rsid w:val="0008788C"/>
+    <w:rPr>
+      <w:rFonts w:asciiTheme="majorHAnsi" w:eastAsiaTheme="majorEastAsia" w:hAnsiTheme="majorHAnsi" w:cstheme="majorHAnsi"/>
+      <w:bCs/>
+      <w:color w:val="4472C4" w:themeColor="accent1"/>
+      <w:sz w:val="32"/>
+      <w:szCs w:val="36"/>
+    </w:rPr>
+  </w:style>
+  <w:style w:type="character" w:customStyle="1" w:styleId="Heading1Char10">
+    <w:name w:val="Heading 1 Char10"/>
+    <w:basedOn w:val="DefaultParagraphFont"/>
+    <w:uiPriority w:val="9"/>
+    <w:rsid w:val="0008788C"/>
+    <w:rPr>
+      <w:rFonts w:asciiTheme="majorHAnsi" w:eastAsiaTheme="majorEastAsia" w:hAnsiTheme="majorHAnsi" w:cstheme="majorHAnsi"/>
+      <w:bCs/>
+      <w:color w:val="4472C4" w:themeColor="accent1"/>
+      <w:sz w:val="32"/>
+      <w:szCs w:val="36"/>
+    </w:rPr>
+  </w:style>
+  <w:style w:type="paragraph" w:styleId="TOC2">
+    <w:name w:val="toc 2"/>
+    <w:basedOn w:val="Normal"/>
+    <w:next w:val="Normal"/>
+    <w:autoRedefine/>
+    <w:uiPriority w:val="39"/>
+    <w:unhideWhenUsed/>
+    <w:rsid w:val="00FA1AA5"/>
+    <w:pPr>
+      <w:spacing w:after="100"/>
+      <w:ind w:left="280"/>
+    </w:pPr>
+  </w:style>
+  <w:style w:type="paragraph" w:styleId="TOC3">
+    <w:name w:val="toc 3"/>
+    <w:basedOn w:val="Normal"/>
+    <w:next w:val="Normal"/>
+    <w:autoRedefine/>
+    <w:uiPriority w:val="39"/>
+    <w:unhideWhenUsed/>
+    <w:rsid w:val="00E306D5"/>
+    <w:pPr>
+      <w:tabs>
+        <w:tab w:val="right" w:leader="dot" w:pos="8296"/>
+      </w:tabs>
+      <w:spacing w:after="100"/>
+      <w:ind w:left="560"/>
+    </w:pPr>
+  </w:style>
+  <w:style w:type="character" w:customStyle="1" w:styleId="Heading1Char11">
+    <w:name w:val="Heading 1 Char11"/>
+    <w:basedOn w:val="DefaultParagraphFont"/>
+    <w:uiPriority w:val="9"/>
+    <w:rsid w:val="00CC3CD9"/>
+    <w:rPr>
+      <w:rFonts w:asciiTheme="majorHAnsi" w:eastAsiaTheme="majorEastAsia" w:hAnsiTheme="majorHAnsi" w:cstheme="majorHAnsi"/>
+      <w:bCs/>
+      <w:color w:val="4472C4" w:themeColor="accent1"/>
+      <w:sz w:val="32"/>
+      <w:szCs w:val="36"/>
+    </w:rPr>
+  </w:style>
+  <w:style w:type="character" w:customStyle="1" w:styleId="Heading1Char12">
+    <w:name w:val="Heading 1 Char12"/>
+    <w:basedOn w:val="DefaultParagraphFont"/>
+    <w:uiPriority w:val="9"/>
+    <w:rsid w:val="00CC3CD9"/>
+    <w:rPr>
+      <w:rFonts w:asciiTheme="majorHAnsi" w:eastAsiaTheme="majorEastAsia" w:hAnsiTheme="majorHAnsi" w:cstheme="majorHAnsi"/>
+      <w:bCs/>
+      <w:color w:val="4472C4" w:themeColor="accent1"/>
+      <w:sz w:val="32"/>
+      <w:szCs w:val="36"/>
+    </w:rPr>
+  </w:style>
+  <w:style w:type="character" w:customStyle="1" w:styleId="Heading1Char13">
+    <w:name w:val="Heading 1 Char13"/>
+    <w:basedOn w:val="DefaultParagraphFont"/>
+    <w:uiPriority w:val="9"/>
+    <w:rsid w:val="00CC3CD9"/>
+    <w:rPr>
+      <w:rFonts w:asciiTheme="majorHAnsi" w:eastAsiaTheme="majorEastAsia" w:hAnsiTheme="majorHAnsi" w:cstheme="majorHAnsi"/>
+      <w:bCs/>
+      <w:color w:val="4472C4" w:themeColor="accent1"/>
+      <w:sz w:val="32"/>
+      <w:szCs w:val="36"/>
+    </w:rPr>
+  </w:style>
+  <w:style w:type="character" w:customStyle="1" w:styleId="Heading1Char14">
+    <w:name w:val="Heading 1 Char14"/>
+    <w:basedOn w:val="DefaultParagraphFont"/>
+    <w:uiPriority w:val="9"/>
+    <w:rsid w:val="00CC3CD9"/>
+    <w:rPr>
+      <w:rFonts w:asciiTheme="majorHAnsi" w:eastAsiaTheme="majorEastAsia" w:hAnsiTheme="majorHAnsi" w:cstheme="majorHAnsi"/>
+      <w:bCs/>
+      <w:color w:val="4472C4" w:themeColor="accent1"/>
+      <w:sz w:val="32"/>
+      <w:szCs w:val="36"/>
+    </w:rPr>
+  </w:style>
+  <w:style w:type="character" w:customStyle="1" w:styleId="Heading1Char15">
+    <w:name w:val="Heading 1 Char15"/>
+    <w:basedOn w:val="DefaultParagraphFont"/>
+    <w:uiPriority w:val="9"/>
+    <w:rsid w:val="00CC3CD9"/>
+    <w:rPr>
+      <w:rFonts w:asciiTheme="majorHAnsi" w:eastAsiaTheme="majorEastAsia" w:hAnsiTheme="majorHAnsi" w:cstheme="majorHAnsi"/>
+      <w:bCs/>
+      <w:color w:val="4472C4" w:themeColor="accent1"/>
+      <w:sz w:val="32"/>
+      <w:szCs w:val="36"/>
+    </w:rPr>
+  </w:style>
+  <w:style w:type="character" w:customStyle="1" w:styleId="Heading2Char3">
+    <w:name w:val="Heading 2 Char3"/>
+    <w:basedOn w:val="DefaultParagraphFont"/>
+    <w:uiPriority w:val="9"/>
+    <w:rsid w:val="00CC3CD9"/>
+    <w:rPr>
+      <w:rFonts w:asciiTheme="majorHAnsi" w:eastAsiaTheme="majorEastAsia" w:hAnsiTheme="majorHAnsi" w:cstheme="majorBidi"/>
+      <w:color w:val="2F5496" w:themeColor="accent1" w:themeShade="BF"/>
+      <w:sz w:val="28"/>
+      <w:szCs w:val="26"/>
+    </w:rPr>
+  </w:style>
+  <w:style w:type="character" w:customStyle="1" w:styleId="Heading3Char2">
+    <w:name w:val="Heading 3 Char2"/>
+    <w:basedOn w:val="DefaultParagraphFont"/>
+    <w:uiPriority w:val="9"/>
+    <w:rsid w:val="00CC3CD9"/>
+    <w:rPr>
+      <w:rFonts w:asciiTheme="majorHAnsi" w:eastAsiaTheme="majorEastAsia" w:hAnsiTheme="majorHAnsi" w:cstheme="majorBidi"/>
+      <w:color w:val="1F3763" w:themeColor="accent1" w:themeShade="7F"/>
+      <w:sz w:val="24"/>
+      <w:szCs w:val="24"/>
+    </w:rPr>
+  </w:style>
+  <w:style w:type="character" w:customStyle="1" w:styleId="FooterChar1">
+    <w:name w:val="Footer Char1"/>
+    <w:basedOn w:val="DefaultParagraphFont"/>
+    <w:uiPriority w:val="99"/>
+    <w:rsid w:val="00CC3CD9"/>
+    <w:rPr>
+      <w:rFonts w:eastAsiaTheme="minorEastAsia" w:cstheme="minorHAnsi"/>
+      <w:sz w:val="28"/>
+      <w:szCs w:val="28"/>
+    </w:rPr>
+  </w:style>
+  <w:style w:type="character" w:customStyle="1" w:styleId="Heading1Char16">
+    <w:name w:val="Heading 1 Char16"/>
+    <w:basedOn w:val="DefaultParagraphFont"/>
+    <w:uiPriority w:val="9"/>
+    <w:rsid w:val="00CC3CD9"/>
+    <w:rPr>
+      <w:rFonts w:asciiTheme="majorHAnsi" w:eastAsiaTheme="majorEastAsia" w:hAnsiTheme="majorHAnsi" w:cstheme="majorHAnsi"/>
+      <w:bCs/>
+      <w:color w:val="4472C4" w:themeColor="accent1"/>
+      <w:sz w:val="32"/>
+      <w:szCs w:val="36"/>
+    </w:rPr>
+  </w:style>
+  <w:style w:type="character" w:customStyle="1" w:styleId="Heading1Char17">
+    <w:name w:val="Heading 1 Char17"/>
+    <w:basedOn w:val="DefaultParagraphFont"/>
+    <w:uiPriority w:val="9"/>
+    <w:rsid w:val="00CC3CD9"/>
+    <w:rPr>
+      <w:rFonts w:asciiTheme="majorHAnsi" w:eastAsiaTheme="majorEastAsia" w:hAnsiTheme="majorHAnsi" w:cstheme="majorHAnsi"/>
+      <w:bCs/>
+      <w:color w:val="4472C4" w:themeColor="accent1"/>
+      <w:sz w:val="32"/>
+      <w:szCs w:val="36"/>
+    </w:rPr>
+  </w:style>
+  <w:style w:type="character" w:customStyle="1" w:styleId="Heading1Char18">
+    <w:name w:val="Heading 1 Char18"/>
+    <w:basedOn w:val="DefaultParagraphFont"/>
+    <w:uiPriority w:val="9"/>
+    <w:rsid w:val="00CC3CD9"/>
+    <w:rPr>
+      <w:rFonts w:asciiTheme="majorHAnsi" w:eastAsiaTheme="majorEastAsia" w:hAnsiTheme="majorHAnsi" w:cstheme="majorHAnsi"/>
+      <w:bCs/>
+      <w:color w:val="4472C4" w:themeColor="accent1"/>
+      <w:sz w:val="32"/>
+      <w:szCs w:val="36"/>
+    </w:rPr>
+  </w:style>
+  <w:style w:type="character" w:customStyle="1" w:styleId="Heading2Char4">
+    <w:name w:val="Heading 2 Char4"/>
+    <w:basedOn w:val="DefaultParagraphFont"/>
+    <w:uiPriority w:val="9"/>
+    <w:rsid w:val="00CC3CD9"/>
+    <w:rPr>
+      <w:rFonts w:asciiTheme="majorHAnsi" w:eastAsiaTheme="majorEastAsia" w:hAnsiTheme="majorHAnsi" w:cstheme="majorBidi"/>
+      <w:color w:val="2F5496" w:themeColor="accent1" w:themeShade="BF"/>
+      <w:sz w:val="28"/>
+      <w:szCs w:val="26"/>
+    </w:rPr>
+  </w:style>
+  <w:style w:type="character" w:customStyle="1" w:styleId="Heading1Char19">
+    <w:name w:val="Heading 1 Char19"/>
+    <w:basedOn w:val="DefaultParagraphFont"/>
+    <w:uiPriority w:val="9"/>
+    <w:rsid w:val="00CC3CD9"/>
+    <w:rPr>
+      <w:rFonts w:asciiTheme="majorHAnsi" w:eastAsiaTheme="majorEastAsia" w:hAnsiTheme="majorHAnsi" w:cstheme="majorHAnsi"/>
+      <w:bCs/>
+      <w:color w:val="4472C4" w:themeColor="accent1"/>
+      <w:sz w:val="32"/>
+      <w:szCs w:val="36"/>
+    </w:rPr>
+  </w:style>
+  <w:style w:type="character" w:styleId="UnresolvedMention">
+    <w:name w:val="Unresolved Mention"/>
+    <w:basedOn w:val="DefaultParagraphFont"/>
+    <w:uiPriority w:val="99"/>
+    <w:semiHidden/>
+    <w:unhideWhenUsed/>
+    <w:rsid w:val="00C10556"/>
+    <w:rPr>
+      <w:color w:val="605E5C"/>
+      <w:shd w:val="clear" w:color="auto" w:fill="E1DFDD"/>
+    </w:rPr>
+  </w:style>
+  <w:style w:type="character" w:customStyle="1" w:styleId="Heading1Char20">
+    <w:name w:val="Heading 1 Char20"/>
+    <w:basedOn w:val="DefaultParagraphFont"/>
+    <w:uiPriority w:val="9"/>
+    <w:rsid w:val="00286CE8"/>
+    <w:rPr>
+      <w:rFonts w:asciiTheme="majorHAnsi" w:eastAsiaTheme="majorEastAsia" w:hAnsiTheme="majorHAnsi" w:cstheme="majorHAnsi"/>
+      <w:bCs/>
+      <w:color w:val="4472C4" w:themeColor="accent1"/>
+      <w:sz w:val="32"/>
+      <w:szCs w:val="36"/>
+    </w:rPr>
+  </w:style>
+  <w:style w:type="character" w:customStyle="1" w:styleId="Heading1Char21">
+    <w:name w:val="Heading 1 Char21"/>
+    <w:basedOn w:val="DefaultParagraphFont"/>
+    <w:uiPriority w:val="9"/>
+    <w:rsid w:val="00286CE8"/>
+    <w:rPr>
+      <w:rFonts w:asciiTheme="majorHAnsi" w:eastAsiaTheme="majorEastAsia" w:hAnsiTheme="majorHAnsi" w:cstheme="majorHAnsi"/>
+      <w:bCs/>
+      <w:color w:val="4472C4" w:themeColor="accent1"/>
+      <w:sz w:val="32"/>
+      <w:szCs w:val="36"/>
+    </w:rPr>
+  </w:style>
+  <w:style w:type="character" w:customStyle="1" w:styleId="FooterChar2">
+    <w:name w:val="Footer Char2"/>
+    <w:basedOn w:val="DefaultParagraphFont"/>
+    <w:uiPriority w:val="99"/>
+    <w:rsid w:val="00286CE8"/>
+    <w:rPr>
+      <w:rFonts w:eastAsiaTheme="minorEastAsia" w:cstheme="minorHAnsi"/>
+      <w:sz w:val="28"/>
+      <w:szCs w:val="28"/>
+    </w:rPr>
+  </w:style>
+  <w:style w:type="character" w:customStyle="1" w:styleId="Heading1Char22">
+    <w:name w:val="Heading 1 Char22"/>
+    <w:basedOn w:val="DefaultParagraphFont"/>
+    <w:uiPriority w:val="9"/>
+    <w:rsid w:val="00286CE8"/>
+    <w:rPr>
+      <w:rFonts w:asciiTheme="majorHAnsi" w:eastAsiaTheme="majorEastAsia" w:hAnsiTheme="majorHAnsi" w:cstheme="majorHAnsi"/>
+      <w:bCs/>
+      <w:color w:val="4472C4" w:themeColor="accent1"/>
+      <w:sz w:val="32"/>
+      <w:szCs w:val="36"/>
+    </w:rPr>
+  </w:style>
+  <w:style w:type="character" w:customStyle="1" w:styleId="FooterChar3">
+    <w:name w:val="Footer Char3"/>
+    <w:basedOn w:val="DefaultParagraphFont"/>
+    <w:uiPriority w:val="99"/>
+    <w:rsid w:val="00286CE8"/>
+    <w:rPr>
+      <w:rFonts w:eastAsiaTheme="minorEastAsia" w:cstheme="minorHAnsi"/>
+      <w:sz w:val="28"/>
+      <w:szCs w:val="28"/>
+    </w:rPr>
+  </w:style>
+  <w:style w:type="character" w:customStyle="1" w:styleId="Heading1Char23">
+    <w:name w:val="Heading 1 Char23"/>
+    <w:basedOn w:val="DefaultParagraphFont"/>
+    <w:uiPriority w:val="9"/>
+    <w:rsid w:val="00286CE8"/>
+    <w:rPr>
+      <w:rFonts w:asciiTheme="majorHAnsi" w:eastAsiaTheme="majorEastAsia" w:hAnsiTheme="majorHAnsi" w:cstheme="majorHAnsi"/>
+      <w:bCs/>
+      <w:color w:val="4472C4" w:themeColor="accent1"/>
+      <w:sz w:val="32"/>
+      <w:szCs w:val="36"/>
+    </w:rPr>
+  </w:style>
+  <w:style w:type="character" w:customStyle="1" w:styleId="Heading2Char5">
+    <w:name w:val="Heading 2 Char5"/>
+    <w:basedOn w:val="DefaultParagraphFont"/>
+    <w:uiPriority w:val="9"/>
+    <w:rsid w:val="00286CE8"/>
+    <w:rPr>
+      <w:rFonts w:asciiTheme="majorHAnsi" w:eastAsiaTheme="majorEastAsia" w:hAnsiTheme="majorHAnsi" w:cstheme="majorBidi"/>
+      <w:color w:val="2F5496" w:themeColor="accent1" w:themeShade="BF"/>
+      <w:sz w:val="28"/>
+      <w:szCs w:val="26"/>
+    </w:rPr>
+  </w:style>
+  <w:style w:type="character" w:customStyle="1" w:styleId="Heading3Char3">
+    <w:name w:val="Heading 3 Char3"/>
+    <w:basedOn w:val="DefaultParagraphFont"/>
+    <w:uiPriority w:val="9"/>
+    <w:rsid w:val="00286CE8"/>
+    <w:rPr>
+      <w:rFonts w:asciiTheme="majorHAnsi" w:eastAsiaTheme="majorEastAsia" w:hAnsiTheme="majorHAnsi" w:cstheme="majorBidi"/>
+      <w:color w:val="1F3763" w:themeColor="accent1" w:themeShade="7F"/>
+      <w:sz w:val="24"/>
+      <w:szCs w:val="24"/>
+    </w:rPr>
+  </w:style>
+  <w:style w:type="character" w:customStyle="1" w:styleId="FooterChar4">
+    <w:name w:val="Footer Char4"/>
+    <w:basedOn w:val="DefaultParagraphFont"/>
+    <w:uiPriority w:val="99"/>
+    <w:rsid w:val="00286CE8"/>
+    <w:rPr>
+      <w:rFonts w:eastAsiaTheme="minorEastAsia" w:cstheme="minorHAnsi"/>
+      <w:sz w:val="28"/>
+      <w:szCs w:val="28"/>
+    </w:rPr>
+  </w:style>
+  <w:style w:type="character" w:customStyle="1" w:styleId="Heading1Char24">
+    <w:name w:val="Heading 1 Char24"/>
+    <w:basedOn w:val="DefaultParagraphFont"/>
+    <w:uiPriority w:val="9"/>
+    <w:rsid w:val="00286CE8"/>
+    <w:rPr>
+      <w:rFonts w:asciiTheme="majorHAnsi" w:eastAsiaTheme="majorEastAsia" w:hAnsiTheme="majorHAnsi" w:cstheme="majorHAnsi"/>
+      <w:bCs/>
+      <w:color w:val="4472C4" w:themeColor="accent1"/>
+      <w:sz w:val="32"/>
+      <w:szCs w:val="36"/>
+    </w:rPr>
+  </w:style>
+  <w:style w:type="character" w:customStyle="1" w:styleId="FooterChar5">
+    <w:name w:val="Footer Char5"/>
+    <w:basedOn w:val="DefaultParagraphFont"/>
+    <w:uiPriority w:val="99"/>
+    <w:rsid w:val="00286CE8"/>
+    <w:rPr>
+      <w:rFonts w:eastAsiaTheme="minorEastAsia" w:cstheme="minorHAnsi"/>
+      <w:sz w:val="28"/>
+      <w:szCs w:val="28"/>
+    </w:rPr>
+  </w:style>
+  <w:style w:type="character" w:customStyle="1" w:styleId="Heading1Char25">
+    <w:name w:val="Heading 1 Char25"/>
+    <w:basedOn w:val="DefaultParagraphFont"/>
+    <w:uiPriority w:val="9"/>
+    <w:rsid w:val="00286CE8"/>
+    <w:rPr>
+      <w:rFonts w:asciiTheme="majorHAnsi" w:eastAsiaTheme="majorEastAsia" w:hAnsiTheme="majorHAnsi" w:cstheme="majorHAnsi"/>
+      <w:bCs/>
+      <w:color w:val="4472C4" w:themeColor="accent1"/>
+      <w:sz w:val="32"/>
+      <w:szCs w:val="36"/>
+    </w:rPr>
+  </w:style>
+  <w:style w:type="character" w:customStyle="1" w:styleId="Heading1Char26">
+    <w:name w:val="Heading 1 Char26"/>
+    <w:basedOn w:val="DefaultParagraphFont"/>
+    <w:uiPriority w:val="9"/>
+    <w:rsid w:val="00286CE8"/>
+    <w:rPr>
+      <w:rFonts w:asciiTheme="majorHAnsi" w:eastAsiaTheme="majorEastAsia" w:hAnsiTheme="majorHAnsi" w:cstheme="majorHAnsi"/>
+      <w:bCs/>
+      <w:color w:val="4472C4" w:themeColor="accent1"/>
+      <w:sz w:val="32"/>
+      <w:szCs w:val="36"/>
+    </w:rPr>
+  </w:style>
 </w:styles>
 </file>
 
 <file path=word/glossary/document.xml><?xml version="1.0" encoding="utf-8"?>
-<w:glossaryDocument xmlns:wpc="http://schemas.microsoft.com/office/word/2010/wordprocessingCanvas" xmlns:cx="http://schemas.microsoft.com/office/drawing/2014/chartex" xmlns:cx1="http://schemas.microsoft.com/office/drawing/2015/9/8/chartex" xmlns:cx2="http://schemas.microsoft.com/office/drawing/2015/10/21/chartex" xmlns:cx3="http://schemas.microsoft.com/office/drawing/2016/5/9/chartex" xmlns:cx4="http://schemas.microsoft.com/office/drawing/2016/5/10/chartex" xmlns:cx5="http://schemas.microsoft.com/office/drawing/2016/5/11/chartex" xmlns:cx6="http://schemas.microsoft.com/office/drawing/2016/5/12/chartex" xmlns:cx7="http://schemas.microsoft.com/office/drawing/2016/5/13/chartex" xmlns:cx8="http://schemas.microsoft.com/office/drawing/2016/5/14/chartex" xmlns:mc="http://schemas.openxmlformats.org/markup-compatibility/2006" xmlns:aink="http://schemas.microsoft.com/office/drawing/2016/ink" xmlns:am3d="http://schemas.microsoft.com/office/drawing/2017/model3d" xmlns:o="urn:schemas-microsoft-com:office:office" xmlns:oel="http://schemas.microsoft.com/office/2019/extlst" xmlns:r="http://schemas.openxmlformats.org/officeDocument/2006/relationships" xmlns:m="http://schemas.openxmlformats.org/officeDocument/2006/math" xmlns:v="urn:schemas-microsoft-com:vml" xmlns:wp14="http://schemas.microsoft.com/office/word/2010/wordprocessingDrawing" xmlns:wp="http://schemas.openxmlformats.org/drawingml/2006/wordprocessingDrawing" xmlns:w10="urn:schemas-microsoft-com:office:word" xmlns:w="http://schemas.openxmlformats.org/wordprocessingml/2006/main" xmlns:w14="http://schemas.microsoft.com/office/word/2010/wordml" xmlns:w15="http://schemas.microsoft.com/office/word/2012/wordml" xmlns:w16cex="http://schemas.microsoft.com/office/word/2018/wordml/cex" xmlns:w16cid="http://schemas.microsoft.com/office/word/2016/wordml/cid" xmlns:w16="http://schemas.microsoft.com/office/word/2018/wordml" xmlns:w16du="http://schemas.microsoft.com/office/word/2023/wordml/word16du" xmlns:w16sdtdh="http://schemas.microsoft.com/office/word/2020/wordml/sdtdatahash" xmlns:w16se="http://schemas.microsoft.com/office/word/2015/wordml/symex" xmlns:wpg="http://schemas.microsoft.com/office/word/2010/wordprocessingGroup" xmlns:wpi="http://schemas.microsoft.com/office/word/2010/wordprocessingInk" xmlns:wne="http://schemas.microsoft.com/office/word/2006/wordml" xmlns:wps="http://schemas.microsoft.com/office/word/2010/wordprocessingShape" mc:Ignorable="w14 w15 w16se w16cid w16 w16cex w16sdtdh wp14">
+<w:glossaryDocument xmlns:wpc="http://schemas.microsoft.com/office/word/2010/wordprocessingCanvas" xmlns:cx="http://schemas.microsoft.com/office/drawing/2014/chartex" xmlns:cx1="http://schemas.microsoft.com/office/drawing/2015/9/8/chartex" xmlns:cx2="http://schemas.microsoft.com/office/drawing/2015/10/21/chartex" xmlns:cx3="http://schemas.microsoft.com/office/drawing/2016/5/9/chartex" xmlns:cx4="http://schemas.microsoft.com/office/drawing/2016/5/10/chartex" xmlns:cx5="http://schemas.microsoft.com/office/drawing/2016/5/11/chartex" xmlns:cx6="http://schemas.microsoft.com/office/drawing/2016/5/12/chartex" xmlns:cx7="http://schemas.microsoft.com/office/drawing/2016/5/13/chartex" xmlns:cx8="http://schemas.microsoft.com/office/drawing/2016/5/14/chartex" xmlns:mc="http://schemas.openxmlformats.org/markup-compatibility/2006" xmlns:aink="http://schemas.microsoft.com/office/drawing/2016/ink" xmlns:am3d="http://schemas.microsoft.com/office/drawing/2017/model3d" xmlns:o="urn:schemas-microsoft-com:office:office" xmlns:oel="http://schemas.microsoft.com/office/2019/extlst" xmlns:r="http://schemas.openxmlformats.org/officeDocument/2006/relationships" xmlns:m="http://schemas.openxmlformats.org/officeDocument/2006/math" xmlns:v="urn:schemas-microsoft-com:vml" xmlns:wp14="http://schemas.microsoft.com/office/word/2010/wordprocessingDrawing" xmlns:wp="http://schemas.openxmlformats.org/drawingml/2006/wordprocessingDrawing" xmlns:w10="urn:schemas-microsoft-com:office:word" xmlns:w="http://schemas.openxmlformats.org/wordprocessingml/2006/main" xmlns:w14="http://schemas.microsoft.com/office/word/2010/wordml" xmlns:w15="http://schemas.microsoft.com/office/word/2012/wordml" xmlns:w16cex="http://schemas.microsoft.com/office/word/2018/wordml/cex" xmlns:w16cid="http://schemas.microsoft.com/office/word/2016/wordml/cid" xmlns:w16="http://schemas.microsoft.com/office/word/2018/wordml" xmlns:w16du="http://schemas.microsoft.com/office/word/2023/wordml/word16du" xmlns:w16sdtdh="http://schemas.microsoft.com/office/word/2020/wordml/sdtdatahash" xmlns:w16sdtfl="http://schemas.microsoft.com/office/word/2024/wordml/sdtformatlock" xmlns:w16se="http://schemas.microsoft.com/office/word/2015/wordml/symex" xmlns:wpg="http://schemas.microsoft.com/office/word/2010/wordprocessingGroup" xmlns:wpi="http://schemas.microsoft.com/office/word/2010/wordprocessingInk" xmlns:wne="http://schemas.microsoft.com/office/word/2006/wordml" xmlns:wps="http://schemas.microsoft.com/office/word/2010/wordprocessingShape" mc:Ignorable="w14 w15 w16se w16cid w16 w16cex w16sdtdh w16sdtfl w16du wp14">
   <w:docParts>
     <w:docPart>
       <w:docPartPr>
-        <w:name w:val="11E26F5BAAD1418F807CCDE0D3B8ADD8"/>
+        <w:name w:val="89AF5FD46BF64C8D914123953E4BB700"/>
         <w:category>
           <w:name w:val="General"/>
           <w:gallery w:val="placeholder"/>
@@ -1831,12 +4550,12 @@
         <w:behaviors>
           <w:behavior w:val="content"/>
         </w:behaviors>
-        <w:guid w:val="{CA06588D-B5FB-4C34-B6DE-7F23686AAC73}"/>
+        <w:guid w:val="{D0AB74F2-088B-412A-A683-9ECA9E851988}"/>
       </w:docPartPr>
       <w:docPartBody>
         <w:p>
           <w:pPr>
-            <w:pStyle w:val="11E26F5BAAD1418F807CCDE0D3B8ADD8"/>
+            <w:pStyle w:val="89AF5FD46BF64C8D914123953E4BB700"/>
           </w:pPr>
           <w:r>
             <w:rPr>
@@ -1849,7 +4568,7 @@
     </w:docPart>
     <w:docPart>
       <w:docPartPr>
-        <w:name w:val="EE86D90381DA4D9182859C0A20A0C8D9"/>
+        <w:name w:val="FFE657FF632C4FBDA5E005F14AF54A89"/>
         <w:category>
           <w:name w:val="General"/>
           <w:gallery w:val="placeholder"/>
@@ -1860,12 +4579,12 @@
         <w:behaviors>
           <w:behavior w:val="content"/>
         </w:behaviors>
-        <w:guid w:val="{1C02040A-FF55-4F73-AC6B-1FF0C10D68F9}"/>
+        <w:guid w:val="{AF3060F3-4A1C-4F56-9745-D23096C93490}"/>
       </w:docPartPr>
       <w:docPartBody>
         <w:p>
           <w:pPr>
-            <w:pStyle w:val="EE86D90381DA4D9182859C0A20A0C8D9"/>
+            <w:pStyle w:val="FFE657FF632C4FBDA5E005F14AF54A89"/>
           </w:pPr>
           <w:r>
             <w:rPr>
@@ -1881,7 +4600,35 @@
 </file>
 
 <file path=word/glossary/fontTable.xml><?xml version="1.0" encoding="utf-8"?>
-<w:fonts xmlns:mc="http://schemas.openxmlformats.org/markup-compatibility/2006" xmlns:r="http://schemas.openxmlformats.org/officeDocument/2006/relationships" xmlns:w="http://schemas.openxmlformats.org/wordprocessingml/2006/main" xmlns:w14="http://schemas.microsoft.com/office/word/2010/wordml" xmlns:w15="http://schemas.microsoft.com/office/word/2012/wordml" xmlns:w16cex="http://schemas.microsoft.com/office/word/2018/wordml/cex" xmlns:w16cid="http://schemas.microsoft.com/office/word/2016/wordml/cid" xmlns:w16="http://schemas.microsoft.com/office/word/2018/wordml" xmlns:w16sdtdh="http://schemas.microsoft.com/office/word/2020/wordml/sdtdatahash" xmlns:w16se="http://schemas.microsoft.com/office/word/2015/wordml/symex" mc:Ignorable="w14 w15 w16se w16cid w16 w16cex w16sdtdh">
+<w:fonts xmlns:mc="http://schemas.openxmlformats.org/markup-compatibility/2006" xmlns:r="http://schemas.openxmlformats.org/officeDocument/2006/relationships" xmlns:w="http://schemas.openxmlformats.org/wordprocessingml/2006/main" xmlns:w14="http://schemas.microsoft.com/office/word/2010/wordml" xmlns:w15="http://schemas.microsoft.com/office/word/2012/wordml" xmlns:w16cex="http://schemas.microsoft.com/office/word/2018/wordml/cex" xmlns:w16cid="http://schemas.microsoft.com/office/word/2016/wordml/cid" xmlns:w16="http://schemas.microsoft.com/office/word/2018/wordml" xmlns:w16du="http://schemas.microsoft.com/office/word/2023/wordml/word16du" xmlns:w16sdtdh="http://schemas.microsoft.com/office/word/2020/wordml/sdtdatahash" xmlns:w16sdtfl="http://schemas.microsoft.com/office/word/2024/wordml/sdtformatlock" xmlns:w16se="http://schemas.microsoft.com/office/word/2015/wordml/symex" mc:Ignorable="w14 w15 w16se w16cid w16 w16cex w16sdtdh w16sdtfl w16du">
+  <w:font w:name="Symbol">
+    <w:panose1 w:val="05050102010706020507"/>
+    <w:charset w:val="02"/>
+    <w:family w:val="roman"/>
+    <w:pitch w:val="variable"/>
+    <w:sig w:usb0="00000000" w:usb1="10000000" w:usb2="00000000" w:usb3="00000000" w:csb0="80000000" w:csb1="00000000"/>
+  </w:font>
+  <w:font w:name="Times New Roman">
+    <w:panose1 w:val="02020603050405020304"/>
+    <w:charset w:val="00"/>
+    <w:family w:val="roman"/>
+    <w:pitch w:val="variable"/>
+    <w:sig w:usb0="E0002EFF" w:usb1="C000785B" w:usb2="00000009" w:usb3="00000000" w:csb0="000001FF" w:csb1="00000000"/>
+  </w:font>
+  <w:font w:name="Courier New">
+    <w:panose1 w:val="02070309020205020404"/>
+    <w:charset w:val="00"/>
+    <w:family w:val="modern"/>
+    <w:pitch w:val="fixed"/>
+    <w:sig w:usb0="E0002EFF" w:usb1="C0007843" w:usb2="00000009" w:usb3="00000000" w:csb0="000001FF" w:csb1="00000000"/>
+  </w:font>
+  <w:font w:name="Wingdings">
+    <w:panose1 w:val="05000000000000000000"/>
+    <w:charset w:val="02"/>
+    <w:family w:val="auto"/>
+    <w:pitch w:val="variable"/>
+    <w:sig w:usb0="00000000" w:usb1="10000000" w:usb2="00000000" w:usb3="00000000" w:csb0="80000000" w:csb1="00000000"/>
+  </w:font>
   <w:font w:name="Calibri">
     <w:panose1 w:val="020F0502020204030204"/>
     <w:charset w:val="00"/>
@@ -1896,13 +4643,6 @@
     <w:pitch w:val="variable"/>
     <w:sig w:usb0="E0002EFF" w:usb1="C000785B" w:usb2="00000009" w:usb3="00000000" w:csb0="000001FF" w:csb1="00000000"/>
   </w:font>
-  <w:font w:name="Times New Roman">
-    <w:panose1 w:val="02020603050405020304"/>
-    <w:charset w:val="00"/>
-    <w:family w:val="roman"/>
-    <w:pitch w:val="variable"/>
-    <w:sig w:usb0="E0002EFF" w:usb1="C000785B" w:usb2="00000009" w:usb3="00000000" w:csb0="000001FF" w:csb1="00000000"/>
-  </w:font>
   <w:font w:name="Calibri Light">
     <w:panose1 w:val="020F0302020204030204"/>
     <w:charset w:val="00"/>
@@ -1910,11 +4650,23 @@
     <w:pitch w:val="variable"/>
     <w:sig w:usb0="E4002EFF" w:usb1="C000247B" w:usb2="00000009" w:usb3="00000000" w:csb0="000001FF" w:csb1="00000000"/>
   </w:font>
+  <w:font w:name="Aptos">
+    <w:charset w:val="00"/>
+    <w:family w:val="swiss"/>
+    <w:pitch w:val="variable"/>
+    <w:sig w:usb0="20000287" w:usb1="00000003" w:usb2="00000000" w:usb3="00000000" w:csb0="0000019F" w:csb1="00000000"/>
+  </w:font>
+  <w:font w:name="Aptos Display">
+    <w:charset w:val="00"/>
+    <w:family w:val="swiss"/>
+    <w:pitch w:val="variable"/>
+    <w:sig w:usb0="20000287" w:usb1="00000003" w:usb2="00000000" w:usb3="00000000" w:csb0="0000019F" w:csb1="00000000"/>
+  </w:font>
 </w:fonts>
 </file>
 
 <file path=word/glossary/settings.xml><?xml version="1.0" encoding="utf-8"?>
-<w:settings xmlns:mc="http://schemas.openxmlformats.org/markup-compatibility/2006" xmlns:o="urn:schemas-microsoft-com:office:office" xmlns:r="http://schemas.openxmlformats.org/officeDocument/2006/relationships" xmlns:m="http://schemas.openxmlformats.org/officeDocument/2006/math" xmlns:v="urn:schemas-microsoft-com:vml" xmlns:w10="urn:schemas-microsoft-com:office:word" xmlns:w="http://schemas.openxmlformats.org/wordprocessingml/2006/main" xmlns:w14="http://schemas.microsoft.com/office/word/2010/wordml" xmlns:w15="http://schemas.microsoft.com/office/word/2012/wordml" xmlns:w16cex="http://schemas.microsoft.com/office/word/2018/wordml/cex" xmlns:w16cid="http://schemas.microsoft.com/office/word/2016/wordml/cid" xmlns:w16="http://schemas.microsoft.com/office/word/2018/wordml" xmlns:w16sdtdh="http://schemas.microsoft.com/office/word/2020/wordml/sdtdatahash" xmlns:w16se="http://schemas.microsoft.com/office/word/2015/wordml/symex" xmlns:sl="http://schemas.openxmlformats.org/schemaLibrary/2006/main" mc:Ignorable="w14 w15 w16se w16cid w16 w16cex w16sdtdh">
+<w:settings xmlns:mc="http://schemas.openxmlformats.org/markup-compatibility/2006" xmlns:o="urn:schemas-microsoft-com:office:office" xmlns:r="http://schemas.openxmlformats.org/officeDocument/2006/relationships" xmlns:m="http://schemas.openxmlformats.org/officeDocument/2006/math" xmlns:v="urn:schemas-microsoft-com:vml" xmlns:w10="urn:schemas-microsoft-com:office:word" xmlns:w="http://schemas.openxmlformats.org/wordprocessingml/2006/main" xmlns:w14="http://schemas.microsoft.com/office/word/2010/wordml" xmlns:w15="http://schemas.microsoft.com/office/word/2012/wordml" xmlns:w16cex="http://schemas.microsoft.com/office/word/2018/wordml/cex" xmlns:w16cid="http://schemas.microsoft.com/office/word/2016/wordml/cid" xmlns:w16="http://schemas.microsoft.com/office/word/2018/wordml" xmlns:w16du="http://schemas.microsoft.com/office/word/2023/wordml/word16du" xmlns:w16sdtdh="http://schemas.microsoft.com/office/word/2020/wordml/sdtdatahash" xmlns:w16sdtfl="http://schemas.microsoft.com/office/word/2024/wordml/sdtformatlock" xmlns:w16se="http://schemas.microsoft.com/office/word/2015/wordml/symex" xmlns:sl="http://schemas.openxmlformats.org/schemaLibrary/2006/main" mc:Ignorable="w14 w15 w16se w16cid w16 w16cex w16sdtdh w16sdtfl w16du">
   <w:view w:val="normal"/>
   <w:defaultTabStop w:val="720"/>
   <w:characterSpacingControl w:val="doNotCompress"/>
@@ -1929,7 +4681,15 @@
   </w:compat>
   <w:rsids>
     <w:rsidRoot w:val="00F54C0F"/>
+    <w:rsid w:val="002524FD"/>
+    <w:rsid w:val="004647FD"/>
+    <w:rsid w:val="004C3C00"/>
+    <w:rsid w:val="005E49E2"/>
     <w:rsid w:val="007540F5"/>
+    <w:rsid w:val="00763075"/>
+    <w:rsid w:val="0090454B"/>
+    <w:rsid w:val="00955432"/>
+    <w:rsid w:val="00AB549C"/>
     <w:rsid w:val="00B57586"/>
     <w:rsid w:val="00DC2688"/>
     <w:rsid w:val="00F54C0F"/>
@@ -1956,7 +4716,7 @@
 </file>
 
 <file path=word/glossary/styles.xml><?xml version="1.0" encoding="utf-8"?>
-<w:styles xmlns:mc="http://schemas.openxmlformats.org/markup-compatibility/2006" xmlns:r="http://schemas.openxmlformats.org/officeDocument/2006/relationships" xmlns:w="http://schemas.openxmlformats.org/wordprocessingml/2006/main" xmlns:w14="http://schemas.microsoft.com/office/word/2010/wordml" xmlns:w15="http://schemas.microsoft.com/office/word/2012/wordml" xmlns:w16cex="http://schemas.microsoft.com/office/word/2018/wordml/cex" xmlns:w16cid="http://schemas.microsoft.com/office/word/2016/wordml/cid" xmlns:w16="http://schemas.microsoft.com/office/word/2018/wordml" xmlns:w16sdtdh="http://schemas.microsoft.com/office/word/2020/wordml/sdtdatahash" xmlns:w16se="http://schemas.microsoft.com/office/word/2015/wordml/symex" mc:Ignorable="w14 w15 w16se w16cid w16 w16cex w16sdtdh">
+<w:styles xmlns:mc="http://schemas.openxmlformats.org/markup-compatibility/2006" xmlns:r="http://schemas.openxmlformats.org/officeDocument/2006/relationships" xmlns:w="http://schemas.openxmlformats.org/wordprocessingml/2006/main" xmlns:w14="http://schemas.microsoft.com/office/word/2010/wordml" xmlns:w15="http://schemas.microsoft.com/office/word/2012/wordml" xmlns:w16cex="http://schemas.microsoft.com/office/word/2018/wordml/cex" xmlns:w16cid="http://schemas.microsoft.com/office/word/2016/wordml/cid" xmlns:w16="http://schemas.microsoft.com/office/word/2018/wordml" xmlns:w16du="http://schemas.microsoft.com/office/word/2023/wordml/word16du" xmlns:w16sdtdh="http://schemas.microsoft.com/office/word/2020/wordml/sdtdatahash" xmlns:w16sdtfl="http://schemas.microsoft.com/office/word/2024/wordml/sdtformatlock" xmlns:w16se="http://schemas.microsoft.com/office/word/2015/wordml/symex" mc:Ignorable="w14 w15 w16se w16cid w16 w16cex w16sdtdh w16sdtfl w16du">
   <w:docDefaults>
     <w:rPrDefault>
       <w:rPr>
@@ -2390,17 +5150,59 @@
       <w:color w:val="808080"/>
     </w:rPr>
   </w:style>
-  <w:style w:type="paragraph" w:customStyle="1" w:styleId="11E26F5BAAD1418F807CCDE0D3B8ADD8">
-    <w:name w:val="11E26F5BAAD1418F807CCDE0D3B8ADD8"/>
-  </w:style>
-  <w:style w:type="paragraph" w:customStyle="1" w:styleId="EE86D90381DA4D9182859C0A20A0C8D9">
-    <w:name w:val="EE86D90381DA4D9182859C0A20A0C8D9"/>
+  <w:style w:type="paragraph" w:customStyle="1" w:styleId="89AF5FD46BF64C8D914123953E4BB700">
+    <w:name w:val="89AF5FD46BF64C8D914123953E4BB700"/>
+    <w:pPr>
+      <w:spacing w:line="278" w:lineRule="auto"/>
+    </w:pPr>
+    <w:rPr>
+      <w:kern w:val="2"/>
+      <w:sz w:val="24"/>
+      <w:szCs w:val="24"/>
+      <w14:ligatures w14:val="standardContextual"/>
+    </w:rPr>
+  </w:style>
+  <w:style w:type="paragraph" w:customStyle="1" w:styleId="FFE657FF632C4FBDA5E005F14AF54A89">
+    <w:name w:val="FFE657FF632C4FBDA5E005F14AF54A89"/>
+    <w:pPr>
+      <w:spacing w:line="278" w:lineRule="auto"/>
+    </w:pPr>
+    <w:rPr>
+      <w:kern w:val="2"/>
+      <w:sz w:val="24"/>
+      <w:szCs w:val="24"/>
+      <w14:ligatures w14:val="standardContextual"/>
+    </w:rPr>
+  </w:style>
+  <w:style w:type="paragraph" w:customStyle="1" w:styleId="B4D945E3C6794AA78FC0DD47D572F754">
+    <w:name w:val="B4D945E3C6794AA78FC0DD47D572F754"/>
+    <w:pPr>
+      <w:spacing w:line="278" w:lineRule="auto"/>
+    </w:pPr>
+    <w:rPr>
+      <w:kern w:val="2"/>
+      <w:sz w:val="24"/>
+      <w:szCs w:val="24"/>
+      <w14:ligatures w14:val="standardContextual"/>
+    </w:rPr>
+  </w:style>
+  <w:style w:type="paragraph" w:customStyle="1" w:styleId="F866BA60159248659EFF91E86ECB0B50">
+    <w:name w:val="F866BA60159248659EFF91E86ECB0B50"/>
+    <w:pPr>
+      <w:spacing w:line="278" w:lineRule="auto"/>
+    </w:pPr>
+    <w:rPr>
+      <w:kern w:val="2"/>
+      <w:sz w:val="24"/>
+      <w:szCs w:val="24"/>
+      <w14:ligatures w14:val="standardContextual"/>
+    </w:rPr>
   </w:style>
 </w:styles>
 </file>
 
 <file path=word/glossary/webSettings.xml><?xml version="1.0" encoding="utf-8"?>
-<w:webSettings xmlns:mc="http://schemas.openxmlformats.org/markup-compatibility/2006" xmlns:r="http://schemas.openxmlformats.org/officeDocument/2006/relationships" xmlns:w="http://schemas.openxmlformats.org/wordprocessingml/2006/main" xmlns:w14="http://schemas.microsoft.com/office/word/2010/wordml" xmlns:w15="http://schemas.microsoft.com/office/word/2012/wordml" xmlns:w16cex="http://schemas.microsoft.com/office/word/2018/wordml/cex" xmlns:w16cid="http://schemas.microsoft.com/office/word/2016/wordml/cid" xmlns:w16="http://schemas.microsoft.com/office/word/2018/wordml" xmlns:w16sdtdh="http://schemas.microsoft.com/office/word/2020/wordml/sdtdatahash" xmlns:w16se="http://schemas.microsoft.com/office/word/2015/wordml/symex" mc:Ignorable="w14 w15 w16se w16cid w16 w16cex w16sdtdh">
+<w:webSettings xmlns:mc="http://schemas.openxmlformats.org/markup-compatibility/2006" xmlns:r="http://schemas.openxmlformats.org/officeDocument/2006/relationships" xmlns:w="http://schemas.openxmlformats.org/wordprocessingml/2006/main" xmlns:w14="http://schemas.microsoft.com/office/word/2010/wordml" xmlns:w15="http://schemas.microsoft.com/office/word/2012/wordml" xmlns:w16cex="http://schemas.microsoft.com/office/word/2018/wordml/cex" xmlns:w16cid="http://schemas.microsoft.com/office/word/2016/wordml/cid" xmlns:w16="http://schemas.microsoft.com/office/word/2018/wordml" xmlns:w16du="http://schemas.microsoft.com/office/word/2023/wordml/word16du" xmlns:w16sdtdh="http://schemas.microsoft.com/office/word/2020/wordml/sdtdatahash" xmlns:w16sdtfl="http://schemas.microsoft.com/office/word/2024/wordml/sdtformatlock" xmlns:w16se="http://schemas.microsoft.com/office/word/2015/wordml/symex" mc:Ignorable="w14 w15 w16se w16cid w16 w16cex w16sdtdh w16sdtfl w16du">
   <w:optimizeForBrowser/>
   <w:allowPNG/>
 </w:webSettings>

</xml_diff>